<commit_message>
Früchte 3 pro Juice
</commit_message>
<xml_diff>
--- a/wild-jam-april-2026/__ORGA/Changelog.docx
+++ b/wild-jam-april-2026/__ORGA/Changelog.docx
@@ -549,7 +549,17 @@
                 <w:tcW w:w="1555" w:type="dxa"/>
               </w:tcPr>
               <w:p>
+                <w:pPr>
+                  <w:rPr>
+                    <w:b/>
+                    <w:bCs/>
+                  </w:rPr>
+                </w:pPr>
                 <w:r>
+                  <w:rPr>
+                    <w:b/>
+                    <w:bCs/>
+                  </w:rPr>
                   <w:lastRenderedPageBreak/>
                   <w:t>Datum</w:t>
                 </w:r>
@@ -560,7 +570,17 @@
                 <w:tcW w:w="2975" w:type="dxa"/>
               </w:tcPr>
               <w:p>
+                <w:pPr>
+                  <w:rPr>
+                    <w:b/>
+                    <w:bCs/>
+                  </w:rPr>
+                </w:pPr>
                 <w:r>
+                  <w:rPr>
+                    <w:b/>
+                    <w:bCs/>
+                  </w:rPr>
                   <w:t>Design-Änderung</w:t>
                 </w:r>
               </w:p>
@@ -570,7 +590,17 @@
                 <w:tcW w:w="2553" w:type="dxa"/>
               </w:tcPr>
               <w:p>
+                <w:pPr>
+                  <w:rPr>
+                    <w:b/>
+                    <w:bCs/>
+                  </w:rPr>
+                </w:pPr>
                 <w:r>
+                  <w:rPr>
+                    <w:b/>
+                    <w:bCs/>
+                  </w:rPr>
                   <w:t>Grund für Änderung</w:t>
                 </w:r>
               </w:p>
@@ -580,7 +610,17 @@
                 <w:tcW w:w="1979" w:type="dxa"/>
               </w:tcPr>
               <w:p>
+                <w:pPr>
+                  <w:rPr>
+                    <w:b/>
+                    <w:bCs/>
+                  </w:rPr>
+                </w:pPr>
                 <w:r>
+                  <w:rPr>
+                    <w:b/>
+                    <w:bCs/>
+                  </w:rPr>
                   <w:t>Mitglied</w:t>
                 </w:r>
               </w:p>
@@ -675,25 +715,41 @@
               <w:tcPr>
                 <w:tcW w:w="1555" w:type="dxa"/>
               </w:tcPr>
-              <w:p/>
+              <w:p>
+                <w:r>
+                  <w:t>22.04.2026</w:t>
+                </w:r>
+              </w:p>
             </w:tc>
             <w:tc>
               <w:tcPr>
                 <w:tcW w:w="2975" w:type="dxa"/>
               </w:tcPr>
-              <w:p/>
+              <w:p>
+                <w:r>
+                  <w:t>Anzahl benötigte Früchte für Saft-Produktion auf 3 erhöht</w:t>
+                </w:r>
+              </w:p>
             </w:tc>
             <w:tc>
               <w:tcPr>
                 <w:tcW w:w="2553" w:type="dxa"/>
               </w:tcPr>
-              <w:p/>
+              <w:p>
+                <w:r>
+                  <w:t>Komplexität. Zusätzlich bietet es Grundlage für Erweiterung durch Fruchtvariationen</w:t>
+                </w:r>
+              </w:p>
             </w:tc>
             <w:tc>
               <w:tcPr>
                 <w:tcW w:w="1979" w:type="dxa"/>
               </w:tcPr>
-              <w:p/>
+              <w:p>
+                <w:r>
+                  <w:t>Vincent Knapp</w:t>
+                </w:r>
+              </w:p>
             </w:tc>
           </w:tr>
           <w:tr>
@@ -1830,10 +1886,12 @@
     <w:rsid w:val="00047698"/>
     <w:rsid w:val="001000CF"/>
     <w:rsid w:val="0021409C"/>
+    <w:rsid w:val="002956F5"/>
     <w:rsid w:val="004165E4"/>
     <w:rsid w:val="004D18B1"/>
     <w:rsid w:val="00594724"/>
     <w:rsid w:val="007E4A22"/>
+    <w:rsid w:val="00E24E1B"/>
     <w:rsid w:val="00ED73F4"/>
   </w:rsids>
   <m:mathPr>

</xml_diff>

<commit_message>
Audio FX zu geräten hinzugefügt
</commit_message>
<xml_diff>
--- a/wild-jam-april-2026/__ORGA/Changelog.docx
+++ b/wild-jam-april-2026/__ORGA/Changelog.docx
@@ -13,7 +13,7 @@
       <w:sdtContent>
         <w:p>
           <w:pPr>
-            <w:pStyle w:val="NoSpacing"/>
+            <w:pStyle w:val="KeinLeerraum"/>
             <w:spacing w:before="1540" w:after="240"/>
             <w:jc w:val="center"/>
             <w:rPr>
@@ -23,7 +23,7 @@
         </w:p>
         <w:p>
           <w:pPr>
-            <w:pStyle w:val="NoSpacing"/>
+            <w:pStyle w:val="KeinLeerraum"/>
             <w:pBdr>
               <w:top w:val="single" w:sz="6" w:space="6" w:color="156082" w:themeColor="accent1"/>
               <w:bottom w:val="single" w:sz="6" w:space="6" w:color="156082" w:themeColor="accent1"/>
@@ -66,7 +66,7 @@
     </w:sdt>
     <w:p>
       <w:pPr>
-        <w:pStyle w:val="NoSpacing"/>
+        <w:pStyle w:val="KeinLeerraum"/>
         <w:jc w:val="center"/>
         <w:rPr>
           <w:color w:val="156082" w:themeColor="accent1"/>
@@ -98,7 +98,7 @@
     </w:p>
     <w:p>
       <w:pPr>
-        <w:pStyle w:val="NoSpacing"/>
+        <w:pStyle w:val="KeinLeerraum"/>
         <w:spacing w:before="480"/>
         <w:jc w:val="center"/>
         <w:rPr>
@@ -125,7 +125,7 @@
     </w:p>
     <w:p>
       <w:pPr>
-        <w:pStyle w:val="NoSpacing"/>
+        <w:pStyle w:val="KeinLeerraum"/>
         <w:spacing w:before="480"/>
         <w:jc w:val="center"/>
         <w:rPr>
@@ -135,7 +135,7 @@
     </w:p>
     <w:p>
       <w:pPr>
-        <w:pStyle w:val="NoSpacing"/>
+        <w:pStyle w:val="KeinLeerraum"/>
         <w:spacing w:before="480"/>
         <w:jc w:val="center"/>
         <w:rPr>
@@ -165,7 +165,7 @@
     </w:p>
     <w:p>
       <w:pPr>
-        <w:pStyle w:val="NoSpacing"/>
+        <w:pStyle w:val="KeinLeerraum"/>
         <w:spacing w:before="480"/>
         <w:jc w:val="center"/>
         <w:rPr>
@@ -188,7 +188,7 @@
               <w:txbxContent>
                 <w:p>
                   <w:pPr>
-                    <w:pStyle w:val="NoSpacing"/>
+                    <w:pStyle w:val="KeinLeerraum"/>
                     <w:spacing w:after="40"/>
                     <w:jc w:val="center"/>
                     <w:rPr>
@@ -220,7 +220,7 @@
                 </w:p>
                 <w:p>
                   <w:pPr>
-                    <w:pStyle w:val="NoSpacing"/>
+                    <w:pStyle w:val="KeinLeerraum"/>
                     <w:jc w:val="center"/>
                     <w:rPr>
                       <w:color w:val="156082" w:themeColor="accent1"/>
@@ -247,7 +247,7 @@
                 </w:p>
                 <w:p>
                   <w:pPr>
-                    <w:pStyle w:val="NoSpacing"/>
+                    <w:pStyle w:val="KeinLeerraum"/>
                     <w:jc w:val="center"/>
                     <w:rPr>
                       <w:color w:val="156082" w:themeColor="accent1"/>
@@ -280,7 +280,7 @@
     </w:p>
     <w:tbl>
       <w:tblPr>
-        <w:tblStyle w:val="TableGrid"/>
+        <w:tblStyle w:val="Tabellenraster"/>
         <w:tblW w:w="9062" w:type="dxa"/>
         <w:tblLayout w:type="fixed"/>
         <w:tblLook w:val="04A0" w:firstRow="1" w:lastRow="0" w:firstColumn="1" w:lastColumn="0" w:noHBand="0" w:noVBand="1"/>
@@ -1144,6 +1144,7 @@
               <w:spacing w:after="0" w:line="240" w:lineRule="auto"/>
               <w:rPr>
                 <w:rFonts w:eastAsia="Aptos"/>
+                <w:lang w:val="en-US"/>
               </w:rPr>
             </w:pPr>
             <w:r>
@@ -1264,6 +1265,12 @@
                 <w:rFonts w:eastAsia="Aptos"/>
               </w:rPr>
             </w:pPr>
+            <w:r>
+              <w:rPr>
+                <w:rFonts w:eastAsia="Aptos"/>
+              </w:rPr>
+              <w:t>09.05.2026</w:t>
+            </w:r>
           </w:p>
         </w:tc>
         <w:tc>
@@ -1277,6 +1284,12 @@
                 <w:rFonts w:eastAsia="Aptos"/>
               </w:rPr>
             </w:pPr>
+            <w:r>
+              <w:rPr>
+                <w:rFonts w:eastAsia="Aptos"/>
+              </w:rPr>
+              <w:t>Audio FX für Geräte hinzugefügt</w:t>
+            </w:r>
           </w:p>
         </w:tc>
         <w:tc>
@@ -1290,6 +1303,12 @@
                 <w:rFonts w:eastAsia="Aptos"/>
               </w:rPr>
             </w:pPr>
+            <w:r>
+              <w:rPr>
+                <w:rFonts w:eastAsia="Aptos"/>
+              </w:rPr>
+              <w:t>Mehr Nähe für den Spieler</w:t>
+            </w:r>
           </w:p>
         </w:tc>
         <w:tc>
@@ -1303,6 +1322,12 @@
                 <w:rFonts w:eastAsia="Aptos"/>
               </w:rPr>
             </w:pPr>
+            <w:r>
+              <w:rPr>
+                <w:rFonts w:eastAsia="Aptos"/>
+              </w:rPr>
+              <w:t>Vincent Knapp</w:t>
+            </w:r>
           </w:p>
         </w:tc>
       </w:tr>
@@ -1722,18 +1747,18 @@
     <w:lsdException w:name="Unresolved Mention" w:semiHidden="1" w:unhideWhenUsed="1"/>
     <w:lsdException w:name="Smart Link" w:semiHidden="1" w:unhideWhenUsed="1"/>
   </w:latentStyles>
-  <w:style w:type="paragraph" w:default="1" w:styleId="Normal">
+  <w:style w:type="paragraph" w:default="1" w:styleId="Standard">
     <w:name w:val="Normal"/>
     <w:qFormat/>
     <w:pPr>
       <w:spacing w:after="160" w:line="278" w:lineRule="auto"/>
     </w:pPr>
   </w:style>
-  <w:style w:type="paragraph" w:styleId="Heading1">
+  <w:style w:type="paragraph" w:styleId="berschrift1">
     <w:name w:val="heading 1"/>
-    <w:basedOn w:val="Normal"/>
-    <w:next w:val="Normal"/>
-    <w:link w:val="Heading1Char"/>
+    <w:basedOn w:val="Standard"/>
+    <w:next w:val="Standard"/>
+    <w:link w:val="berschrift1Zchn"/>
     <w:uiPriority w:val="9"/>
     <w:qFormat/>
     <w:rsid w:val="002026CA"/>
@@ -1750,11 +1775,11 @@
       <w:szCs w:val="40"/>
     </w:rPr>
   </w:style>
-  <w:style w:type="paragraph" w:styleId="Heading2">
+  <w:style w:type="paragraph" w:styleId="berschrift2">
     <w:name w:val="heading 2"/>
-    <w:basedOn w:val="Normal"/>
-    <w:next w:val="Normal"/>
-    <w:link w:val="Heading2Char"/>
+    <w:basedOn w:val="Standard"/>
+    <w:next w:val="Standard"/>
+    <w:link w:val="berschrift2Zchn"/>
     <w:uiPriority w:val="9"/>
     <w:semiHidden/>
     <w:unhideWhenUsed/>
@@ -1773,11 +1798,11 @@
       <w:szCs w:val="32"/>
     </w:rPr>
   </w:style>
-  <w:style w:type="paragraph" w:styleId="Heading3">
+  <w:style w:type="paragraph" w:styleId="berschrift3">
     <w:name w:val="heading 3"/>
-    <w:basedOn w:val="Normal"/>
-    <w:next w:val="Normal"/>
-    <w:link w:val="Heading3Char"/>
+    <w:basedOn w:val="Standard"/>
+    <w:next w:val="Standard"/>
+    <w:link w:val="berschrift3Zchn"/>
     <w:uiPriority w:val="9"/>
     <w:semiHidden/>
     <w:unhideWhenUsed/>
@@ -1796,11 +1821,11 @@
       <w:szCs w:val="28"/>
     </w:rPr>
   </w:style>
-  <w:style w:type="paragraph" w:styleId="Heading4">
+  <w:style w:type="paragraph" w:styleId="berschrift4">
     <w:name w:val="heading 4"/>
-    <w:basedOn w:val="Normal"/>
-    <w:next w:val="Normal"/>
-    <w:link w:val="Heading4Char"/>
+    <w:basedOn w:val="Standard"/>
+    <w:next w:val="Standard"/>
+    <w:link w:val="berschrift4Zchn"/>
     <w:uiPriority w:val="9"/>
     <w:semiHidden/>
     <w:unhideWhenUsed/>
@@ -1819,11 +1844,11 @@
       <w:color w:val="0F4761" w:themeColor="accent1" w:themeShade="BF"/>
     </w:rPr>
   </w:style>
-  <w:style w:type="paragraph" w:styleId="Heading5">
+  <w:style w:type="paragraph" w:styleId="berschrift5">
     <w:name w:val="heading 5"/>
-    <w:basedOn w:val="Normal"/>
-    <w:next w:val="Normal"/>
-    <w:link w:val="Heading5Char"/>
+    <w:basedOn w:val="Standard"/>
+    <w:next w:val="Standard"/>
+    <w:link w:val="berschrift5Zchn"/>
     <w:uiPriority w:val="9"/>
     <w:semiHidden/>
     <w:unhideWhenUsed/>
@@ -1840,11 +1865,11 @@
       <w:color w:val="0F4761" w:themeColor="accent1" w:themeShade="BF"/>
     </w:rPr>
   </w:style>
-  <w:style w:type="paragraph" w:styleId="Heading6">
+  <w:style w:type="paragraph" w:styleId="berschrift6">
     <w:name w:val="heading 6"/>
-    <w:basedOn w:val="Normal"/>
-    <w:next w:val="Normal"/>
-    <w:link w:val="Heading6Char"/>
+    <w:basedOn w:val="Standard"/>
+    <w:next w:val="Standard"/>
+    <w:link w:val="berschrift6Zchn"/>
     <w:uiPriority w:val="9"/>
     <w:semiHidden/>
     <w:unhideWhenUsed/>
@@ -1863,11 +1888,11 @@
       <w:color w:val="595959" w:themeColor="text1" w:themeTint="A6"/>
     </w:rPr>
   </w:style>
-  <w:style w:type="paragraph" w:styleId="Heading7">
+  <w:style w:type="paragraph" w:styleId="berschrift7">
     <w:name w:val="heading 7"/>
-    <w:basedOn w:val="Normal"/>
-    <w:next w:val="Normal"/>
-    <w:link w:val="Heading7Char"/>
+    <w:basedOn w:val="Standard"/>
+    <w:next w:val="Standard"/>
+    <w:link w:val="berschrift7Zchn"/>
     <w:uiPriority w:val="9"/>
     <w:semiHidden/>
     <w:unhideWhenUsed/>
@@ -1884,11 +1909,11 @@
       <w:color w:val="595959" w:themeColor="text1" w:themeTint="A6"/>
     </w:rPr>
   </w:style>
-  <w:style w:type="paragraph" w:styleId="Heading8">
+  <w:style w:type="paragraph" w:styleId="berschrift8">
     <w:name w:val="heading 8"/>
-    <w:basedOn w:val="Normal"/>
-    <w:next w:val="Normal"/>
-    <w:link w:val="Heading8Char"/>
+    <w:basedOn w:val="Standard"/>
+    <w:next w:val="Standard"/>
+    <w:link w:val="berschrift8Zchn"/>
     <w:uiPriority w:val="9"/>
     <w:semiHidden/>
     <w:unhideWhenUsed/>
@@ -1907,11 +1932,11 @@
       <w:color w:val="272727" w:themeColor="text1" w:themeTint="D8"/>
     </w:rPr>
   </w:style>
-  <w:style w:type="paragraph" w:styleId="Heading9">
+  <w:style w:type="paragraph" w:styleId="berschrift9">
     <w:name w:val="heading 9"/>
-    <w:basedOn w:val="Normal"/>
-    <w:next w:val="Normal"/>
-    <w:link w:val="Heading9Char"/>
+    <w:basedOn w:val="Standard"/>
+    <w:next w:val="Standard"/>
+    <w:link w:val="berschrift9Zchn"/>
     <w:uiPriority w:val="9"/>
     <w:semiHidden/>
     <w:unhideWhenUsed/>
@@ -1928,13 +1953,13 @@
       <w:color w:val="272727" w:themeColor="text1" w:themeTint="D8"/>
     </w:rPr>
   </w:style>
-  <w:style w:type="character" w:default="1" w:styleId="DefaultParagraphFont">
+  <w:style w:type="character" w:default="1" w:styleId="Absatz-Standardschriftart">
     <w:name w:val="Default Paragraph Font"/>
     <w:uiPriority w:val="1"/>
     <w:semiHidden/>
     <w:unhideWhenUsed/>
   </w:style>
-  <w:style w:type="table" w:default="1" w:styleId="TableNormal">
+  <w:style w:type="table" w:default="1" w:styleId="NormaleTabelle">
     <w:name w:val="Normal Table"/>
     <w:uiPriority w:val="99"/>
     <w:semiHidden/>
@@ -1949,16 +1974,16 @@
       </w:tblCellMar>
     </w:tblPr>
   </w:style>
-  <w:style w:type="numbering" w:default="1" w:styleId="NoList">
+  <w:style w:type="numbering" w:default="1" w:styleId="KeineListe">
     <w:name w:val="No List"/>
     <w:uiPriority w:val="99"/>
     <w:semiHidden/>
     <w:unhideWhenUsed/>
   </w:style>
-  <w:style w:type="character" w:customStyle="1" w:styleId="Heading1Char">
-    <w:name w:val="Heading 1 Char"/>
-    <w:basedOn w:val="DefaultParagraphFont"/>
-    <w:link w:val="Heading1"/>
+  <w:style w:type="character" w:customStyle="1" w:styleId="berschrift1Zchn">
+    <w:name w:val="Überschrift 1 Zchn"/>
+    <w:basedOn w:val="Absatz-Standardschriftart"/>
+    <w:link w:val="berschrift1"/>
     <w:uiPriority w:val="9"/>
     <w:qFormat/>
     <w:rsid w:val="002026CA"/>
@@ -1969,10 +1994,10 @@
       <w:szCs w:val="40"/>
     </w:rPr>
   </w:style>
-  <w:style w:type="character" w:customStyle="1" w:styleId="Heading2Char">
-    <w:name w:val="Heading 2 Char"/>
-    <w:basedOn w:val="DefaultParagraphFont"/>
-    <w:link w:val="Heading2"/>
+  <w:style w:type="character" w:customStyle="1" w:styleId="berschrift2Zchn">
+    <w:name w:val="Überschrift 2 Zchn"/>
+    <w:basedOn w:val="Absatz-Standardschriftart"/>
+    <w:link w:val="berschrift2"/>
     <w:uiPriority w:val="9"/>
     <w:semiHidden/>
     <w:qFormat/>
@@ -1984,10 +2009,10 @@
       <w:szCs w:val="32"/>
     </w:rPr>
   </w:style>
-  <w:style w:type="character" w:customStyle="1" w:styleId="Heading3Char">
-    <w:name w:val="Heading 3 Char"/>
-    <w:basedOn w:val="DefaultParagraphFont"/>
-    <w:link w:val="Heading3"/>
+  <w:style w:type="character" w:customStyle="1" w:styleId="berschrift3Zchn">
+    <w:name w:val="Überschrift 3 Zchn"/>
+    <w:basedOn w:val="Absatz-Standardschriftart"/>
+    <w:link w:val="berschrift3"/>
     <w:uiPriority w:val="9"/>
     <w:semiHidden/>
     <w:qFormat/>
@@ -1999,10 +2024,10 @@
       <w:szCs w:val="28"/>
     </w:rPr>
   </w:style>
-  <w:style w:type="character" w:customStyle="1" w:styleId="Heading4Char">
-    <w:name w:val="Heading 4 Char"/>
-    <w:basedOn w:val="DefaultParagraphFont"/>
-    <w:link w:val="Heading4"/>
+  <w:style w:type="character" w:customStyle="1" w:styleId="berschrift4Zchn">
+    <w:name w:val="Überschrift 4 Zchn"/>
+    <w:basedOn w:val="Absatz-Standardschriftart"/>
+    <w:link w:val="berschrift4"/>
     <w:uiPriority w:val="9"/>
     <w:semiHidden/>
     <w:qFormat/>
@@ -2014,10 +2039,10 @@
       <w:color w:val="0F4761" w:themeColor="accent1" w:themeShade="BF"/>
     </w:rPr>
   </w:style>
-  <w:style w:type="character" w:customStyle="1" w:styleId="Heading5Char">
-    <w:name w:val="Heading 5 Char"/>
-    <w:basedOn w:val="DefaultParagraphFont"/>
-    <w:link w:val="Heading5"/>
+  <w:style w:type="character" w:customStyle="1" w:styleId="berschrift5Zchn">
+    <w:name w:val="Überschrift 5 Zchn"/>
+    <w:basedOn w:val="Absatz-Standardschriftart"/>
+    <w:link w:val="berschrift5"/>
     <w:uiPriority w:val="9"/>
     <w:semiHidden/>
     <w:qFormat/>
@@ -2027,10 +2052,10 @@
       <w:color w:val="0F4761" w:themeColor="accent1" w:themeShade="BF"/>
     </w:rPr>
   </w:style>
-  <w:style w:type="character" w:customStyle="1" w:styleId="Heading6Char">
-    <w:name w:val="Heading 6 Char"/>
-    <w:basedOn w:val="DefaultParagraphFont"/>
-    <w:link w:val="Heading6"/>
+  <w:style w:type="character" w:customStyle="1" w:styleId="berschrift6Zchn">
+    <w:name w:val="Überschrift 6 Zchn"/>
+    <w:basedOn w:val="Absatz-Standardschriftart"/>
+    <w:link w:val="berschrift6"/>
     <w:uiPriority w:val="9"/>
     <w:semiHidden/>
     <w:qFormat/>
@@ -2042,10 +2067,10 @@
       <w:color w:val="595959" w:themeColor="text1" w:themeTint="A6"/>
     </w:rPr>
   </w:style>
-  <w:style w:type="character" w:customStyle="1" w:styleId="Heading7Char">
-    <w:name w:val="Heading 7 Char"/>
-    <w:basedOn w:val="DefaultParagraphFont"/>
-    <w:link w:val="Heading7"/>
+  <w:style w:type="character" w:customStyle="1" w:styleId="berschrift7Zchn">
+    <w:name w:val="Überschrift 7 Zchn"/>
+    <w:basedOn w:val="Absatz-Standardschriftart"/>
+    <w:link w:val="berschrift7"/>
     <w:uiPriority w:val="9"/>
     <w:semiHidden/>
     <w:qFormat/>
@@ -2055,10 +2080,10 @@
       <w:color w:val="595959" w:themeColor="text1" w:themeTint="A6"/>
     </w:rPr>
   </w:style>
-  <w:style w:type="character" w:customStyle="1" w:styleId="Heading8Char">
-    <w:name w:val="Heading 8 Char"/>
-    <w:basedOn w:val="DefaultParagraphFont"/>
-    <w:link w:val="Heading8"/>
+  <w:style w:type="character" w:customStyle="1" w:styleId="berschrift8Zchn">
+    <w:name w:val="Überschrift 8 Zchn"/>
+    <w:basedOn w:val="Absatz-Standardschriftart"/>
+    <w:link w:val="berschrift8"/>
     <w:uiPriority w:val="9"/>
     <w:semiHidden/>
     <w:qFormat/>
@@ -2070,10 +2095,10 @@
       <w:color w:val="272727" w:themeColor="text1" w:themeTint="D8"/>
     </w:rPr>
   </w:style>
-  <w:style w:type="character" w:customStyle="1" w:styleId="Heading9Char">
-    <w:name w:val="Heading 9 Char"/>
-    <w:basedOn w:val="DefaultParagraphFont"/>
-    <w:link w:val="Heading9"/>
+  <w:style w:type="character" w:customStyle="1" w:styleId="berschrift9Zchn">
+    <w:name w:val="Überschrift 9 Zchn"/>
+    <w:basedOn w:val="Absatz-Standardschriftart"/>
+    <w:link w:val="berschrift9"/>
     <w:uiPriority w:val="9"/>
     <w:semiHidden/>
     <w:qFormat/>
@@ -2083,10 +2108,10 @@
       <w:color w:val="272727" w:themeColor="text1" w:themeTint="D8"/>
     </w:rPr>
   </w:style>
-  <w:style w:type="character" w:customStyle="1" w:styleId="TitleChar">
-    <w:name w:val="Title Char"/>
-    <w:basedOn w:val="DefaultParagraphFont"/>
-    <w:link w:val="Title"/>
+  <w:style w:type="character" w:customStyle="1" w:styleId="TitelZchn">
+    <w:name w:val="Titel Zchn"/>
+    <w:basedOn w:val="Absatz-Standardschriftart"/>
+    <w:link w:val="Titel"/>
     <w:uiPriority w:val="10"/>
     <w:qFormat/>
     <w:rsid w:val="002026CA"/>
@@ -2098,10 +2123,10 @@
       <w:szCs w:val="56"/>
     </w:rPr>
   </w:style>
-  <w:style w:type="character" w:customStyle="1" w:styleId="SubtitleChar">
-    <w:name w:val="Subtitle Char"/>
-    <w:basedOn w:val="DefaultParagraphFont"/>
-    <w:link w:val="Subtitle"/>
+  <w:style w:type="character" w:customStyle="1" w:styleId="UntertitelZchn">
+    <w:name w:val="Untertitel Zchn"/>
+    <w:basedOn w:val="Absatz-Standardschriftart"/>
+    <w:link w:val="Untertitel"/>
     <w:uiPriority w:val="11"/>
     <w:qFormat/>
     <w:rsid w:val="002026CA"/>
@@ -2113,10 +2138,10 @@
       <w:szCs w:val="28"/>
     </w:rPr>
   </w:style>
-  <w:style w:type="character" w:customStyle="1" w:styleId="QuoteChar">
-    <w:name w:val="Quote Char"/>
-    <w:basedOn w:val="DefaultParagraphFont"/>
-    <w:link w:val="Quote"/>
+  <w:style w:type="character" w:customStyle="1" w:styleId="ZitatZchn">
+    <w:name w:val="Zitat Zchn"/>
+    <w:basedOn w:val="Absatz-Standardschriftart"/>
+    <w:link w:val="Zitat"/>
     <w:uiPriority w:val="29"/>
     <w:qFormat/>
     <w:rsid w:val="002026CA"/>
@@ -2126,9 +2151,9 @@
       <w:color w:val="404040" w:themeColor="text1" w:themeTint="BF"/>
     </w:rPr>
   </w:style>
-  <w:style w:type="character" w:styleId="IntenseEmphasis">
+  <w:style w:type="character" w:styleId="IntensiveHervorhebung">
     <w:name w:val="Intense Emphasis"/>
-    <w:basedOn w:val="DefaultParagraphFont"/>
+    <w:basedOn w:val="Absatz-Standardschriftart"/>
     <w:uiPriority w:val="21"/>
     <w:qFormat/>
     <w:rsid w:val="002026CA"/>
@@ -2138,10 +2163,10 @@
       <w:color w:val="0F4761" w:themeColor="accent1" w:themeShade="BF"/>
     </w:rPr>
   </w:style>
-  <w:style w:type="character" w:customStyle="1" w:styleId="IntenseQuoteChar">
-    <w:name w:val="Intense Quote Char"/>
-    <w:basedOn w:val="DefaultParagraphFont"/>
-    <w:link w:val="IntenseQuote"/>
+  <w:style w:type="character" w:customStyle="1" w:styleId="IntensivesZitatZchn">
+    <w:name w:val="Intensives Zitat Zchn"/>
+    <w:basedOn w:val="Absatz-Standardschriftart"/>
+    <w:link w:val="IntensivesZitat"/>
     <w:uiPriority w:val="30"/>
     <w:qFormat/>
     <w:rsid w:val="002026CA"/>
@@ -2151,9 +2176,9 @@
       <w:color w:val="0F4761" w:themeColor="accent1" w:themeShade="BF"/>
     </w:rPr>
   </w:style>
-  <w:style w:type="character" w:styleId="IntenseReference">
+  <w:style w:type="character" w:styleId="IntensiverVerweis">
     <w:name w:val="Intense Reference"/>
-    <w:basedOn w:val="DefaultParagraphFont"/>
+    <w:basedOn w:val="Absatz-Standardschriftart"/>
     <w:uiPriority w:val="32"/>
     <w:qFormat/>
     <w:rsid w:val="002026CA"/>
@@ -2165,10 +2190,10 @@
       <w:spacing w:val="5"/>
     </w:rPr>
   </w:style>
-  <w:style w:type="character" w:customStyle="1" w:styleId="NoSpacingChar">
-    <w:name w:val="No Spacing Char"/>
-    <w:basedOn w:val="DefaultParagraphFont"/>
-    <w:link w:val="NoSpacing"/>
+  <w:style w:type="character" w:customStyle="1" w:styleId="KeinLeerraumZchn">
+    <w:name w:val="Kein Leerraum Zchn"/>
+    <w:basedOn w:val="Absatz-Standardschriftart"/>
+    <w:link w:val="KeinLeerraum"/>
     <w:uiPriority w:val="1"/>
     <w:qFormat/>
     <w:rsid w:val="00BB4392"/>
@@ -2182,8 +2207,8 @@
   </w:style>
   <w:style w:type="paragraph" w:customStyle="1" w:styleId="berschrift">
     <w:name w:val="Überschrift"/>
-    <w:basedOn w:val="Normal"/>
-    <w:next w:val="BodyText"/>
+    <w:basedOn w:val="Standard"/>
+    <w:next w:val="Textkrper"/>
     <w:qFormat/>
     <w:pPr>
       <w:keepNext/>
@@ -2195,23 +2220,23 @@
       <w:szCs w:val="28"/>
     </w:rPr>
   </w:style>
-  <w:style w:type="paragraph" w:styleId="BodyText">
+  <w:style w:type="paragraph" w:styleId="Textkrper">
     <w:name w:val="Body Text"/>
-    <w:basedOn w:val="Normal"/>
+    <w:basedOn w:val="Standard"/>
     <w:pPr>
       <w:spacing w:after="140" w:line="276" w:lineRule="auto"/>
     </w:pPr>
   </w:style>
-  <w:style w:type="paragraph" w:styleId="List">
+  <w:style w:type="paragraph" w:styleId="Liste">
     <w:name w:val="List"/>
-    <w:basedOn w:val="BodyText"/>
+    <w:basedOn w:val="Textkrper"/>
     <w:rPr>
       <w:rFonts w:cs="Lucida Sans"/>
     </w:rPr>
   </w:style>
-  <w:style w:type="paragraph" w:styleId="Caption">
+  <w:style w:type="paragraph" w:styleId="Beschriftung">
     <w:name w:val="caption"/>
-    <w:basedOn w:val="Normal"/>
+    <w:basedOn w:val="Standard"/>
     <w:qFormat/>
     <w:pPr>
       <w:suppressLineNumbers/>
@@ -2225,7 +2250,7 @@
   </w:style>
   <w:style w:type="paragraph" w:customStyle="1" w:styleId="Verzeichnis">
     <w:name w:val="Verzeichnis"/>
-    <w:basedOn w:val="Normal"/>
+    <w:basedOn w:val="Standard"/>
     <w:qFormat/>
     <w:pPr>
       <w:suppressLineNumbers/>
@@ -2234,11 +2259,11 @@
       <w:rFonts w:cs="Lucida Sans"/>
     </w:rPr>
   </w:style>
-  <w:style w:type="paragraph" w:styleId="Title">
+  <w:style w:type="paragraph" w:styleId="Titel">
     <w:name w:val="Title"/>
-    <w:basedOn w:val="Normal"/>
-    <w:next w:val="Normal"/>
-    <w:link w:val="TitleChar"/>
+    <w:basedOn w:val="Standard"/>
+    <w:next w:val="Standard"/>
+    <w:link w:val="TitelZchn"/>
     <w:uiPriority w:val="10"/>
     <w:qFormat/>
     <w:rsid w:val="002026CA"/>
@@ -2253,11 +2278,11 @@
       <w:szCs w:val="56"/>
     </w:rPr>
   </w:style>
-  <w:style w:type="paragraph" w:styleId="Subtitle">
+  <w:style w:type="paragraph" w:styleId="Untertitel">
     <w:name w:val="Subtitle"/>
-    <w:basedOn w:val="Normal"/>
-    <w:next w:val="Normal"/>
-    <w:link w:val="SubtitleChar"/>
+    <w:basedOn w:val="Standard"/>
+    <w:next w:val="Standard"/>
+    <w:link w:val="UntertitelZchn"/>
     <w:uiPriority w:val="11"/>
     <w:qFormat/>
     <w:rsid w:val="002026CA"/>
@@ -2269,11 +2294,11 @@
       <w:szCs w:val="28"/>
     </w:rPr>
   </w:style>
-  <w:style w:type="paragraph" w:styleId="Quote">
+  <w:style w:type="paragraph" w:styleId="Zitat">
     <w:name w:val="Quote"/>
-    <w:basedOn w:val="Normal"/>
-    <w:next w:val="Normal"/>
-    <w:link w:val="QuoteChar"/>
+    <w:basedOn w:val="Standard"/>
+    <w:next w:val="Standard"/>
+    <w:link w:val="ZitatZchn"/>
     <w:uiPriority w:val="29"/>
     <w:qFormat/>
     <w:rsid w:val="002026CA"/>
@@ -2287,9 +2312,9 @@
       <w:color w:val="404040" w:themeColor="text1" w:themeTint="BF"/>
     </w:rPr>
   </w:style>
-  <w:style w:type="paragraph" w:styleId="ListParagraph">
+  <w:style w:type="paragraph" w:styleId="Listenabsatz">
     <w:name w:val="List Paragraph"/>
-    <w:basedOn w:val="Normal"/>
+    <w:basedOn w:val="Standard"/>
     <w:uiPriority w:val="34"/>
     <w:qFormat/>
     <w:rsid w:val="002026CA"/>
@@ -2298,11 +2323,11 @@
       <w:contextualSpacing/>
     </w:pPr>
   </w:style>
-  <w:style w:type="paragraph" w:styleId="IntenseQuote">
+  <w:style w:type="paragraph" w:styleId="IntensivesZitat">
     <w:name w:val="Intense Quote"/>
-    <w:basedOn w:val="Normal"/>
-    <w:next w:val="Normal"/>
-    <w:link w:val="IntenseQuoteChar"/>
+    <w:basedOn w:val="Standard"/>
+    <w:next w:val="Standard"/>
+    <w:link w:val="IntensivesZitatZchn"/>
     <w:uiPriority w:val="30"/>
     <w:qFormat/>
     <w:rsid w:val="002026CA"/>
@@ -2321,9 +2346,9 @@
       <w:color w:val="0F4761" w:themeColor="accent1" w:themeShade="BF"/>
     </w:rPr>
   </w:style>
-  <w:style w:type="paragraph" w:styleId="NoSpacing">
+  <w:style w:type="paragraph" w:styleId="KeinLeerraum">
     <w:name w:val="No Spacing"/>
-    <w:link w:val="NoSpacingChar"/>
+    <w:link w:val="KeinLeerraumZchn"/>
     <w:uiPriority w:val="1"/>
     <w:qFormat/>
     <w:rsid w:val="00BB4392"/>
@@ -2337,12 +2362,12 @@
   </w:style>
   <w:style w:type="paragraph" w:customStyle="1" w:styleId="Rahmeninhalt">
     <w:name w:val="Rahmeninhalt"/>
-    <w:basedOn w:val="Normal"/>
-    <w:qFormat/>
-  </w:style>
-  <w:style w:type="table" w:styleId="TableGrid">
+    <w:basedOn w:val="Standard"/>
+    <w:qFormat/>
+  </w:style>
+  <w:style w:type="table" w:styleId="Tabellenraster">
     <w:name w:val="Table Grid"/>
-    <w:basedOn w:val="TableNormal"/>
+    <w:basedOn w:val="NormaleTabelle"/>
     <w:uiPriority w:val="39"/>
     <w:rsid w:val="001410C4"/>
     <w:tblPr>
@@ -2386,7 +2411,7 @@
             <w:rPr>
               <w:rFonts w:asciiTheme="majorHAnsi" w:eastAsiaTheme="majorEastAsia" w:hAnsiTheme="majorHAnsi" w:cstheme="majorBidi"/>
               <w:caps/>
-              <w:color w:val="156082" w:themeColor="accent1"/>
+              <w:color w:val="4472C4" w:themeColor="accent1"/>
               <w:sz w:val="80"/>
               <w:szCs w:val="80"/>
             </w:rPr>
@@ -2417,7 +2442,7 @@
           </w:pPr>
           <w:r>
             <w:rPr>
-              <w:color w:val="156082" w:themeColor="accent1"/>
+              <w:color w:val="4472C4" w:themeColor="accent1"/>
               <w:sz w:val="28"/>
               <w:szCs w:val="28"/>
             </w:rPr>
@@ -2471,6 +2496,20 @@
     <w:pitch w:val="variable"/>
     <w:sig w:usb0="00000003" w:usb1="00000000" w:usb2="00000000" w:usb3="00000000" w:csb0="00000001" w:csb1="00000000"/>
   </w:font>
+  <w:font w:name="Calibri">
+    <w:panose1 w:val="020F0502020204030204"/>
+    <w:charset w:val="00"/>
+    <w:family w:val="swiss"/>
+    <w:pitch w:val="variable"/>
+    <w:sig w:usb0="E4002EFF" w:usb1="C200247B" w:usb2="00000009" w:usb3="00000000" w:csb0="000001FF" w:csb1="00000000"/>
+  </w:font>
+  <w:font w:name="Calibri Light">
+    <w:panose1 w:val="020F0302020204030204"/>
+    <w:charset w:val="00"/>
+    <w:family w:val="swiss"/>
+    <w:pitch w:val="variable"/>
+    <w:sig w:usb0="E4002EFF" w:usb1="C200247B" w:usb2="00000009" w:usb3="00000000" w:csb0="000001FF" w:csb1="00000000"/>
+  </w:font>
 </w:fonts>
 </file>
 
@@ -2496,6 +2535,7 @@
     <w:rsid w:val="0021409C"/>
     <w:rsid w:val="00277897"/>
     <w:rsid w:val="002956F5"/>
+    <w:rsid w:val="003503B0"/>
     <w:rsid w:val="00410205"/>
     <w:rsid w:val="004165E4"/>
     <w:rsid w:val="004D18B1"/>
@@ -2503,6 +2543,7 @@
     <w:rsid w:val="00623C84"/>
     <w:rsid w:val="00745C36"/>
     <w:rsid w:val="007E4A22"/>
+    <w:rsid w:val="009751DE"/>
     <w:rsid w:val="00A7050C"/>
     <w:rsid w:val="00A943EE"/>
     <w:rsid w:val="00D42412"/>
@@ -2526,7 +2567,7 @@
   <w:themeFontLang w:val="de-DE"/>
   <w:clrSchemeMapping w:bg1="light1" w:t1="dark1" w:bg2="light2" w:t2="dark2" w:accent1="accent1" w:accent2="accent2" w:accent3="accent3" w:accent4="accent4" w:accent5="accent5" w:accent6="accent6" w:hyperlink="hyperlink" w:followedHyperlink="followedHyperlink"/>
   <w:decimalSymbol w:val=","/>
-  <w:listSeparator w:val=","/>
+  <w:listSeparator w:val=";"/>
   <w15:chartTrackingRefBased/>
 </w:settings>
 </file>
@@ -2928,17 +2969,17 @@
     <w:lsdException w:name="Unresolved Mention" w:semiHidden="1" w:unhideWhenUsed="1"/>
     <w:lsdException w:name="Smart Link" w:semiHidden="1" w:unhideWhenUsed="1"/>
   </w:latentStyles>
-  <w:style w:type="paragraph" w:default="1" w:styleId="Normal">
+  <w:style w:type="paragraph" w:default="1" w:styleId="Standard">
     <w:name w:val="Normal"/>
     <w:qFormat/>
   </w:style>
-  <w:style w:type="character" w:default="1" w:styleId="DefaultParagraphFont">
+  <w:style w:type="character" w:default="1" w:styleId="Absatz-Standardschriftart">
     <w:name w:val="Default Paragraph Font"/>
     <w:uiPriority w:val="1"/>
     <w:semiHidden/>
     <w:unhideWhenUsed/>
   </w:style>
-  <w:style w:type="table" w:default="1" w:styleId="TableNormal">
+  <w:style w:type="table" w:default="1" w:styleId="NormaleTabelle">
     <w:name w:val="Normal Table"/>
     <w:uiPriority w:val="99"/>
     <w:semiHidden/>
@@ -2953,7 +2994,7 @@
       </w:tblCellMar>
     </w:tblPr>
   </w:style>
-  <w:style w:type="numbering" w:default="1" w:styleId="NoList">
+  <w:style w:type="numbering" w:default="1" w:styleId="KeineListe">
     <w:name w:val="No List"/>
     <w:uiPriority w:val="99"/>
     <w:semiHidden/>
@@ -3152,10 +3193,6 @@
 </file>
 
 <file path=customXml/item1.xml><?xml version="1.0" encoding="utf-8"?>
-<b:Sources xmlns:b="http://schemas.openxmlformats.org/officeDocument/2006/bibliography" xmlns="http://schemas.openxmlformats.org/officeDocument/2006/bibliography" SelectedStyle="\APASixthEditionOfficeOnline.xsl" StyleName="APA" Version="6"/>
-</file>
-
-<file path=customXml/item2.xml><?xml version="1.0" encoding="utf-8"?>
 <CoverPageProperties xmlns="http://schemas.microsoft.com/office/2006/coverPageProps">
   <PublishDate>2026-04-21T00:00:00</PublishDate>
   <Abstract/>
@@ -3166,18 +3203,22 @@
 </CoverPageProperties>
 </file>
 
+<file path=customXml/item2.xml><?xml version="1.0" encoding="utf-8"?>
+<b:Sources xmlns:b="http://schemas.openxmlformats.org/officeDocument/2006/bibliography" xmlns="http://schemas.openxmlformats.org/officeDocument/2006/bibliography" SelectedStyle="\APASixthEditionOfficeOnline.xsl" StyleName="APA" Version="6"/>
+</file>
+
 <file path=customXml/itemProps1.xml><?xml version="1.0" encoding="utf-8"?>
+<ds:datastoreItem xmlns:ds="http://schemas.openxmlformats.org/officeDocument/2006/customXml" ds:itemID="{7C199522-265B-42C4-A15C-F6E2AD7DD71A}">
+  <ds:schemaRefs>
+    <ds:schemaRef ds:uri="http://schemas.microsoft.com/office/2006/coverPageProps"/>
+  </ds:schemaRefs>
+</ds:datastoreItem>
+</file>
+
+<file path=customXml/itemProps2.xml><?xml version="1.0" encoding="utf-8"?>
 <ds:datastoreItem xmlns:ds="http://schemas.openxmlformats.org/officeDocument/2006/customXml" ds:itemID="{F0E20EC3-4693-44DE-BE2E-923379297990}">
   <ds:schemaRefs>
     <ds:schemaRef ds:uri="http://schemas.openxmlformats.org/officeDocument/2006/bibliography"/>
   </ds:schemaRefs>
 </ds:datastoreItem>
-</file>
-
-<file path=customXml/itemProps2.xml><?xml version="1.0" encoding="utf-8"?>
-<ds:datastoreItem xmlns:ds="http://schemas.openxmlformats.org/officeDocument/2006/customXml" ds:itemID="{7C199522-265B-42C4-A15C-F6E2AD7DD71A}">
-  <ds:schemaRefs>
-    <ds:schemaRef ds:uri="http://schemas.microsoft.com/office/2006/coverPageProps"/>
-  </ds:schemaRefs>
-</ds:datastoreItem>
 </file>
</xml_diff>

<commit_message>
added some text for tutorial but back button for howToPlay part doesnt't work
</commit_message>
<xml_diff>
--- a/wild-jam-april-2026/__ORGA/Changelog.docx
+++ b/wild-jam-april-2026/__ORGA/Changelog.docx
@@ -203,12 +203,10 @@
           </w:pPr>
           <w:r>
             <w:rPr/>
-          </w:r>
-          <w:r>
             <mc:AlternateContent>
               <mc:Choice Requires="wps">
                 <w:drawing>
-                  <wp:anchor behindDoc="0" distT="0" distB="12700" distL="0" distR="0" simplePos="0" locked="0" layoutInCell="0" allowOverlap="1" relativeHeight="2">
+                  <wp:anchor behindDoc="0" distT="0" distB="0" distL="0" distR="0" simplePos="0" locked="0" layoutInCell="0" allowOverlap="1" relativeHeight="2">
                     <wp:simplePos x="0" y="0"/>
                     <wp:positionH relativeFrom="margin">
                       <wp:align>center</wp:align>
@@ -223,19 +221,26 @@
                     <a:graphic xmlns:a="http://schemas.openxmlformats.org/drawingml/2006/main">
                       <a:graphicData uri="http://schemas.microsoft.com/office/word/2010/wordprocessingShape">
                         <wps:wsp>
-                          <wps:cNvSpPr txBox="1"/>
+                          <wps:cNvSpPr/>
                           <wps:spPr>
                             <a:xfrm>
                               <a:off x="0" y="0"/>
-                              <a:ext cx="5760085" cy="549910"/>
+                              <a:ext cx="5760000" cy="550080"/>
                             </a:xfrm>
-                            <a:prstGeom prst="rect"/>
-                            <a:solidFill>
-                              <a:srgbClr val="FFFFFF">
-                                <a:alpha val="0"/>
-                              </a:srgbClr>
-                            </a:solidFill>
+                            <a:prstGeom prst="rect">
+                              <a:avLst/>
+                            </a:prstGeom>
+                            <a:noFill/>
+                            <a:ln w="0">
+                              <a:noFill/>
+                            </a:ln>
                           </wps:spPr>
+                          <wps:style>
+                            <a:lnRef idx="0"/>
+                            <a:fillRef idx="0"/>
+                            <a:effectRef idx="0"/>
+                            <a:fontRef idx="minor"/>
+                          </wps:style>
                           <wps:txbx>
                             <w:txbxContent>
                               <w:p>
@@ -338,7 +343,7 @@
                               </w:p>
                             </w:txbxContent>
                           </wps:txbx>
-                          <wps:bodyPr anchor="t" lIns="0" tIns="0" rIns="0" bIns="0">
+                          <wps:bodyPr lIns="0" rIns="0" tIns="0" bIns="0" anchor="t">
                             <a:noAutofit/>
                           </wps:bodyPr>
                         </wps:wsp>
@@ -349,8 +354,10 @@
               </mc:Choice>
               <mc:Fallback>
                 <w:pict>
-                  <v:rect stroked="f" strokeweight="0pt" style="position:absolute;rotation:-0;width:453.55pt;height:43.3pt;mso-wrap-distance-left:0pt;mso-wrap-distance-right:0pt;mso-wrap-distance-top:0pt;mso-wrap-distance-bottom:1pt;margin-top:715.6pt;mso-position-vertical-relative:page;margin-left:0.05pt;mso-position-horizontal:center;mso-position-horizontal-relative:margin">
-                    <v:textbox inset="0in,0in,0in,0in">
+                  <v:rect id="shape_0" ID="Rahmen1" path="m0,0l-2147483645,0l-2147483645,-2147483646l0,-2147483646xe" fillcolor="white" stroked="f" o:allowincell="f" style="position:absolute;margin-left:0pt;margin-top:715.6pt;width:453.5pt;height:43.25pt;mso-wrap-style:square;v-text-anchor:top;mso-position-horizontal:center;mso-position-horizontal-relative:margin;mso-position-vertical-relative:page">
+                    <v:fill o:detectmouseclick="t" type="solid" color2="black" opacity="0"/>
+                    <v:stroke color="#3465a4" joinstyle="round" endcap="flat"/>
+                    <v:textbox>
                       <w:txbxContent>
                         <w:p>
                           <w:pPr>
@@ -629,7 +636,7 @@
             </w:pPr>
             <w:r>
               <w:rPr>
-                <w:rFonts w:eastAsia="Aptos" w:cs="" w:ascii="Aptos" w:hAnsi="Aptos"/>
+                <w:rFonts w:eastAsia="Aptos" w:cs=""/>
                 <w:kern w:val="2"/>
                 <w:sz w:val="24"/>
                 <w:szCs w:val="24"/>
@@ -657,7 +664,7 @@
             </w:pPr>
             <w:r>
               <w:rPr>
-                <w:rFonts w:eastAsia="Aptos" w:cs="" w:ascii="Aptos" w:hAnsi="Aptos"/>
+                <w:rFonts w:eastAsia="Aptos" w:cs=""/>
                 <w:kern w:val="2"/>
                 <w:sz w:val="24"/>
                 <w:szCs w:val="24"/>
@@ -713,7 +720,7 @@
             </w:pPr>
             <w:r>
               <w:rPr>
-                <w:rFonts w:eastAsia="Aptos" w:cs="" w:ascii="Aptos" w:hAnsi="Aptos"/>
+                <w:rFonts w:eastAsia="Aptos" w:cs=""/>
                 <w:kern w:val="2"/>
                 <w:sz w:val="24"/>
                 <w:szCs w:val="24"/>
@@ -744,7 +751,7 @@
             </w:pPr>
             <w:r>
               <w:rPr>
-                <w:rFonts w:eastAsia="Aptos" w:cs="" w:ascii="Aptos" w:hAnsi="Aptos"/>
+                <w:rFonts w:eastAsia="Aptos" w:cs=""/>
                 <w:kern w:val="2"/>
                 <w:sz w:val="24"/>
                 <w:szCs w:val="24"/>
@@ -772,7 +779,7 @@
             </w:pPr>
             <w:r>
               <w:rPr>
-                <w:rFonts w:eastAsia="Aptos" w:cs="" w:ascii="Aptos" w:hAnsi="Aptos"/>
+                <w:rFonts w:eastAsia="Aptos" w:cs=""/>
                 <w:kern w:val="2"/>
                 <w:sz w:val="24"/>
                 <w:szCs w:val="24"/>
@@ -800,7 +807,7 @@
             </w:pPr>
             <w:r>
               <w:rPr>
-                <w:rFonts w:eastAsia="Aptos" w:cs="" w:ascii="Aptos" w:hAnsi="Aptos"/>
+                <w:rFonts w:eastAsia="Aptos" w:cs=""/>
                 <w:kern w:val="2"/>
                 <w:sz w:val="24"/>
                 <w:szCs w:val="24"/>
@@ -828,7 +835,7 @@
             </w:pPr>
             <w:r>
               <w:rPr>
-                <w:rFonts w:eastAsia="Aptos" w:cs="" w:ascii="Aptos" w:hAnsi="Aptos"/>
+                <w:rFonts w:eastAsia="Aptos" w:cs=""/>
                 <w:kern w:val="2"/>
                 <w:sz w:val="24"/>
                 <w:szCs w:val="24"/>
@@ -859,7 +866,7 @@
             </w:pPr>
             <w:r>
               <w:rPr>
-                <w:rFonts w:eastAsia="Aptos" w:cs="" w:ascii="Aptos" w:hAnsi="Aptos"/>
+                <w:rFonts w:eastAsia="Aptos" w:cs=""/>
                 <w:kern w:val="2"/>
                 <w:sz w:val="24"/>
                 <w:szCs w:val="24"/>
@@ -887,7 +894,7 @@
             </w:pPr>
             <w:r>
               <w:rPr>
-                <w:rFonts w:eastAsia="Aptos" w:cs="" w:ascii="Aptos" w:hAnsi="Aptos"/>
+                <w:rFonts w:eastAsia="Aptos" w:cs=""/>
                 <w:kern w:val="2"/>
                 <w:sz w:val="24"/>
                 <w:szCs w:val="24"/>
@@ -915,7 +922,7 @@
             </w:pPr>
             <w:r>
               <w:rPr>
-                <w:rFonts w:eastAsia="Aptos" w:cs="" w:ascii="Aptos" w:hAnsi="Aptos"/>
+                <w:rFonts w:eastAsia="Aptos" w:cs=""/>
                 <w:kern w:val="2"/>
                 <w:sz w:val="24"/>
                 <w:szCs w:val="24"/>
@@ -943,7 +950,7 @@
             </w:pPr>
             <w:r>
               <w:rPr>
-                <w:rFonts w:eastAsia="Aptos" w:cs="" w:ascii="Aptos" w:hAnsi="Aptos"/>
+                <w:rFonts w:eastAsia="Aptos" w:cs=""/>
                 <w:kern w:val="2"/>
                 <w:sz w:val="24"/>
                 <w:szCs w:val="24"/>
@@ -974,7 +981,7 @@
             </w:pPr>
             <w:r>
               <w:rPr>
-                <w:rFonts w:eastAsia="Aptos" w:cs="" w:ascii="Aptos" w:hAnsi="Aptos"/>
+                <w:rFonts w:eastAsia="Aptos" w:cs=""/>
                 <w:kern w:val="2"/>
                 <w:sz w:val="24"/>
                 <w:szCs w:val="24"/>
@@ -1002,7 +1009,7 @@
             </w:pPr>
             <w:r>
               <w:rPr>
-                <w:rFonts w:eastAsia="Aptos" w:cs="" w:ascii="Aptos" w:hAnsi="Aptos"/>
+                <w:rFonts w:eastAsia="Aptos" w:cs=""/>
                 <w:kern w:val="2"/>
                 <w:sz w:val="24"/>
                 <w:szCs w:val="24"/>
@@ -1030,7 +1037,7 @@
             </w:pPr>
             <w:r>
               <w:rPr>
-                <w:rFonts w:eastAsia="Aptos" w:cs="" w:ascii="Aptos" w:hAnsi="Aptos"/>
+                <w:rFonts w:eastAsia="Aptos" w:cs=""/>
                 <w:kern w:val="2"/>
                 <w:sz w:val="24"/>
                 <w:szCs w:val="24"/>
@@ -1058,7 +1065,7 @@
             </w:pPr>
             <w:r>
               <w:rPr>
-                <w:rFonts w:eastAsia="Aptos" w:cs="" w:ascii="Aptos" w:hAnsi="Aptos"/>
+                <w:rFonts w:eastAsia="Aptos" w:cs=""/>
                 <w:kern w:val="2"/>
                 <w:sz w:val="24"/>
                 <w:szCs w:val="24"/>
@@ -1751,11 +1758,8 @@
             </w:pPr>
             <w:r>
               <w:rPr>
-                <w:rFonts w:eastAsia="Aptos" w:cs=""/>
-                <w:kern w:val="2"/>
-                <w:sz w:val="24"/>
-                <w:szCs w:val="24"/>
-                <w:lang w:val="de-DE" w:eastAsia="en-US" w:bidi="ar-SA"/>
+                <w:rFonts w:eastAsia="Aptos"/>
+                <w:sz w:val="24"/>
               </w:rPr>
             </w:r>
           </w:p>
@@ -2196,11 +2200,8 @@
             </w:pPr>
             <w:r>
               <w:rPr>
-                <w:rFonts w:eastAsia="Aptos" w:cs=""/>
-                <w:kern w:val="2"/>
-                <w:sz w:val="24"/>
-                <w:szCs w:val="24"/>
-                <w:lang w:val="de-DE" w:eastAsia="en-US" w:bidi="ar-SA"/>
+                <w:rFonts w:eastAsia="Aptos"/>
+                <w:sz w:val="24"/>
               </w:rPr>
             </w:r>
           </w:p>
@@ -2230,6 +2231,228 @@
                 <w:sz w:val="24"/>
                 <w:szCs w:val="24"/>
                 <w:lang w:val="de-DE" w:eastAsia="en-US" w:bidi="ar-SA"/>
+              </w:rPr>
+              <w:t>Luise Münchgesang</w:t>
+            </w:r>
+          </w:p>
+        </w:tc>
+      </w:tr>
+      <w:tr>
+        <w:trPr/>
+        <w:tc>
+          <w:tcPr>
+            <w:tcW w:w="1555" w:type="dxa"/>
+            <w:tcBorders>
+              <w:top w:val="nil"/>
+            </w:tcBorders>
+          </w:tcPr>
+          <w:p>
+            <w:pPr>
+              <w:pStyle w:val="Normal"/>
+              <w:widowControl/>
+              <w:suppressAutoHyphens w:val="true"/>
+              <w:spacing w:lineRule="auto" w:line="240" w:before="0" w:after="0"/>
+              <w:jc w:val="left"/>
+              <w:rPr>
+                <w:rFonts w:eastAsia="Aptos"/>
+              </w:rPr>
+            </w:pPr>
+            <w:r>
+              <w:rPr>
+                <w:rFonts w:eastAsia="Aptos"/>
+                <w:sz w:val="24"/>
+              </w:rPr>
+              <w:t>10.05.2026</w:t>
+            </w:r>
+          </w:p>
+        </w:tc>
+        <w:tc>
+          <w:tcPr>
+            <w:tcW w:w="2976" w:type="dxa"/>
+            <w:tcBorders>
+              <w:top w:val="nil"/>
+            </w:tcBorders>
+          </w:tcPr>
+          <w:p>
+            <w:pPr>
+              <w:pStyle w:val="Normal"/>
+              <w:widowControl/>
+              <w:suppressAutoHyphens w:val="true"/>
+              <w:spacing w:lineRule="auto" w:line="240" w:before="0" w:after="0"/>
+              <w:jc w:val="left"/>
+              <w:rPr>
+                <w:rFonts w:eastAsia="Aptos"/>
+              </w:rPr>
+            </w:pPr>
+            <w:r>
+              <w:rPr>
+                <w:rFonts w:eastAsia="Aptos"/>
+                <w:sz w:val="24"/>
+              </w:rPr>
+              <w:t>Spielbeschreibung im Hauptmenü ergänzt</w:t>
+            </w:r>
+          </w:p>
+        </w:tc>
+        <w:tc>
+          <w:tcPr>
+            <w:tcW w:w="2551" w:type="dxa"/>
+            <w:tcBorders>
+              <w:top w:val="nil"/>
+            </w:tcBorders>
+          </w:tcPr>
+          <w:p>
+            <w:pPr>
+              <w:pStyle w:val="Normal"/>
+              <w:widowControl/>
+              <w:suppressAutoHyphens w:val="true"/>
+              <w:spacing w:lineRule="auto" w:line="240" w:before="0" w:after="0"/>
+              <w:jc w:val="left"/>
+              <w:rPr>
+                <w:rFonts w:eastAsia="Aptos"/>
+              </w:rPr>
+            </w:pPr>
+            <w:r>
+              <w:rPr>
+                <w:rFonts w:eastAsia="Aptos"/>
+                <w:sz w:val="24"/>
+              </w:rPr>
+              <w:t>Erleichtern des Starts in das Spiel</w:t>
+            </w:r>
+          </w:p>
+        </w:tc>
+        <w:tc>
+          <w:tcPr>
+            <w:tcW w:w="1979" w:type="dxa"/>
+            <w:tcBorders>
+              <w:top w:val="nil"/>
+            </w:tcBorders>
+          </w:tcPr>
+          <w:p>
+            <w:pPr>
+              <w:pStyle w:val="Normal"/>
+              <w:widowControl/>
+              <w:suppressAutoHyphens w:val="true"/>
+              <w:spacing w:lineRule="auto" w:line="240" w:before="0" w:after="0"/>
+              <w:jc w:val="left"/>
+              <w:rPr>
+                <w:rFonts w:eastAsia="Aptos"/>
+              </w:rPr>
+            </w:pPr>
+            <w:r>
+              <w:rPr>
+                <w:rFonts w:eastAsia="Aptos"/>
+                <w:sz w:val="24"/>
+              </w:rPr>
+              <w:t>Luise Münchgesang</w:t>
+            </w:r>
+          </w:p>
+        </w:tc>
+      </w:tr>
+      <w:tr>
+        <w:trPr/>
+        <w:tc>
+          <w:tcPr>
+            <w:tcW w:w="1555" w:type="dxa"/>
+            <w:tcBorders>
+              <w:top w:val="nil"/>
+            </w:tcBorders>
+          </w:tcPr>
+          <w:p>
+            <w:pPr>
+              <w:pStyle w:val="Normal"/>
+              <w:widowControl/>
+              <w:suppressAutoHyphens w:val="true"/>
+              <w:spacing w:lineRule="auto" w:line="240" w:before="0" w:after="0"/>
+              <w:jc w:val="left"/>
+              <w:rPr>
+                <w:rFonts w:eastAsia="Aptos"/>
+              </w:rPr>
+            </w:pPr>
+            <w:r>
+              <w:rPr>
+                <w:rFonts w:eastAsia="Aptos"/>
+                <w:sz w:val="24"/>
+              </w:rPr>
+              <w:t>--</w:t>
+            </w:r>
+          </w:p>
+        </w:tc>
+        <w:tc>
+          <w:tcPr>
+            <w:tcW w:w="2976" w:type="dxa"/>
+            <w:tcBorders>
+              <w:top w:val="nil"/>
+            </w:tcBorders>
+          </w:tcPr>
+          <w:p>
+            <w:pPr>
+              <w:pStyle w:val="Normal"/>
+              <w:widowControl/>
+              <w:suppressAutoHyphens w:val="true"/>
+              <w:spacing w:lineRule="auto" w:line="240" w:before="0" w:after="0"/>
+              <w:jc w:val="left"/>
+              <w:rPr>
+                <w:rFonts w:eastAsia="Aptos"/>
+              </w:rPr>
+            </w:pPr>
+            <w:r>
+              <w:rPr>
+                <w:rFonts w:eastAsia="Aptos"/>
+                <w:sz w:val="24"/>
+              </w:rPr>
+              <w:t xml:space="preserve">Hilfe Button im spiel ergänzt + Erk,lärungen </w:t>
+            </w:r>
+          </w:p>
+        </w:tc>
+        <w:tc>
+          <w:tcPr>
+            <w:tcW w:w="2551" w:type="dxa"/>
+            <w:tcBorders>
+              <w:top w:val="nil"/>
+            </w:tcBorders>
+          </w:tcPr>
+          <w:p>
+            <w:pPr>
+              <w:pStyle w:val="Normal"/>
+              <w:widowControl/>
+              <w:suppressAutoHyphens w:val="true"/>
+              <w:spacing w:lineRule="auto" w:line="240" w:before="0" w:after="0"/>
+              <w:jc w:val="left"/>
+              <w:rPr>
+                <w:rFonts w:eastAsia="Aptos"/>
+              </w:rPr>
+            </w:pPr>
+            <w:r>
+              <w:rPr>
+                <w:rFonts w:eastAsia="Aptos"/>
+                <w:sz w:val="24"/>
+              </w:rPr>
+              <w:t>Besseres Spielverständniss</w:t>
+            </w:r>
+          </w:p>
+        </w:tc>
+        <w:tc>
+          <w:tcPr>
+            <w:tcW w:w="1979" w:type="dxa"/>
+            <w:tcBorders>
+              <w:top w:val="nil"/>
+            </w:tcBorders>
+          </w:tcPr>
+          <w:p>
+            <w:pPr>
+              <w:pStyle w:val="Normal"/>
+              <w:widowControl/>
+              <w:suppressAutoHyphens w:val="true"/>
+              <w:spacing w:lineRule="auto" w:line="240" w:before="0" w:after="0"/>
+              <w:jc w:val="left"/>
+              <w:rPr>
+                <w:rFonts w:eastAsia="Aptos"/>
+              </w:rPr>
+            </w:pPr>
+            <w:r>
+              <w:rPr>
+                <w:rFonts w:eastAsia="Aptos"/>
+                <w:sz w:val="24"/>
               </w:rPr>
               <w:t>Luise Münchgesang</w:t>
             </w:r>
@@ -3110,7 +3333,7 @@
       <w:lang w:eastAsia="de-DE"/>
     </w:rPr>
   </w:style>
-  <w:style w:type="paragraph" w:styleId="berschrift">
+  <w:style w:type="paragraph" w:styleId="berschrift" w:customStyle="1">
     <w:name w:val="Überschrift"/>
     <w:basedOn w:val="Normal"/>
     <w:next w:val="BodyText"/>
@@ -3155,7 +3378,7 @@
       <w:iCs/>
     </w:rPr>
   </w:style>
-  <w:style w:type="paragraph" w:styleId="Verzeichnis">
+  <w:style w:type="paragraph" w:styleId="Verzeichnis" w:customStyle="1">
     <w:name w:val="Verzeichnis"/>
     <w:basedOn w:val="Normal"/>
     <w:qFormat/>
@@ -3166,7 +3389,7 @@
       <w:rFonts w:cs="Lucida Sans"/>
     </w:rPr>
   </w:style>
-  <w:style w:type="paragraph" w:styleId="berschriftuser" w:customStyle="1">
+  <w:style w:type="paragraph" w:styleId="berschriftuser">
     <w:name w:val="Überschrift (user)"/>
     <w:basedOn w:val="Normal"/>
     <w:next w:val="BodyText"/>
@@ -3181,7 +3404,7 @@
       <w:szCs w:val="28"/>
     </w:rPr>
   </w:style>
-  <w:style w:type="paragraph" w:styleId="Verzeichnisuser" w:customStyle="1">
+  <w:style w:type="paragraph" w:styleId="Verzeichnisuser">
     <w:name w:val="Verzeichnis (user)"/>
     <w:basedOn w:val="Normal"/>
     <w:qFormat/>
@@ -3296,30 +3519,30 @@
       <w:jc w:val="left"/>
     </w:pPr>
     <w:rPr>
-      <w:rFonts w:ascii="Aptos" w:hAnsi="Aptos" w:eastAsia="" w:eastAsiaTheme="minorEastAsia" w:cs=""/>
+      <w:rFonts w:ascii="Aptos" w:hAnsi="Aptos" w:eastAsia="" w:cs="" w:eastAsiaTheme="minorEastAsia"/>
       <w:color w:val="auto"/>
       <w:kern w:val="0"/>
       <w:sz w:val="22"/>
       <w:szCs w:val="22"/>
-      <w:lang w:eastAsia="de-DE" w:val="de-DE" w:bidi="ar-SA"/>
+      <w:lang w:val="de-DE" w:eastAsia="de-DE" w:bidi="ar-SA"/>
     </w:rPr>
   </w:style>
-  <w:style w:type="paragraph" w:styleId="Rahmeninhaltuser" w:customStyle="1">
+  <w:style w:type="paragraph" w:styleId="Rahmeninhalt" w:customStyle="1">
+    <w:name w:val="Rahmeninhalt"/>
+    <w:basedOn w:val="Normal"/>
+    <w:qFormat/>
+    <w:pPr/>
+    <w:rPr/>
+  </w:style>
+  <w:style w:type="paragraph" w:styleId="Rahmeninhaltuser">
     <w:name w:val="Rahmeninhalt (user)"/>
     <w:basedOn w:val="Normal"/>
     <w:qFormat/>
     <w:pPr/>
     <w:rPr/>
   </w:style>
-  <w:style w:type="paragraph" w:styleId="Rahmeninhalt">
-    <w:name w:val="Rahmeninhalt"/>
-    <w:basedOn w:val="Normal"/>
-    <w:qFormat/>
-    <w:pPr/>
-    <w:rPr/>
-  </w:style>
-  <w:style w:type="numbering" w:styleId="KeineListe" w:default="1">
-    <w:name w:val="Keine Liste"/>
+  <w:style w:type="numbering" w:styleId="KeineListeuser" w:default="1">
+    <w:name w:val="Keine Liste (user)"/>
     <w:uiPriority w:val="99"/>
     <w:semiHidden/>
     <w:unhideWhenUsed/>
@@ -4162,35 +4385,4 @@
     </a:fmtScheme>
   </a:themeElements>
 </a:theme>
-</file>
-
-<file path=customXml/item1.xml><?xml version="1.0" encoding="utf-8"?>
-<b:Sources xmlns:b="http://schemas.openxmlformats.org/officeDocument/2006/bibliography" xmlns="http://schemas.openxmlformats.org/officeDocument/2006/bibliography" SelectedStyle="\APASixthEditionOfficeOnline.xsl" StyleName="APA" Version="6"/>
-</file>
-
-<file path=customXml/item2.xml><?xml version="1.0" encoding="utf-8"?>
-<CoverPageProperties xmlns="http://schemas.microsoft.com/office/2006/coverPageProps">
-  <PublishDate>21. April 2026</PublishDate>
-  <Abstract/>
-  <CompanyAddress>     </CompanyAddress>
-  <CompanyPhone/>
-  <CompanyFax/>
-  <CompanyEmail/>
-</CoverPageProperties>
-</file>
-
-<file path=customXml/itemProps1.xml><?xml version="1.0" encoding="utf-8"?>
-<ds:datastoreItem xmlns:ds="http://schemas.openxmlformats.org/officeDocument/2006/customXml" ds:itemID="{F0E20EC3-4693-44DE-BE2E-923379297990}">
-  <ds:schemaRefs>
-    <ds:schemaRef ds:uri="http://schemas.openxmlformats.org/officeDocument/2006/bibliography"/>
-  </ds:schemaRefs>
-</ds:datastoreItem>
-</file>
-
-<file path=customXml/itemProps2.xml><?xml version="1.0" encoding="utf-8"?>
-<ds:datastoreItem xmlns:ds="http://schemas.openxmlformats.org/officeDocument/2006/customXml" ds:itemID="{7C199522-265B-42C4-A15C-F6E2AD7DD71A}">
-  <ds:schemaRefs>
-    <ds:schemaRef ds:uri="http://schemas.microsoft.com/office/2006/coverPageProps"/>
-  </ds:schemaRefs>
-</ds:datastoreItem>
 </file>
</xml_diff>

<commit_message>
corrected can positioning after machine interactions
</commit_message>
<xml_diff>
--- a/wild-jam-april-2026/__ORGA/Changelog.docx
+++ b/wild-jam-april-2026/__ORGA/Changelog.docx
@@ -1,21 +1,14 @@
 
 <file path=word/document.xml><?xml version="1.0" encoding="utf-8"?>
-<w:document xmlns:wpc="http://schemas.microsoft.com/office/word/2010/wordprocessingCanvas" xmlns:cx="http://schemas.microsoft.com/office/drawing/2014/chartex" xmlns:cx1="http://schemas.microsoft.com/office/drawing/2015/9/8/chartex" xmlns:cx2="http://schemas.microsoft.com/office/drawing/2015/10/21/chartex" xmlns:cx3="http://schemas.microsoft.com/office/drawing/2016/5/9/chartex" xmlns:cx4="http://schemas.microsoft.com/office/drawing/2016/5/10/chartex" xmlns:cx5="http://schemas.microsoft.com/office/drawing/2016/5/11/chartex" xmlns:cx6="http://schemas.microsoft.com/office/drawing/2016/5/12/chartex" xmlns:cx7="http://schemas.microsoft.com/office/drawing/2016/5/13/chartex" xmlns:cx8="http://schemas.microsoft.com/office/drawing/2016/5/14/chartex" xmlns:mc="http://schemas.openxmlformats.org/markup-compatibility/2006" xmlns:aink="http://schemas.microsoft.com/office/drawing/2016/ink" xmlns:am3d="http://schemas.microsoft.com/office/drawing/2017/model3d" xmlns:o="urn:schemas-microsoft-com:office:office" xmlns:oel="http://schemas.microsoft.com/office/2019/extlst" xmlns:r="http://schemas.openxmlformats.org/officeDocument/2006/relationships" xmlns:m="http://schemas.openxmlformats.org/officeDocument/2006/math" xmlns:v="urn:schemas-microsoft-com:vml" xmlns:wp14="http://schemas.microsoft.com/office/word/2010/wordprocessingDrawing" xmlns:wp="http://schemas.openxmlformats.org/drawingml/2006/wordprocessingDrawing" xmlns:w10="urn:schemas-microsoft-com:office:word" xmlns:w="http://schemas.openxmlformats.org/wordprocessingml/2006/main" xmlns:w14="http://schemas.microsoft.com/office/word/2010/wordml" xmlns:w15="http://schemas.microsoft.com/office/word/2012/wordml" xmlns:w16cex="http://schemas.microsoft.com/office/word/2018/wordml/cex" xmlns:w16cid="http://schemas.microsoft.com/office/word/2016/wordml/cid" xmlns:w16="http://schemas.microsoft.com/office/word/2018/wordml" xmlns:w16du="http://schemas.microsoft.com/office/word/2023/wordml/word16du" xmlns:w16sdtdh="http://schemas.microsoft.com/office/word/2020/wordml/sdtdatahash" xmlns:w16sdtfl="http://schemas.microsoft.com/office/word/2024/wordml/sdtformatlock" xmlns:w16se="http://schemas.microsoft.com/office/word/2015/wordml/symex" xmlns:wpg="http://schemas.microsoft.com/office/word/2010/wordprocessingGroup" xmlns:wpi="http://schemas.microsoft.com/office/word/2010/wordprocessingInk" xmlns:wne="http://schemas.microsoft.com/office/word/2006/wordml" xmlns:wps="http://schemas.microsoft.com/office/word/2010/wordprocessingShape" mc:Ignorable="w14 w15 w16se w16cid w16 w16cex w16sdtdh w16sdtfl w16du wp14">
+<w:document xmlns:o="urn:schemas-microsoft-com:office:office" xmlns:r="http://schemas.openxmlformats.org/officeDocument/2006/relationships" xmlns:v="urn:schemas-microsoft-com:vml" xmlns:w="http://schemas.openxmlformats.org/wordprocessingml/2006/main" xmlns:w10="urn:schemas-microsoft-com:office:word" xmlns:wp="http://schemas.openxmlformats.org/drawingml/2006/wordprocessingDrawing" xmlns:pic="http://schemas.openxmlformats.org/drawingml/2006/picture" xmlns:wps="http://schemas.microsoft.com/office/word/2010/wordprocessingShape" xmlns:wpg="http://schemas.microsoft.com/office/word/2010/wordprocessingGroup" xmlns:mc="http://schemas.openxmlformats.org/markup-compatibility/2006" xmlns:wp14="http://schemas.microsoft.com/office/word/2010/wordprocessingDrawing" xmlns:w14="http://schemas.microsoft.com/office/word/2010/wordml" xmlns:w15="http://schemas.microsoft.com/office/word/2012/wordml" mc:Ignorable="w14 wp14 w15">
   <w:body>
     <w:sdt>
       <w:sdtPr>
-        <w:rPr>
-          <w:rFonts w:asciiTheme="minorHAnsi" w:eastAsiaTheme="minorHAnsi" w:hAnsiTheme="minorHAnsi"/>
-          <w:kern w:val="2"/>
-          <w:sz w:val="24"/>
-          <w:szCs w:val="24"/>
-          <w:lang w:eastAsia="en-US"/>
-        </w:rPr>
-        <w:id w:val="1521201587"/>
         <w:docPartObj>
           <w:docPartGallery w:val="Cover Pages"/>
-          <w:docPartUnique/>
+          <w:docPartUnique w:val="true"/>
         </w:docPartObj>
+        <w:id w:val="1521201587"/>
       </w:sdtPr>
       <w:sdtContent>
         <w:p>
@@ -24,9 +17,14 @@
             <w:spacing w:before="1540" w:after="240"/>
             <w:jc w:val="center"/>
             <w:rPr>
-              <w:color w:val="156082" w:themeColor="accent1"/>
+              <w:color w:themeColor="accent1" w:val="156082"/>
             </w:rPr>
           </w:pPr>
+          <w:r>
+            <w:rPr>
+              <w:color w:themeColor="accent1" w:val="156082"/>
+            </w:rPr>
+          </w:r>
         </w:p>
         <w:p>
           <w:pPr>
@@ -35,32 +33,41 @@
               <w:top w:val="single" w:sz="6" w:space="6" w:color="156082" w:themeColor="accent1"/>
               <w:bottom w:val="single" w:sz="6" w:space="6" w:color="156082" w:themeColor="accent1"/>
             </w:pBdr>
-            <w:spacing w:after="240"/>
+            <w:spacing w:before="0" w:after="240"/>
             <w:jc w:val="center"/>
             <w:rPr>
-              <w:rFonts w:asciiTheme="majorHAnsi" w:eastAsiaTheme="majorEastAsia" w:hAnsiTheme="majorHAnsi" w:cstheme="majorBidi"/>
+              <w:rFonts w:ascii="Aptos Display" w:hAnsi="Aptos Display" w:eastAsia="" w:cs="" w:asciiTheme="majorHAnsi" w:cstheme="majorBidi" w:eastAsiaTheme="majorEastAsia" w:hAnsiTheme="majorHAnsi"/>
               <w:caps/>
-              <w:color w:val="156082" w:themeColor="accent1"/>
+              <w:color w:themeColor="accent1" w:val="156082"/>
               <w:sz w:val="80"/>
               <w:szCs w:val="80"/>
             </w:rPr>
           </w:pPr>
           <w:sdt>
             <w:sdtPr>
-              <w:alias w:val="Titel"/>
-              <w:id w:val="1735040861"/>
               <w:placeholder>
                 <w:docPart w:val="DAAA16D931134618B18D7F13DB134449"/>
               </w:placeholder>
               <w:dataBinding w:prefixMappings="xmlns:ns0='http://purl.org/dc/elements/1.1/' xmlns:ns1='http://schemas.openxmlformats.org/package/2006/metadata/core-properties' " w:xpath="/ns1:coreProperties[1]/ns0:title[1]" w:storeItemID="{6C3C8BC8-F283-45AE-878A-BAB7291924A1}"/>
+              <w:alias w:val="Titel"/>
+              <w:id w:val="1735040861"/>
               <w:text/>
             </w:sdtPr>
             <w:sdtContent>
               <w:r>
                 <w:rPr>
-                  <w:rFonts w:asciiTheme="majorHAnsi" w:eastAsiaTheme="majorEastAsia" w:hAnsiTheme="majorHAnsi" w:cstheme="majorBidi"/>
+                  <w:rFonts w:eastAsia="" w:cs="" w:ascii="Aptos Display" w:hAnsi="Aptos Display" w:asciiTheme="majorHAnsi" w:cstheme="majorBidi" w:eastAsiaTheme="majorEastAsia" w:hAnsiTheme="majorHAnsi"/>
                   <w:caps/>
-                  <w:color w:val="156082" w:themeColor="accent1"/>
+                  <w:color w:themeColor="accent1" w:val="156082"/>
+                  <w:sz w:val="72"/>
+                  <w:szCs w:val="72"/>
+                </w:rPr>
+              </w:r>
+              <w:r>
+                <w:rPr>
+                  <w:rFonts w:eastAsia="" w:cs="" w:ascii="Aptos Display" w:hAnsi="Aptos Display" w:asciiTheme="majorHAnsi" w:cstheme="majorBidi" w:eastAsiaTheme="majorEastAsia" w:hAnsiTheme="majorHAnsi"/>
+                  <w:caps/>
+                  <w:color w:themeColor="accent1" w:val="156082"/>
                   <w:sz w:val="72"/>
                   <w:szCs w:val="72"/>
                 </w:rPr>
@@ -74,25 +81,32 @@
             <w:pStyle w:val="NoSpacing"/>
             <w:jc w:val="center"/>
             <w:rPr>
-              <w:color w:val="156082" w:themeColor="accent1"/>
+              <w:color w:themeColor="accent1" w:val="156082"/>
               <w:sz w:val="28"/>
               <w:szCs w:val="28"/>
             </w:rPr>
           </w:pPr>
           <w:sdt>
             <w:sdtPr>
-              <w:alias w:val="Untertitel"/>
-              <w:id w:val="328029620"/>
               <w:placeholder>
                 <w:docPart w:val="4BEEFB6199BE400096681AA7A0A966F7"/>
               </w:placeholder>
               <w:dataBinding w:prefixMappings="xmlns:ns0='http://purl.org/dc/elements/1.1/' xmlns:ns1='http://schemas.openxmlformats.org/package/2006/metadata/core-properties' " w:xpath="/ns1:coreProperties[1]/ns0:subject[1]" w:storeItemID="{6C3C8BC8-F283-45AE-878A-BAB7291924A1}"/>
+              <w:alias w:val="Untertitel"/>
+              <w:id w:val="328029620"/>
               <w:text/>
             </w:sdtPr>
             <w:sdtContent>
               <w:r>
                 <w:rPr>
-                  <w:color w:val="156082" w:themeColor="accent1"/>
+                  <w:color w:themeColor="accent1" w:val="156082"/>
+                  <w:sz w:val="28"/>
+                  <w:szCs w:val="28"/>
+                </w:rPr>
+              </w:r>
+              <w:r>
+                <w:rPr>
+                  <w:color w:themeColor="accent1" w:val="156082"/>
                   <w:sz w:val="28"/>
                   <w:szCs w:val="28"/>
                 </w:rPr>
@@ -104,15 +118,15 @@
         <w:p>
           <w:pPr>
             <w:pStyle w:val="NoSpacing"/>
-            <w:spacing w:before="480"/>
+            <w:spacing w:before="480" w:after="0"/>
             <w:jc w:val="center"/>
             <w:rPr>
-              <w:color w:val="156082" w:themeColor="accent1"/>
+              <w:color w:themeColor="accent1" w:val="156082"/>
             </w:rPr>
           </w:pPr>
           <w:r>
             <w:rPr>
-              <w:color w:val="156082" w:themeColor="accent1"/>
+              <w:color w:themeColor="accent1" w:val="156082"/>
               <w:sz w:val="28"/>
               <w:szCs w:val="28"/>
             </w:rPr>
@@ -120,7 +134,7 @@
           </w:r>
           <w:r>
             <w:rPr>
-              <w:color w:val="156082" w:themeColor="accent1"/>
+              <w:color w:themeColor="accent1" w:val="156082"/>
               <w:sz w:val="28"/>
               <w:szCs w:val="28"/>
               <w:lang w:val="en-US"/>
@@ -131,39 +145,34 @@
         <w:p>
           <w:pPr>
             <w:pStyle w:val="NoSpacing"/>
-            <w:spacing w:before="480"/>
+            <w:spacing w:before="480" w:after="0"/>
             <w:jc w:val="center"/>
             <w:rPr>
-              <w:color w:val="156082" w:themeColor="accent1"/>
+              <w:color w:themeColor="accent1" w:val="156082"/>
             </w:rPr>
           </w:pPr>
+          <w:r>
+            <w:rPr>
+              <w:color w:themeColor="accent1" w:val="156082"/>
+            </w:rPr>
+          </w:r>
         </w:p>
         <w:p>
           <w:pPr>
             <w:pStyle w:val="NoSpacing"/>
-            <w:spacing w:before="480"/>
+            <w:spacing w:before="480" w:after="0"/>
             <w:jc w:val="center"/>
             <w:rPr>
-              <w:color w:val="156082" w:themeColor="accent1"/>
+              <w:color w:themeColor="accent1" w:val="156082"/>
             </w:rPr>
           </w:pPr>
           <w:r>
             <w:rPr>
-              <w:color w:val="156082" w:themeColor="accent1"/>
+              <w:color w:themeColor="accent1" w:val="156082"/>
             </w:rPr>
             <w:t>Vincent Knapp</w:t>
-          </w:r>
-          <w:r>
-            <w:rPr>
-              <w:color w:val="156082" w:themeColor="accent1"/>
-            </w:rPr>
             <w:br/>
             <w:t>Benedek Kovacs</w:t>
-          </w:r>
-          <w:r>
-            <w:rPr>
-              <w:color w:val="156082" w:themeColor="accent1"/>
-            </w:rPr>
             <w:br/>
             <w:t>Luise Münchgesang</w:t>
           </w:r>
@@ -171,40 +180,68 @@
         <w:p>
           <w:pPr>
             <w:pStyle w:val="NoSpacing"/>
-            <w:spacing w:before="480"/>
+            <w:spacing w:before="480" w:after="0"/>
             <w:jc w:val="center"/>
             <w:rPr>
-              <w:color w:val="156082" w:themeColor="accent1"/>
+              <w:color w:themeColor="accent1" w:val="156082"/>
             </w:rPr>
           </w:pPr>
+          <w:r>
+            <w:rPr>
+              <w:color w:themeColor="accent1" w:val="156082"/>
+            </w:rPr>
+          </w:r>
           <w:r>
             <w:br w:type="page"/>
           </w:r>
         </w:p>
-        <w:p/>
+        <w:p>
+          <w:pPr>
+            <w:pStyle w:val="Normal"/>
+            <w:spacing w:before="0" w:after="160"/>
+            <w:rPr/>
+          </w:pPr>
+          <w:r>
+            <w:rPr/>
+          </w:r>
+        </w:p>
       </w:sdtContent>
     </w:sdt>
     <w:tbl>
       <w:tblPr>
         <w:tblStyle w:val="TableGrid"/>
         <w:tblW w:w="9062" w:type="dxa"/>
+        <w:jc w:val="left"/>
+        <w:tblInd w:w="0" w:type="dxa"/>
         <w:tblLayout w:type="fixed"/>
-        <w:tblLook w:val="04A0" w:firstRow="1" w:lastRow="0" w:firstColumn="1" w:lastColumn="0" w:noHBand="0" w:noVBand="1"/>
+        <w:tblCellMar>
+          <w:top w:w="0" w:type="dxa"/>
+          <w:left w:w="108" w:type="dxa"/>
+          <w:bottom w:w="0" w:type="dxa"/>
+          <w:right w:w="108" w:type="dxa"/>
+        </w:tblCellMar>
+        <w:tblLook w:firstRow="1" w:noVBand="1" w:lastRow="0" w:firstColumn="1" w:lastColumn="0" w:noHBand="0" w:val="04a0"/>
       </w:tblPr>
       <w:tblGrid>
         <w:gridCol w:w="1526"/>
-        <w:gridCol w:w="3006"/>
+        <w:gridCol w:w="3005"/>
         <w:gridCol w:w="2551"/>
         <w:gridCol w:w="1979"/>
       </w:tblGrid>
       <w:tr>
+        <w:trPr/>
         <w:tc>
           <w:tcPr>
             <w:tcW w:w="1526" w:type="dxa"/>
-          </w:tcPr>
-          <w:p>
-            <w:pPr>
-              <w:spacing w:after="0" w:line="240" w:lineRule="auto"/>
+            <w:tcBorders/>
+          </w:tcPr>
+          <w:p>
+            <w:pPr>
+              <w:pStyle w:val="Normal"/>
+              <w:widowControl/>
+              <w:suppressAutoHyphens w:val="true"/>
+              <w:spacing w:lineRule="auto" w:line="240" w:before="0" w:after="0"/>
+              <w:jc w:val="left"/>
               <w:rPr>
                 <w:b/>
                 <w:bCs/>
@@ -212,9 +249,13 @@
             </w:pPr>
             <w:r>
               <w:rPr>
-                <w:rFonts w:eastAsia="Aptos"/>
+                <w:rFonts w:eastAsia="Aptos" w:cs=""/>
                 <w:b/>
                 <w:bCs/>
+                <w:kern w:val="2"/>
+                <w:sz w:val="24"/>
+                <w:szCs w:val="24"/>
+                <w:lang w:val="de-DE" w:eastAsia="en-US" w:bidi="ar-SA"/>
               </w:rPr>
               <w:t>Datum</w:t>
             </w:r>
@@ -222,11 +263,16 @@
         </w:tc>
         <w:tc>
           <w:tcPr>
-            <w:tcW w:w="3006" w:type="dxa"/>
-          </w:tcPr>
-          <w:p>
-            <w:pPr>
-              <w:spacing w:after="0" w:line="240" w:lineRule="auto"/>
+            <w:tcW w:w="3005" w:type="dxa"/>
+            <w:tcBorders/>
+          </w:tcPr>
+          <w:p>
+            <w:pPr>
+              <w:pStyle w:val="Normal"/>
+              <w:widowControl/>
+              <w:suppressAutoHyphens w:val="true"/>
+              <w:spacing w:lineRule="auto" w:line="240" w:before="0" w:after="0"/>
+              <w:jc w:val="left"/>
               <w:rPr>
                 <w:b/>
                 <w:bCs/>
@@ -234,9 +280,13 @@
             </w:pPr>
             <w:r>
               <w:rPr>
-                <w:rFonts w:eastAsia="Aptos"/>
+                <w:rFonts w:eastAsia="Aptos" w:cs=""/>
                 <w:b/>
                 <w:bCs/>
+                <w:kern w:val="2"/>
+                <w:sz w:val="24"/>
+                <w:szCs w:val="24"/>
+                <w:lang w:val="de-DE" w:eastAsia="en-US" w:bidi="ar-SA"/>
               </w:rPr>
               <w:t>Design-Änderung</w:t>
             </w:r>
@@ -245,10 +295,15 @@
         <w:tc>
           <w:tcPr>
             <w:tcW w:w="2551" w:type="dxa"/>
-          </w:tcPr>
-          <w:p>
-            <w:pPr>
-              <w:spacing w:after="0" w:line="240" w:lineRule="auto"/>
+            <w:tcBorders/>
+          </w:tcPr>
+          <w:p>
+            <w:pPr>
+              <w:pStyle w:val="Normal"/>
+              <w:widowControl/>
+              <w:suppressAutoHyphens w:val="true"/>
+              <w:spacing w:lineRule="auto" w:line="240" w:before="0" w:after="0"/>
+              <w:jc w:val="left"/>
               <w:rPr>
                 <w:b/>
                 <w:bCs/>
@@ -256,9 +311,13 @@
             </w:pPr>
             <w:r>
               <w:rPr>
-                <w:rFonts w:eastAsia="Aptos"/>
+                <w:rFonts w:eastAsia="Aptos" w:cs=""/>
                 <w:b/>
                 <w:bCs/>
+                <w:kern w:val="2"/>
+                <w:sz w:val="24"/>
+                <w:szCs w:val="24"/>
+                <w:lang w:val="de-DE" w:eastAsia="en-US" w:bidi="ar-SA"/>
               </w:rPr>
               <w:t>Grund für Änderung</w:t>
             </w:r>
@@ -267,10 +326,15 @@
         <w:tc>
           <w:tcPr>
             <w:tcW w:w="1979" w:type="dxa"/>
-          </w:tcPr>
-          <w:p>
-            <w:pPr>
-              <w:spacing w:after="0" w:line="240" w:lineRule="auto"/>
+            <w:tcBorders/>
+          </w:tcPr>
+          <w:p>
+            <w:pPr>
+              <w:pStyle w:val="Normal"/>
+              <w:widowControl/>
+              <w:suppressAutoHyphens w:val="true"/>
+              <w:spacing w:lineRule="auto" w:line="240" w:before="0" w:after="0"/>
+              <w:jc w:val="left"/>
               <w:rPr>
                 <w:b/>
                 <w:bCs/>
@@ -278,9 +342,13 @@
             </w:pPr>
             <w:r>
               <w:rPr>
-                <w:rFonts w:eastAsia="Aptos"/>
+                <w:rFonts w:eastAsia="Aptos" w:cs=""/>
                 <w:b/>
                 <w:bCs/>
+                <w:kern w:val="2"/>
+                <w:sz w:val="24"/>
+                <w:szCs w:val="24"/>
+                <w:lang w:val="de-DE" w:eastAsia="en-US" w:bidi="ar-SA"/>
               </w:rPr>
               <w:t>Mitglied</w:t>
             </w:r>
@@ -288,20 +356,30 @@
         </w:tc>
       </w:tr>
       <w:tr>
+        <w:trPr/>
         <w:tc>
           <w:tcPr>
             <w:tcW w:w="1526" w:type="dxa"/>
-          </w:tcPr>
-          <w:p>
-            <w:pPr>
-              <w:spacing w:after="0" w:line="240" w:lineRule="auto"/>
-              <w:rPr>
-                <w:rFonts w:ascii="Aptos" w:eastAsia="Aptos" w:hAnsi="Aptos"/>
-              </w:rPr>
-            </w:pPr>
-            <w:r>
-              <w:rPr>
-                <w:rFonts w:eastAsia="Aptos"/>
+            <w:tcBorders/>
+          </w:tcPr>
+          <w:p>
+            <w:pPr>
+              <w:pStyle w:val="Normal"/>
+              <w:widowControl/>
+              <w:suppressAutoHyphens w:val="true"/>
+              <w:spacing w:lineRule="auto" w:line="240" w:before="0" w:after="0"/>
+              <w:jc w:val="left"/>
+              <w:rPr>
+                <w:rFonts w:ascii="Aptos" w:hAnsi="Aptos" w:eastAsia="Aptos"/>
+              </w:rPr>
+            </w:pPr>
+            <w:r>
+              <w:rPr>
+                <w:rFonts w:eastAsia="Aptos" w:cs="" w:ascii="Aptos" w:hAnsi="Aptos"/>
+                <w:kern w:val="2"/>
+                <w:sz w:val="24"/>
+                <w:szCs w:val="24"/>
+                <w:lang w:val="de-DE" w:eastAsia="en-US" w:bidi="ar-SA"/>
               </w:rPr>
               <w:t>21.04.2026</w:t>
             </w:r>
@@ -309,18 +387,27 @@
         </w:tc>
         <w:tc>
           <w:tcPr>
-            <w:tcW w:w="3006" w:type="dxa"/>
-          </w:tcPr>
-          <w:p>
-            <w:pPr>
-              <w:spacing w:after="0" w:line="240" w:lineRule="auto"/>
-              <w:rPr>
-                <w:rFonts w:ascii="Aptos" w:eastAsia="Aptos" w:hAnsi="Aptos"/>
-              </w:rPr>
-            </w:pPr>
-            <w:r>
-              <w:rPr>
-                <w:rFonts w:eastAsia="Aptos"/>
+            <w:tcW w:w="3005" w:type="dxa"/>
+            <w:tcBorders/>
+          </w:tcPr>
+          <w:p>
+            <w:pPr>
+              <w:pStyle w:val="Normal"/>
+              <w:widowControl/>
+              <w:suppressAutoHyphens w:val="true"/>
+              <w:spacing w:lineRule="auto" w:line="240" w:before="0" w:after="0"/>
+              <w:jc w:val="left"/>
+              <w:rPr>
+                <w:rFonts w:ascii="Aptos" w:hAnsi="Aptos" w:eastAsia="Aptos"/>
+              </w:rPr>
+            </w:pPr>
+            <w:r>
+              <w:rPr>
+                <w:rFonts w:eastAsia="Aptos" w:cs="" w:ascii="Aptos" w:hAnsi="Aptos"/>
+                <w:kern w:val="2"/>
+                <w:sz w:val="24"/>
+                <w:szCs w:val="24"/>
+                <w:lang w:val="de-DE" w:eastAsia="en-US" w:bidi="ar-SA"/>
               </w:rPr>
               <w:t>Banane wächst, bevor sie fällt</w:t>
             </w:r>
@@ -329,17 +416,26 @@
         <w:tc>
           <w:tcPr>
             <w:tcW w:w="2551" w:type="dxa"/>
-          </w:tcPr>
-          <w:p>
-            <w:pPr>
-              <w:spacing w:after="0" w:line="240" w:lineRule="auto"/>
-              <w:rPr>
-                <w:rFonts w:ascii="Aptos" w:eastAsia="Aptos" w:hAnsi="Aptos"/>
-              </w:rPr>
-            </w:pPr>
-            <w:r>
-              <w:rPr>
-                <w:rFonts w:eastAsia="Aptos"/>
+            <w:tcBorders/>
+          </w:tcPr>
+          <w:p>
+            <w:pPr>
+              <w:pStyle w:val="Normal"/>
+              <w:widowControl/>
+              <w:suppressAutoHyphens w:val="true"/>
+              <w:spacing w:lineRule="auto" w:line="240" w:before="0" w:after="0"/>
+              <w:jc w:val="left"/>
+              <w:rPr>
+                <w:rFonts w:ascii="Aptos" w:hAnsi="Aptos" w:eastAsia="Aptos"/>
+              </w:rPr>
+            </w:pPr>
+            <w:r>
+              <w:rPr>
+                <w:rFonts w:eastAsia="Aptos" w:cs="" w:ascii="Aptos" w:hAnsi="Aptos"/>
+                <w:kern w:val="2"/>
+                <w:sz w:val="24"/>
+                <w:szCs w:val="24"/>
+                <w:lang w:val="de-DE" w:eastAsia="en-US" w:bidi="ar-SA"/>
               </w:rPr>
               <w:t>Bietet dem Spieler mehr Reaktionszeit</w:t>
             </w:r>
@@ -348,17 +444,26 @@
         <w:tc>
           <w:tcPr>
             <w:tcW w:w="1979" w:type="dxa"/>
-          </w:tcPr>
-          <w:p>
-            <w:pPr>
-              <w:spacing w:after="0" w:line="240" w:lineRule="auto"/>
-              <w:rPr>
-                <w:rFonts w:ascii="Aptos" w:eastAsia="Aptos" w:hAnsi="Aptos"/>
-              </w:rPr>
-            </w:pPr>
-            <w:r>
-              <w:rPr>
-                <w:rFonts w:eastAsia="Aptos"/>
+            <w:tcBorders/>
+          </w:tcPr>
+          <w:p>
+            <w:pPr>
+              <w:pStyle w:val="Normal"/>
+              <w:widowControl/>
+              <w:suppressAutoHyphens w:val="true"/>
+              <w:spacing w:lineRule="auto" w:line="240" w:before="0" w:after="0"/>
+              <w:jc w:val="left"/>
+              <w:rPr>
+                <w:rFonts w:ascii="Aptos" w:hAnsi="Aptos" w:eastAsia="Aptos"/>
+              </w:rPr>
+            </w:pPr>
+            <w:r>
+              <w:rPr>
+                <w:rFonts w:eastAsia="Aptos" w:cs="" w:ascii="Aptos" w:hAnsi="Aptos"/>
+                <w:kern w:val="2"/>
+                <w:sz w:val="24"/>
+                <w:szCs w:val="24"/>
+                <w:lang w:val="de-DE" w:eastAsia="en-US" w:bidi="ar-SA"/>
               </w:rPr>
               <w:t>Vincent Knapp</w:t>
             </w:r>
@@ -366,20 +471,30 @@
         </w:tc>
       </w:tr>
       <w:tr>
+        <w:trPr/>
         <w:tc>
           <w:tcPr>
             <w:tcW w:w="1526" w:type="dxa"/>
-          </w:tcPr>
-          <w:p>
-            <w:pPr>
-              <w:spacing w:after="0" w:line="240" w:lineRule="auto"/>
-              <w:rPr>
-                <w:rFonts w:ascii="Aptos" w:eastAsia="Aptos" w:hAnsi="Aptos"/>
-              </w:rPr>
-            </w:pPr>
-            <w:r>
-              <w:rPr>
-                <w:rFonts w:eastAsia="Aptos"/>
+            <w:tcBorders/>
+          </w:tcPr>
+          <w:p>
+            <w:pPr>
+              <w:pStyle w:val="Normal"/>
+              <w:widowControl/>
+              <w:suppressAutoHyphens w:val="true"/>
+              <w:spacing w:lineRule="auto" w:line="240" w:before="0" w:after="0"/>
+              <w:jc w:val="left"/>
+              <w:rPr>
+                <w:rFonts w:ascii="Aptos" w:hAnsi="Aptos" w:eastAsia="Aptos"/>
+              </w:rPr>
+            </w:pPr>
+            <w:r>
+              <w:rPr>
+                <w:rFonts w:eastAsia="Aptos" w:cs="" w:ascii="Aptos" w:hAnsi="Aptos"/>
+                <w:kern w:val="2"/>
+                <w:sz w:val="24"/>
+                <w:szCs w:val="24"/>
+                <w:lang w:val="de-DE" w:eastAsia="en-US" w:bidi="ar-SA"/>
               </w:rPr>
               <w:t>21.04.2026</w:t>
             </w:r>
@@ -387,18 +502,27 @@
         </w:tc>
         <w:tc>
           <w:tcPr>
-            <w:tcW w:w="3006" w:type="dxa"/>
-          </w:tcPr>
-          <w:p>
-            <w:pPr>
-              <w:spacing w:after="0" w:line="240" w:lineRule="auto"/>
-              <w:rPr>
-                <w:rFonts w:ascii="Aptos" w:eastAsia="Aptos" w:hAnsi="Aptos"/>
-              </w:rPr>
-            </w:pPr>
-            <w:r>
-              <w:rPr>
-                <w:rFonts w:eastAsia="Aptos"/>
+            <w:tcW w:w="3005" w:type="dxa"/>
+            <w:tcBorders/>
+          </w:tcPr>
+          <w:p>
+            <w:pPr>
+              <w:pStyle w:val="Normal"/>
+              <w:widowControl/>
+              <w:suppressAutoHyphens w:val="true"/>
+              <w:spacing w:lineRule="auto" w:line="240" w:before="0" w:after="0"/>
+              <w:jc w:val="left"/>
+              <w:rPr>
+                <w:rFonts w:ascii="Aptos" w:hAnsi="Aptos" w:eastAsia="Aptos"/>
+              </w:rPr>
+            </w:pPr>
+            <w:r>
+              <w:rPr>
+                <w:rFonts w:eastAsia="Aptos" w:cs="" w:ascii="Aptos" w:hAnsi="Aptos"/>
+                <w:kern w:val="2"/>
+                <w:sz w:val="24"/>
+                <w:szCs w:val="24"/>
+                <w:lang w:val="de-DE" w:eastAsia="en-US" w:bidi="ar-SA"/>
               </w:rPr>
               <w:t>Anzahl Objekt (Wincondition) pro Schwierigkeit angepasst</w:t>
             </w:r>
@@ -407,17 +531,26 @@
         <w:tc>
           <w:tcPr>
             <w:tcW w:w="2551" w:type="dxa"/>
-          </w:tcPr>
-          <w:p>
-            <w:pPr>
-              <w:spacing w:after="0" w:line="240" w:lineRule="auto"/>
-              <w:rPr>
-                <w:rFonts w:ascii="Aptos" w:eastAsia="Aptos" w:hAnsi="Aptos"/>
-              </w:rPr>
-            </w:pPr>
-            <w:r>
-              <w:rPr>
-                <w:rFonts w:eastAsia="Aptos"/>
+            <w:tcBorders/>
+          </w:tcPr>
+          <w:p>
+            <w:pPr>
+              <w:pStyle w:val="Normal"/>
+              <w:widowControl/>
+              <w:suppressAutoHyphens w:val="true"/>
+              <w:spacing w:lineRule="auto" w:line="240" w:before="0" w:after="0"/>
+              <w:jc w:val="left"/>
+              <w:rPr>
+                <w:rFonts w:ascii="Aptos" w:hAnsi="Aptos" w:eastAsia="Aptos"/>
+              </w:rPr>
+            </w:pPr>
+            <w:r>
+              <w:rPr>
+                <w:rFonts w:eastAsia="Aptos" w:cs="" w:ascii="Aptos" w:hAnsi="Aptos"/>
+                <w:kern w:val="2"/>
+                <w:sz w:val="24"/>
+                <w:szCs w:val="24"/>
+                <w:lang w:val="de-DE" w:eastAsia="en-US" w:bidi="ar-SA"/>
               </w:rPr>
               <w:t>Schnelleres Erfolgserlebnis bei einfacher Schwierigkeit</w:t>
             </w:r>
@@ -426,17 +559,26 @@
         <w:tc>
           <w:tcPr>
             <w:tcW w:w="1979" w:type="dxa"/>
-          </w:tcPr>
-          <w:p>
-            <w:pPr>
-              <w:spacing w:after="0" w:line="240" w:lineRule="auto"/>
-              <w:rPr>
-                <w:rFonts w:ascii="Aptos" w:eastAsia="Aptos" w:hAnsi="Aptos"/>
-              </w:rPr>
-            </w:pPr>
-            <w:r>
-              <w:rPr>
-                <w:rFonts w:eastAsia="Aptos"/>
+            <w:tcBorders/>
+          </w:tcPr>
+          <w:p>
+            <w:pPr>
+              <w:pStyle w:val="Normal"/>
+              <w:widowControl/>
+              <w:suppressAutoHyphens w:val="true"/>
+              <w:spacing w:lineRule="auto" w:line="240" w:before="0" w:after="0"/>
+              <w:jc w:val="left"/>
+              <w:rPr>
+                <w:rFonts w:ascii="Aptos" w:hAnsi="Aptos" w:eastAsia="Aptos"/>
+              </w:rPr>
+            </w:pPr>
+            <w:r>
+              <w:rPr>
+                <w:rFonts w:eastAsia="Aptos" w:cs="" w:ascii="Aptos" w:hAnsi="Aptos"/>
+                <w:kern w:val="2"/>
+                <w:sz w:val="24"/>
+                <w:szCs w:val="24"/>
+                <w:lang w:val="de-DE" w:eastAsia="en-US" w:bidi="ar-SA"/>
               </w:rPr>
               <w:t>Vincent Knapp</w:t>
             </w:r>
@@ -444,20 +586,30 @@
         </w:tc>
       </w:tr>
       <w:tr>
+        <w:trPr/>
         <w:tc>
           <w:tcPr>
             <w:tcW w:w="1526" w:type="dxa"/>
-          </w:tcPr>
-          <w:p>
-            <w:pPr>
-              <w:spacing w:after="0" w:line="240" w:lineRule="auto"/>
-              <w:rPr>
-                <w:rFonts w:ascii="Aptos" w:eastAsia="Aptos" w:hAnsi="Aptos"/>
-              </w:rPr>
-            </w:pPr>
-            <w:r>
-              <w:rPr>
-                <w:rFonts w:eastAsia="Aptos"/>
+            <w:tcBorders/>
+          </w:tcPr>
+          <w:p>
+            <w:pPr>
+              <w:pStyle w:val="Normal"/>
+              <w:widowControl/>
+              <w:suppressAutoHyphens w:val="true"/>
+              <w:spacing w:lineRule="auto" w:line="240" w:before="0" w:after="0"/>
+              <w:jc w:val="left"/>
+              <w:rPr>
+                <w:rFonts w:ascii="Aptos" w:hAnsi="Aptos" w:eastAsia="Aptos"/>
+              </w:rPr>
+            </w:pPr>
+            <w:r>
+              <w:rPr>
+                <w:rFonts w:eastAsia="Aptos" w:cs="" w:ascii="Aptos" w:hAnsi="Aptos"/>
+                <w:kern w:val="2"/>
+                <w:sz w:val="24"/>
+                <w:szCs w:val="24"/>
+                <w:lang w:val="de-DE" w:eastAsia="en-US" w:bidi="ar-SA"/>
               </w:rPr>
               <w:t>22.04.2026</w:t>
             </w:r>
@@ -465,18 +617,27 @@
         </w:tc>
         <w:tc>
           <w:tcPr>
-            <w:tcW w:w="3006" w:type="dxa"/>
-          </w:tcPr>
-          <w:p>
-            <w:pPr>
-              <w:spacing w:after="0" w:line="240" w:lineRule="auto"/>
-              <w:rPr>
-                <w:rFonts w:ascii="Aptos" w:eastAsia="Aptos" w:hAnsi="Aptos"/>
-              </w:rPr>
-            </w:pPr>
-            <w:r>
-              <w:rPr>
-                <w:rFonts w:eastAsia="Aptos"/>
+            <w:tcW w:w="3005" w:type="dxa"/>
+            <w:tcBorders/>
+          </w:tcPr>
+          <w:p>
+            <w:pPr>
+              <w:pStyle w:val="Normal"/>
+              <w:widowControl/>
+              <w:suppressAutoHyphens w:val="true"/>
+              <w:spacing w:lineRule="auto" w:line="240" w:before="0" w:after="0"/>
+              <w:jc w:val="left"/>
+              <w:rPr>
+                <w:rFonts w:ascii="Aptos" w:hAnsi="Aptos" w:eastAsia="Aptos"/>
+              </w:rPr>
+            </w:pPr>
+            <w:r>
+              <w:rPr>
+                <w:rFonts w:eastAsia="Aptos" w:cs="" w:ascii="Aptos" w:hAnsi="Aptos"/>
+                <w:kern w:val="2"/>
+                <w:sz w:val="24"/>
+                <w:szCs w:val="24"/>
+                <w:lang w:val="de-DE" w:eastAsia="en-US" w:bidi="ar-SA"/>
               </w:rPr>
               <w:t>Anzahl benötigte Früchte für Saft-Produktion auf 3 erhöht</w:t>
             </w:r>
@@ -485,17 +646,26 @@
         <w:tc>
           <w:tcPr>
             <w:tcW w:w="2551" w:type="dxa"/>
-          </w:tcPr>
-          <w:p>
-            <w:pPr>
-              <w:spacing w:after="0" w:line="240" w:lineRule="auto"/>
-              <w:rPr>
-                <w:rFonts w:ascii="Aptos" w:eastAsia="Aptos" w:hAnsi="Aptos"/>
-              </w:rPr>
-            </w:pPr>
-            <w:r>
-              <w:rPr>
-                <w:rFonts w:eastAsia="Aptos"/>
+            <w:tcBorders/>
+          </w:tcPr>
+          <w:p>
+            <w:pPr>
+              <w:pStyle w:val="Normal"/>
+              <w:widowControl/>
+              <w:suppressAutoHyphens w:val="true"/>
+              <w:spacing w:lineRule="auto" w:line="240" w:before="0" w:after="0"/>
+              <w:jc w:val="left"/>
+              <w:rPr>
+                <w:rFonts w:ascii="Aptos" w:hAnsi="Aptos" w:eastAsia="Aptos"/>
+              </w:rPr>
+            </w:pPr>
+            <w:r>
+              <w:rPr>
+                <w:rFonts w:eastAsia="Aptos" w:cs="" w:ascii="Aptos" w:hAnsi="Aptos"/>
+                <w:kern w:val="2"/>
+                <w:sz w:val="24"/>
+                <w:szCs w:val="24"/>
+                <w:lang w:val="de-DE" w:eastAsia="en-US" w:bidi="ar-SA"/>
               </w:rPr>
               <w:t>Komplexität. Zusätzlich bietet es Grundlage für Erweiterung durch Fruchtvariationen</w:t>
             </w:r>
@@ -504,17 +674,26 @@
         <w:tc>
           <w:tcPr>
             <w:tcW w:w="1979" w:type="dxa"/>
-          </w:tcPr>
-          <w:p>
-            <w:pPr>
-              <w:spacing w:after="0" w:line="240" w:lineRule="auto"/>
-              <w:rPr>
-                <w:rFonts w:ascii="Aptos" w:eastAsia="Aptos" w:hAnsi="Aptos"/>
-              </w:rPr>
-            </w:pPr>
-            <w:r>
-              <w:rPr>
-                <w:rFonts w:eastAsia="Aptos"/>
+            <w:tcBorders/>
+          </w:tcPr>
+          <w:p>
+            <w:pPr>
+              <w:pStyle w:val="Normal"/>
+              <w:widowControl/>
+              <w:suppressAutoHyphens w:val="true"/>
+              <w:spacing w:lineRule="auto" w:line="240" w:before="0" w:after="0"/>
+              <w:jc w:val="left"/>
+              <w:rPr>
+                <w:rFonts w:ascii="Aptos" w:hAnsi="Aptos" w:eastAsia="Aptos"/>
+              </w:rPr>
+            </w:pPr>
+            <w:r>
+              <w:rPr>
+                <w:rFonts w:eastAsia="Aptos" w:cs="" w:ascii="Aptos" w:hAnsi="Aptos"/>
+                <w:kern w:val="2"/>
+                <w:sz w:val="24"/>
+                <w:szCs w:val="24"/>
+                <w:lang w:val="de-DE" w:eastAsia="en-US" w:bidi="ar-SA"/>
               </w:rPr>
               <w:t>Vincent Knapp</w:t>
             </w:r>
@@ -522,20 +701,30 @@
         </w:tc>
       </w:tr>
       <w:tr>
+        <w:trPr/>
         <w:tc>
           <w:tcPr>
             <w:tcW w:w="1526" w:type="dxa"/>
-          </w:tcPr>
-          <w:p>
-            <w:pPr>
-              <w:spacing w:after="0" w:line="240" w:lineRule="auto"/>
-              <w:rPr>
-                <w:rFonts w:ascii="Aptos" w:eastAsia="Aptos" w:hAnsi="Aptos"/>
-              </w:rPr>
-            </w:pPr>
-            <w:r>
-              <w:rPr>
-                <w:rFonts w:eastAsia="Aptos"/>
+            <w:tcBorders/>
+          </w:tcPr>
+          <w:p>
+            <w:pPr>
+              <w:pStyle w:val="Normal"/>
+              <w:widowControl/>
+              <w:suppressAutoHyphens w:val="true"/>
+              <w:spacing w:lineRule="auto" w:line="240" w:before="0" w:after="0"/>
+              <w:jc w:val="left"/>
+              <w:rPr>
+                <w:rFonts w:ascii="Aptos" w:hAnsi="Aptos" w:eastAsia="Aptos"/>
+              </w:rPr>
+            </w:pPr>
+            <w:r>
+              <w:rPr>
+                <w:rFonts w:eastAsia="Aptos" w:cs="" w:ascii="Aptos" w:hAnsi="Aptos"/>
+                <w:kern w:val="2"/>
+                <w:sz w:val="24"/>
+                <w:szCs w:val="24"/>
+                <w:lang w:val="de-DE" w:eastAsia="en-US" w:bidi="ar-SA"/>
               </w:rPr>
               <w:t>23.04.2026</w:t>
             </w:r>
@@ -543,18 +732,27 @@
         </w:tc>
         <w:tc>
           <w:tcPr>
-            <w:tcW w:w="3006" w:type="dxa"/>
-          </w:tcPr>
-          <w:p>
-            <w:pPr>
-              <w:spacing w:after="0" w:line="240" w:lineRule="auto"/>
-              <w:rPr>
-                <w:rFonts w:ascii="Aptos" w:eastAsia="Aptos" w:hAnsi="Aptos"/>
-              </w:rPr>
-            </w:pPr>
-            <w:r>
-              <w:rPr>
-                <w:rFonts w:eastAsia="Aptos"/>
+            <w:tcW w:w="3005" w:type="dxa"/>
+            <w:tcBorders/>
+          </w:tcPr>
+          <w:p>
+            <w:pPr>
+              <w:pStyle w:val="Normal"/>
+              <w:widowControl/>
+              <w:suppressAutoHyphens w:val="true"/>
+              <w:spacing w:lineRule="auto" w:line="240" w:before="0" w:after="0"/>
+              <w:jc w:val="left"/>
+              <w:rPr>
+                <w:rFonts w:ascii="Aptos" w:hAnsi="Aptos" w:eastAsia="Aptos"/>
+              </w:rPr>
+            </w:pPr>
+            <w:r>
+              <w:rPr>
+                <w:rFonts w:eastAsia="Aptos" w:cs="" w:ascii="Aptos" w:hAnsi="Aptos"/>
+                <w:kern w:val="2"/>
+                <w:sz w:val="24"/>
+                <w:szCs w:val="24"/>
+                <w:lang w:val="de-DE" w:eastAsia="en-US" w:bidi="ar-SA"/>
               </w:rPr>
               <w:t>Spieler kann sich während Interaktionen bewegen</w:t>
             </w:r>
@@ -563,17 +761,26 @@
         <w:tc>
           <w:tcPr>
             <w:tcW w:w="2551" w:type="dxa"/>
-          </w:tcPr>
-          <w:p>
-            <w:pPr>
-              <w:spacing w:after="0" w:line="240" w:lineRule="auto"/>
-              <w:rPr>
-                <w:rFonts w:ascii="Aptos" w:eastAsia="Aptos" w:hAnsi="Aptos"/>
-              </w:rPr>
-            </w:pPr>
-            <w:r>
-              <w:rPr>
-                <w:rFonts w:eastAsia="Aptos"/>
+            <w:tcBorders/>
+          </w:tcPr>
+          <w:p>
+            <w:pPr>
+              <w:pStyle w:val="Normal"/>
+              <w:widowControl/>
+              <w:suppressAutoHyphens w:val="true"/>
+              <w:spacing w:lineRule="auto" w:line="240" w:before="0" w:after="0"/>
+              <w:jc w:val="left"/>
+              <w:rPr>
+                <w:rFonts w:ascii="Aptos" w:hAnsi="Aptos" w:eastAsia="Aptos"/>
+              </w:rPr>
+            </w:pPr>
+            <w:r>
+              <w:rPr>
+                <w:rFonts w:eastAsia="Aptos" w:cs="" w:ascii="Aptos" w:hAnsi="Aptos"/>
+                <w:kern w:val="2"/>
+                <w:sz w:val="24"/>
+                <w:szCs w:val="24"/>
+                <w:lang w:val="de-DE" w:eastAsia="en-US" w:bidi="ar-SA"/>
               </w:rPr>
               <w:t>Spielfluss. Der Spieler möchte sich während Interaktionen bewegen können.</w:t>
             </w:r>
@@ -582,17 +789,26 @@
         <w:tc>
           <w:tcPr>
             <w:tcW w:w="1979" w:type="dxa"/>
-          </w:tcPr>
-          <w:p>
-            <w:pPr>
-              <w:spacing w:after="0" w:line="240" w:lineRule="auto"/>
-              <w:rPr>
-                <w:rFonts w:ascii="Aptos" w:eastAsia="Aptos" w:hAnsi="Aptos"/>
-              </w:rPr>
-            </w:pPr>
-            <w:r>
-              <w:rPr>
-                <w:rFonts w:eastAsia="Aptos"/>
+            <w:tcBorders/>
+          </w:tcPr>
+          <w:p>
+            <w:pPr>
+              <w:pStyle w:val="Normal"/>
+              <w:widowControl/>
+              <w:suppressAutoHyphens w:val="true"/>
+              <w:spacing w:lineRule="auto" w:line="240" w:before="0" w:after="0"/>
+              <w:jc w:val="left"/>
+              <w:rPr>
+                <w:rFonts w:ascii="Aptos" w:hAnsi="Aptos" w:eastAsia="Aptos"/>
+              </w:rPr>
+            </w:pPr>
+            <w:r>
+              <w:rPr>
+                <w:rFonts w:eastAsia="Aptos" w:cs="" w:ascii="Aptos" w:hAnsi="Aptos"/>
+                <w:kern w:val="2"/>
+                <w:sz w:val="24"/>
+                <w:szCs w:val="24"/>
+                <w:lang w:val="de-DE" w:eastAsia="en-US" w:bidi="ar-SA"/>
               </w:rPr>
               <w:t>Luise Münchgesang</w:t>
             </w:r>
@@ -600,20 +816,30 @@
         </w:tc>
       </w:tr>
       <w:tr>
+        <w:trPr/>
         <w:tc>
           <w:tcPr>
             <w:tcW w:w="1526" w:type="dxa"/>
-          </w:tcPr>
-          <w:p>
-            <w:pPr>
-              <w:spacing w:after="0" w:line="240" w:lineRule="auto"/>
-              <w:rPr>
-                <w:rFonts w:eastAsia="Aptos"/>
-              </w:rPr>
-            </w:pPr>
-            <w:r>
-              <w:rPr>
-                <w:rFonts w:eastAsia="Aptos"/>
+            <w:tcBorders/>
+          </w:tcPr>
+          <w:p>
+            <w:pPr>
+              <w:pStyle w:val="Normal"/>
+              <w:widowControl/>
+              <w:suppressAutoHyphens w:val="true"/>
+              <w:spacing w:lineRule="auto" w:line="240" w:before="0" w:after="0"/>
+              <w:jc w:val="left"/>
+              <w:rPr>
+                <w:rFonts w:eastAsia="Aptos"/>
+              </w:rPr>
+            </w:pPr>
+            <w:r>
+              <w:rPr>
+                <w:rFonts w:eastAsia="Aptos" w:cs=""/>
+                <w:kern w:val="2"/>
+                <w:sz w:val="24"/>
+                <w:szCs w:val="24"/>
+                <w:lang w:val="de-DE" w:eastAsia="en-US" w:bidi="ar-SA"/>
               </w:rPr>
               <w:t>25.04.2026</w:t>
             </w:r>
@@ -621,18 +847,27 @@
         </w:tc>
         <w:tc>
           <w:tcPr>
-            <w:tcW w:w="3006" w:type="dxa"/>
-          </w:tcPr>
-          <w:p>
-            <w:pPr>
-              <w:spacing w:after="0" w:line="240" w:lineRule="auto"/>
-              <w:rPr>
-                <w:rFonts w:eastAsia="Aptos"/>
-              </w:rPr>
-            </w:pPr>
-            <w:r>
-              <w:rPr>
-                <w:rFonts w:eastAsia="Aptos"/>
+            <w:tcW w:w="3005" w:type="dxa"/>
+            <w:tcBorders/>
+          </w:tcPr>
+          <w:p>
+            <w:pPr>
+              <w:pStyle w:val="Normal"/>
+              <w:widowControl/>
+              <w:suppressAutoHyphens w:val="true"/>
+              <w:spacing w:lineRule="auto" w:line="240" w:before="0" w:after="0"/>
+              <w:jc w:val="left"/>
+              <w:rPr>
+                <w:rFonts w:eastAsia="Aptos"/>
+              </w:rPr>
+            </w:pPr>
+            <w:r>
+              <w:rPr>
+                <w:rFonts w:eastAsia="Aptos" w:cs=""/>
+                <w:kern w:val="2"/>
+                <w:sz w:val="24"/>
+                <w:szCs w:val="24"/>
+                <w:lang w:val="de-DE" w:eastAsia="en-US" w:bidi="ar-SA"/>
               </w:rPr>
               <w:t>Anpassen Lautstärkeverhalten in Settings</w:t>
             </w:r>
@@ -641,17 +876,26 @@
         <w:tc>
           <w:tcPr>
             <w:tcW w:w="2551" w:type="dxa"/>
-          </w:tcPr>
-          <w:p>
-            <w:pPr>
-              <w:spacing w:after="0" w:line="240" w:lineRule="auto"/>
-              <w:rPr>
-                <w:rFonts w:eastAsia="Aptos"/>
-              </w:rPr>
-            </w:pPr>
-            <w:r>
-              <w:rPr>
-                <w:rFonts w:eastAsia="Aptos"/>
+            <w:tcBorders/>
+          </w:tcPr>
+          <w:p>
+            <w:pPr>
+              <w:pStyle w:val="Normal"/>
+              <w:widowControl/>
+              <w:suppressAutoHyphens w:val="true"/>
+              <w:spacing w:lineRule="auto" w:line="240" w:before="0" w:after="0"/>
+              <w:jc w:val="left"/>
+              <w:rPr>
+                <w:rFonts w:eastAsia="Aptos"/>
+              </w:rPr>
+            </w:pPr>
+            <w:r>
+              <w:rPr>
+                <w:rFonts w:eastAsia="Aptos" w:cs=""/>
+                <w:kern w:val="2"/>
+                <w:sz w:val="24"/>
+                <w:szCs w:val="24"/>
+                <w:lang w:val="de-DE" w:eastAsia="en-US" w:bidi="ar-SA"/>
               </w:rPr>
               <w:t>Lautstärke soll kein In-Fade haben, für einfacheres Einstellen der Lautstärke</w:t>
             </w:r>
@@ -660,17 +904,26 @@
         <w:tc>
           <w:tcPr>
             <w:tcW w:w="1979" w:type="dxa"/>
-          </w:tcPr>
-          <w:p>
-            <w:pPr>
-              <w:spacing w:after="0" w:line="240" w:lineRule="auto"/>
-              <w:rPr>
-                <w:rFonts w:eastAsia="Aptos"/>
-              </w:rPr>
-            </w:pPr>
-            <w:r>
-              <w:rPr>
-                <w:rFonts w:eastAsia="Aptos"/>
+            <w:tcBorders/>
+          </w:tcPr>
+          <w:p>
+            <w:pPr>
+              <w:pStyle w:val="Normal"/>
+              <w:widowControl/>
+              <w:suppressAutoHyphens w:val="true"/>
+              <w:spacing w:lineRule="auto" w:line="240" w:before="0" w:after="0"/>
+              <w:jc w:val="left"/>
+              <w:rPr>
+                <w:rFonts w:eastAsia="Aptos"/>
+              </w:rPr>
+            </w:pPr>
+            <w:r>
+              <w:rPr>
+                <w:rFonts w:eastAsia="Aptos" w:cs=""/>
+                <w:kern w:val="2"/>
+                <w:sz w:val="24"/>
+                <w:szCs w:val="24"/>
+                <w:lang w:val="de-DE" w:eastAsia="en-US" w:bidi="ar-SA"/>
               </w:rPr>
               <w:t>Vincent Knapp</w:t>
             </w:r>
@@ -678,20 +931,30 @@
         </w:tc>
       </w:tr>
       <w:tr>
+        <w:trPr/>
         <w:tc>
           <w:tcPr>
             <w:tcW w:w="1526" w:type="dxa"/>
-          </w:tcPr>
-          <w:p>
-            <w:pPr>
-              <w:spacing w:after="0" w:line="240" w:lineRule="auto"/>
-              <w:rPr>
-                <w:rFonts w:eastAsia="Aptos"/>
-              </w:rPr>
-            </w:pPr>
-            <w:r>
-              <w:rPr>
-                <w:rFonts w:eastAsia="Aptos"/>
+            <w:tcBorders/>
+          </w:tcPr>
+          <w:p>
+            <w:pPr>
+              <w:pStyle w:val="Normal"/>
+              <w:widowControl/>
+              <w:suppressAutoHyphens w:val="true"/>
+              <w:spacing w:lineRule="auto" w:line="240" w:before="0" w:after="0"/>
+              <w:jc w:val="left"/>
+              <w:rPr>
+                <w:rFonts w:eastAsia="Aptos"/>
+              </w:rPr>
+            </w:pPr>
+            <w:r>
+              <w:rPr>
+                <w:rFonts w:eastAsia="Aptos" w:cs=""/>
+                <w:kern w:val="2"/>
+                <w:sz w:val="24"/>
+                <w:szCs w:val="24"/>
+                <w:lang w:val="de-DE" w:eastAsia="en-US" w:bidi="ar-SA"/>
               </w:rPr>
               <w:t>25.04.2026</w:t>
             </w:r>
@@ -699,18 +962,27 @@
         </w:tc>
         <w:tc>
           <w:tcPr>
-            <w:tcW w:w="3006" w:type="dxa"/>
-          </w:tcPr>
-          <w:p>
-            <w:pPr>
-              <w:spacing w:after="0" w:line="240" w:lineRule="auto"/>
-              <w:rPr>
-                <w:rFonts w:eastAsia="Aptos"/>
-              </w:rPr>
-            </w:pPr>
-            <w:r>
-              <w:rPr>
-                <w:rFonts w:eastAsia="Aptos"/>
+            <w:tcW w:w="3005" w:type="dxa"/>
+            <w:tcBorders/>
+          </w:tcPr>
+          <w:p>
+            <w:pPr>
+              <w:pStyle w:val="Normal"/>
+              <w:widowControl/>
+              <w:suppressAutoHyphens w:val="true"/>
+              <w:spacing w:lineRule="auto" w:line="240" w:before="0" w:after="0"/>
+              <w:jc w:val="left"/>
+              <w:rPr>
+                <w:rFonts w:eastAsia="Aptos"/>
+              </w:rPr>
+            </w:pPr>
+            <w:r>
+              <w:rPr>
+                <w:rFonts w:eastAsia="Aptos" w:cs=""/>
+                <w:kern w:val="2"/>
+                <w:sz w:val="24"/>
+                <w:szCs w:val="24"/>
+                <w:lang w:val="de-DE" w:eastAsia="en-US" w:bidi="ar-SA"/>
               </w:rPr>
               <w:t>Anpassen Formel für Lautstärkenberechnen</w:t>
             </w:r>
@@ -719,17 +991,26 @@
         <w:tc>
           <w:tcPr>
             <w:tcW w:w="2551" w:type="dxa"/>
-          </w:tcPr>
-          <w:p>
-            <w:pPr>
-              <w:spacing w:after="0" w:line="240" w:lineRule="auto"/>
-              <w:rPr>
-                <w:rFonts w:eastAsia="Aptos"/>
-              </w:rPr>
-            </w:pPr>
-            <w:r>
-              <w:rPr>
-                <w:rFonts w:eastAsia="Aptos"/>
+            <w:tcBorders/>
+          </w:tcPr>
+          <w:p>
+            <w:pPr>
+              <w:pStyle w:val="Normal"/>
+              <w:widowControl/>
+              <w:suppressAutoHyphens w:val="true"/>
+              <w:spacing w:lineRule="auto" w:line="240" w:before="0" w:after="0"/>
+              <w:jc w:val="left"/>
+              <w:rPr>
+                <w:rFonts w:eastAsia="Aptos"/>
+              </w:rPr>
+            </w:pPr>
+            <w:r>
+              <w:rPr>
+                <w:rFonts w:eastAsia="Aptos" w:cs=""/>
+                <w:kern w:val="2"/>
+                <w:sz w:val="24"/>
+                <w:szCs w:val="24"/>
+                <w:lang w:val="de-DE" w:eastAsia="en-US" w:bidi="ar-SA"/>
               </w:rPr>
               <w:t>Lineare Funktion entspricht nicht der Vorstellung und ist ab &lt;-30db nicht nachvollziehbar</w:t>
             </w:r>
@@ -738,17 +1019,26 @@
         <w:tc>
           <w:tcPr>
             <w:tcW w:w="1979" w:type="dxa"/>
-          </w:tcPr>
-          <w:p>
-            <w:pPr>
-              <w:spacing w:after="0" w:line="240" w:lineRule="auto"/>
-              <w:rPr>
-                <w:rFonts w:eastAsia="Aptos"/>
-              </w:rPr>
-            </w:pPr>
-            <w:r>
-              <w:rPr>
-                <w:rFonts w:eastAsia="Aptos"/>
+            <w:tcBorders/>
+          </w:tcPr>
+          <w:p>
+            <w:pPr>
+              <w:pStyle w:val="Normal"/>
+              <w:widowControl/>
+              <w:suppressAutoHyphens w:val="true"/>
+              <w:spacing w:lineRule="auto" w:line="240" w:before="0" w:after="0"/>
+              <w:jc w:val="left"/>
+              <w:rPr>
+                <w:rFonts w:eastAsia="Aptos"/>
+              </w:rPr>
+            </w:pPr>
+            <w:r>
+              <w:rPr>
+                <w:rFonts w:eastAsia="Aptos" w:cs=""/>
+                <w:kern w:val="2"/>
+                <w:sz w:val="24"/>
+                <w:szCs w:val="24"/>
+                <w:lang w:val="de-DE" w:eastAsia="en-US" w:bidi="ar-SA"/>
               </w:rPr>
               <w:t>Vincent Knapp</w:t>
             </w:r>
@@ -756,20 +1046,30 @@
         </w:tc>
       </w:tr>
       <w:tr>
+        <w:trPr/>
         <w:tc>
           <w:tcPr>
             <w:tcW w:w="1526" w:type="dxa"/>
-          </w:tcPr>
-          <w:p>
-            <w:pPr>
-              <w:spacing w:after="0" w:line="240" w:lineRule="auto"/>
-              <w:rPr>
-                <w:rFonts w:eastAsia="Aptos"/>
-              </w:rPr>
-            </w:pPr>
-            <w:r>
-              <w:rPr>
-                <w:rFonts w:eastAsia="Aptos"/>
+            <w:tcBorders/>
+          </w:tcPr>
+          <w:p>
+            <w:pPr>
+              <w:pStyle w:val="Normal"/>
+              <w:widowControl/>
+              <w:suppressAutoHyphens w:val="true"/>
+              <w:spacing w:lineRule="auto" w:line="240" w:before="0" w:after="0"/>
+              <w:jc w:val="left"/>
+              <w:rPr>
+                <w:rFonts w:eastAsia="Aptos"/>
+              </w:rPr>
+            </w:pPr>
+            <w:r>
+              <w:rPr>
+                <w:rFonts w:eastAsia="Aptos" w:cs=""/>
+                <w:kern w:val="2"/>
+                <w:sz w:val="24"/>
+                <w:szCs w:val="24"/>
+                <w:lang w:val="de-DE" w:eastAsia="en-US" w:bidi="ar-SA"/>
               </w:rPr>
               <w:t>28.04.2026</w:t>
             </w:r>
@@ -777,18 +1077,27 @@
         </w:tc>
         <w:tc>
           <w:tcPr>
-            <w:tcW w:w="3006" w:type="dxa"/>
-          </w:tcPr>
-          <w:p>
-            <w:pPr>
-              <w:spacing w:after="0" w:line="240" w:lineRule="auto"/>
-              <w:rPr>
-                <w:rFonts w:eastAsia="Aptos"/>
-              </w:rPr>
-            </w:pPr>
-            <w:r>
-              <w:rPr>
-                <w:rFonts w:eastAsia="Aptos"/>
+            <w:tcW w:w="3005" w:type="dxa"/>
+            <w:tcBorders/>
+          </w:tcPr>
+          <w:p>
+            <w:pPr>
+              <w:pStyle w:val="Normal"/>
+              <w:widowControl/>
+              <w:suppressAutoHyphens w:val="true"/>
+              <w:spacing w:lineRule="auto" w:line="240" w:before="0" w:after="0"/>
+              <w:jc w:val="left"/>
+              <w:rPr>
+                <w:rFonts w:eastAsia="Aptos"/>
+              </w:rPr>
+            </w:pPr>
+            <w:r>
+              <w:rPr>
+                <w:rFonts w:eastAsia="Aptos" w:cs=""/>
+                <w:kern w:val="2"/>
+                <w:sz w:val="24"/>
+                <w:szCs w:val="24"/>
+                <w:lang w:val="de-DE" w:eastAsia="en-US" w:bidi="ar-SA"/>
               </w:rPr>
               <w:t>UI zeigt, dass eine Interaktion möglich ist (an Geräten)</w:t>
             </w:r>
@@ -797,17 +1106,26 @@
         <w:tc>
           <w:tcPr>
             <w:tcW w:w="2551" w:type="dxa"/>
-          </w:tcPr>
-          <w:p>
-            <w:pPr>
-              <w:spacing w:after="0" w:line="240" w:lineRule="auto"/>
-              <w:rPr>
-                <w:rFonts w:eastAsia="Aptos"/>
-              </w:rPr>
-            </w:pPr>
-            <w:r>
-              <w:rPr>
-                <w:rFonts w:eastAsia="Aptos"/>
+            <w:tcBorders/>
+          </w:tcPr>
+          <w:p>
+            <w:pPr>
+              <w:pStyle w:val="Normal"/>
+              <w:widowControl/>
+              <w:suppressAutoHyphens w:val="true"/>
+              <w:spacing w:lineRule="auto" w:line="240" w:before="0" w:after="0"/>
+              <w:jc w:val="left"/>
+              <w:rPr>
+                <w:rFonts w:eastAsia="Aptos"/>
+              </w:rPr>
+            </w:pPr>
+            <w:r>
+              <w:rPr>
+                <w:rFonts w:eastAsia="Aptos" w:cs=""/>
+                <w:kern w:val="2"/>
+                <w:sz w:val="24"/>
+                <w:szCs w:val="24"/>
+                <w:lang w:val="de-DE" w:eastAsia="en-US" w:bidi="ar-SA"/>
               </w:rPr>
               <w:t>Nachvollziehbarkeit für Spieler gewährleisten</w:t>
             </w:r>
@@ -816,17 +1134,26 @@
         <w:tc>
           <w:tcPr>
             <w:tcW w:w="1979" w:type="dxa"/>
-          </w:tcPr>
-          <w:p>
-            <w:pPr>
-              <w:spacing w:after="0" w:line="240" w:lineRule="auto"/>
-              <w:rPr>
-                <w:rFonts w:eastAsia="Aptos"/>
-              </w:rPr>
-            </w:pPr>
-            <w:r>
-              <w:rPr>
-                <w:rFonts w:eastAsia="Aptos"/>
+            <w:tcBorders/>
+          </w:tcPr>
+          <w:p>
+            <w:pPr>
+              <w:pStyle w:val="Normal"/>
+              <w:widowControl/>
+              <w:suppressAutoHyphens w:val="true"/>
+              <w:spacing w:lineRule="auto" w:line="240" w:before="0" w:after="0"/>
+              <w:jc w:val="left"/>
+              <w:rPr>
+                <w:rFonts w:eastAsia="Aptos"/>
+              </w:rPr>
+            </w:pPr>
+            <w:r>
+              <w:rPr>
+                <w:rFonts w:eastAsia="Aptos" w:cs=""/>
+                <w:kern w:val="2"/>
+                <w:sz w:val="24"/>
+                <w:szCs w:val="24"/>
+                <w:lang w:val="de-DE" w:eastAsia="en-US" w:bidi="ar-SA"/>
               </w:rPr>
               <w:t>Vincent Knapp</w:t>
             </w:r>
@@ -834,82 +1161,86 @@
         </w:tc>
       </w:tr>
       <w:tr>
+        <w:trPr/>
         <w:tc>
           <w:tcPr>
             <w:tcW w:w="1526" w:type="dxa"/>
-          </w:tcPr>
-          <w:p>
-            <w:pPr>
-              <w:spacing w:after="0" w:line="240" w:lineRule="auto"/>
-              <w:rPr>
-                <w:rFonts w:eastAsia="Aptos"/>
-              </w:rPr>
-            </w:pPr>
-            <w:r>
-              <w:rPr>
-                <w:rFonts w:eastAsia="Aptos"/>
-              </w:rPr>
-              <w:t>0</w:t>
-            </w:r>
-            <w:r>
-              <w:rPr>
-                <w:rFonts w:eastAsia="Aptos"/>
-              </w:rPr>
-              <w:t>4</w:t>
-            </w:r>
-            <w:r>
-              <w:rPr>
-                <w:rFonts w:eastAsia="Aptos"/>
-              </w:rPr>
-              <w:t>.05.2026</w:t>
-            </w:r>
-          </w:p>
-        </w:tc>
-        <w:tc>
-          <w:tcPr>
-            <w:tcW w:w="3006" w:type="dxa"/>
-          </w:tcPr>
-          <w:p>
-            <w:pPr>
-              <w:spacing w:after="0" w:line="240" w:lineRule="auto"/>
-              <w:rPr>
-                <w:rFonts w:eastAsia="Aptos"/>
-              </w:rPr>
-            </w:pPr>
-            <w:r>
-              <w:rPr>
-                <w:rFonts w:eastAsia="Aptos"/>
-              </w:rPr>
-              <w:t>Animation</w:t>
-            </w:r>
-            <w:r>
-              <w:rPr>
-                <w:rFonts w:eastAsia="Aptos"/>
-              </w:rPr>
-              <w:t xml:space="preserve"> </w:t>
-            </w:r>
-            <w:r>
-              <w:rPr>
-                <w:rFonts w:eastAsia="Aptos"/>
-              </w:rPr>
-              <w:t>Richtungswechsel fix</w:t>
+            <w:tcBorders/>
+          </w:tcPr>
+          <w:p>
+            <w:pPr>
+              <w:pStyle w:val="Normal"/>
+              <w:widowControl/>
+              <w:suppressAutoHyphens w:val="true"/>
+              <w:spacing w:lineRule="auto" w:line="240" w:before="0" w:after="0"/>
+              <w:jc w:val="left"/>
+              <w:rPr>
+                <w:rFonts w:eastAsia="Aptos"/>
+              </w:rPr>
+            </w:pPr>
+            <w:r>
+              <w:rPr>
+                <w:rFonts w:eastAsia="Aptos" w:cs=""/>
+                <w:kern w:val="2"/>
+                <w:sz w:val="24"/>
+                <w:szCs w:val="24"/>
+                <w:lang w:val="de-DE" w:eastAsia="en-US" w:bidi="ar-SA"/>
+              </w:rPr>
+              <w:t>04.05.2026</w:t>
+            </w:r>
+          </w:p>
+        </w:tc>
+        <w:tc>
+          <w:tcPr>
+            <w:tcW w:w="3005" w:type="dxa"/>
+            <w:tcBorders/>
+          </w:tcPr>
+          <w:p>
+            <w:pPr>
+              <w:pStyle w:val="Normal"/>
+              <w:widowControl/>
+              <w:suppressAutoHyphens w:val="true"/>
+              <w:spacing w:lineRule="auto" w:line="240" w:before="0" w:after="0"/>
+              <w:jc w:val="left"/>
+              <w:rPr>
+                <w:rFonts w:eastAsia="Aptos"/>
+              </w:rPr>
+            </w:pPr>
+            <w:r>
+              <w:rPr>
+                <w:rFonts w:eastAsia="Aptos" w:cs=""/>
+                <w:kern w:val="2"/>
+                <w:sz w:val="24"/>
+                <w:szCs w:val="24"/>
+                <w:lang w:val="de-DE" w:eastAsia="en-US" w:bidi="ar-SA"/>
+              </w:rPr>
+              <w:t>Animation Richtungswechsel fix</w:t>
             </w:r>
           </w:p>
         </w:tc>
         <w:tc>
           <w:tcPr>
             <w:tcW w:w="2551" w:type="dxa"/>
-          </w:tcPr>
-          <w:p>
-            <w:pPr>
-              <w:spacing w:after="0" w:line="240" w:lineRule="auto"/>
-              <w:rPr>
-                <w:rFonts w:eastAsia="Aptos"/>
-              </w:rPr>
-            </w:pPr>
-            <w:r>
-              <w:rPr>
-                <w:rFonts w:eastAsia="Aptos"/>
+            <w:tcBorders/>
+          </w:tcPr>
+          <w:p>
+            <w:pPr>
+              <w:pStyle w:val="Normal"/>
+              <w:widowControl/>
+              <w:suppressAutoHyphens w:val="true"/>
+              <w:spacing w:lineRule="auto" w:line="240" w:before="0" w:after="0"/>
+              <w:jc w:val="left"/>
+              <w:rPr>
+                <w:rFonts w:eastAsia="Aptos"/>
+              </w:rPr>
+            </w:pPr>
+            <w:r>
+              <w:rPr>
+                <w:rFonts w:eastAsia="Aptos" w:cs=""/>
+                <w:kern w:val="2"/>
+                <w:sz w:val="24"/>
+                <w:szCs w:val="24"/>
+                <w:lang w:val="de-DE" w:eastAsia="en-US" w:bidi="ar-SA"/>
               </w:rPr>
               <w:t>Interaktions-Area des spielers ändert sich nun zur bewegungsrichtung des spielers</w:t>
             </w:r>
@@ -918,17 +1249,26 @@
         <w:tc>
           <w:tcPr>
             <w:tcW w:w="1979" w:type="dxa"/>
-          </w:tcPr>
-          <w:p>
-            <w:pPr>
-              <w:spacing w:after="0" w:line="240" w:lineRule="auto"/>
-              <w:rPr>
-                <w:rFonts w:eastAsia="Aptos"/>
-              </w:rPr>
-            </w:pPr>
-            <w:r>
-              <w:rPr>
-                <w:rFonts w:eastAsia="Aptos"/>
+            <w:tcBorders/>
+          </w:tcPr>
+          <w:p>
+            <w:pPr>
+              <w:pStyle w:val="Normal"/>
+              <w:widowControl/>
+              <w:suppressAutoHyphens w:val="true"/>
+              <w:spacing w:lineRule="auto" w:line="240" w:before="0" w:after="0"/>
+              <w:jc w:val="left"/>
+              <w:rPr>
+                <w:rFonts w:eastAsia="Aptos"/>
+              </w:rPr>
+            </w:pPr>
+            <w:r>
+              <w:rPr>
+                <w:rFonts w:eastAsia="Aptos" w:cs=""/>
+                <w:kern w:val="2"/>
+                <w:sz w:val="24"/>
+                <w:szCs w:val="24"/>
+                <w:lang w:val="de-DE" w:eastAsia="en-US" w:bidi="ar-SA"/>
               </w:rPr>
               <w:t>Benedek Kovacs</w:t>
             </w:r>
@@ -936,20 +1276,30 @@
         </w:tc>
       </w:tr>
       <w:tr>
+        <w:trPr/>
         <w:tc>
           <w:tcPr>
             <w:tcW w:w="1526" w:type="dxa"/>
-          </w:tcPr>
-          <w:p>
-            <w:pPr>
-              <w:spacing w:after="0" w:line="240" w:lineRule="auto"/>
-              <w:rPr>
-                <w:rFonts w:eastAsia="Aptos"/>
-              </w:rPr>
-            </w:pPr>
-            <w:r>
-              <w:rPr>
-                <w:rFonts w:eastAsia="Aptos"/>
+            <w:tcBorders/>
+          </w:tcPr>
+          <w:p>
+            <w:pPr>
+              <w:pStyle w:val="Normal"/>
+              <w:widowControl/>
+              <w:suppressAutoHyphens w:val="true"/>
+              <w:spacing w:lineRule="auto" w:line="240" w:before="0" w:after="0"/>
+              <w:jc w:val="left"/>
+              <w:rPr>
+                <w:rFonts w:eastAsia="Aptos"/>
+              </w:rPr>
+            </w:pPr>
+            <w:r>
+              <w:rPr>
+                <w:rFonts w:eastAsia="Aptos" w:cs=""/>
+                <w:kern w:val="2"/>
+                <w:sz w:val="24"/>
+                <w:szCs w:val="24"/>
+                <w:lang w:val="de-DE" w:eastAsia="en-US" w:bidi="ar-SA"/>
               </w:rPr>
               <w:t>09.05.2026</w:t>
             </w:r>
@@ -957,18 +1307,27 @@
         </w:tc>
         <w:tc>
           <w:tcPr>
-            <w:tcW w:w="3006" w:type="dxa"/>
-          </w:tcPr>
-          <w:p>
-            <w:pPr>
-              <w:spacing w:after="0" w:line="240" w:lineRule="auto"/>
-              <w:rPr>
-                <w:rFonts w:eastAsia="Aptos"/>
-              </w:rPr>
-            </w:pPr>
-            <w:r>
-              <w:rPr>
-                <w:rFonts w:eastAsia="Aptos"/>
+            <w:tcW w:w="3005" w:type="dxa"/>
+            <w:tcBorders/>
+          </w:tcPr>
+          <w:p>
+            <w:pPr>
+              <w:pStyle w:val="Normal"/>
+              <w:widowControl/>
+              <w:suppressAutoHyphens w:val="true"/>
+              <w:spacing w:lineRule="auto" w:line="240" w:before="0" w:after="0"/>
+              <w:jc w:val="left"/>
+              <w:rPr>
+                <w:rFonts w:eastAsia="Aptos"/>
+              </w:rPr>
+            </w:pPr>
+            <w:r>
+              <w:rPr>
+                <w:rFonts w:eastAsia="Aptos" w:cs=""/>
+                <w:kern w:val="2"/>
+                <w:sz w:val="24"/>
+                <w:szCs w:val="24"/>
+                <w:lang w:val="de-DE" w:eastAsia="en-US" w:bidi="ar-SA"/>
               </w:rPr>
               <w:t>Interaktion Priorisierung</w:t>
             </w:r>
@@ -977,17 +1336,26 @@
         <w:tc>
           <w:tcPr>
             <w:tcW w:w="2551" w:type="dxa"/>
-          </w:tcPr>
-          <w:p>
-            <w:pPr>
-              <w:spacing w:after="0" w:line="240" w:lineRule="auto"/>
-              <w:rPr>
-                <w:rFonts w:eastAsia="Aptos"/>
-              </w:rPr>
-            </w:pPr>
-            <w:r>
-              <w:rPr>
-                <w:rFonts w:eastAsia="Aptos"/>
+            <w:tcBorders/>
+          </w:tcPr>
+          <w:p>
+            <w:pPr>
+              <w:pStyle w:val="Normal"/>
+              <w:widowControl/>
+              <w:suppressAutoHyphens w:val="true"/>
+              <w:spacing w:lineRule="auto" w:line="240" w:before="0" w:after="0"/>
+              <w:jc w:val="left"/>
+              <w:rPr>
+                <w:rFonts w:eastAsia="Aptos"/>
+              </w:rPr>
+            </w:pPr>
+            <w:r>
+              <w:rPr>
+                <w:rFonts w:eastAsia="Aptos" w:cs=""/>
+                <w:kern w:val="2"/>
+                <w:sz w:val="24"/>
+                <w:szCs w:val="24"/>
+                <w:lang w:val="de-DE" w:eastAsia="en-US" w:bidi="ar-SA"/>
               </w:rPr>
               <w:t>Interaktionen werden nun priorisiert (basierend auf fokustest feedback)</w:t>
             </w:r>
@@ -996,17 +1364,26 @@
         <w:tc>
           <w:tcPr>
             <w:tcW w:w="1979" w:type="dxa"/>
-          </w:tcPr>
-          <w:p>
-            <w:pPr>
-              <w:spacing w:after="0" w:line="240" w:lineRule="auto"/>
-              <w:rPr>
-                <w:rFonts w:eastAsia="Aptos"/>
-              </w:rPr>
-            </w:pPr>
-            <w:r>
-              <w:rPr>
-                <w:rFonts w:eastAsia="Aptos"/>
+            <w:tcBorders/>
+          </w:tcPr>
+          <w:p>
+            <w:pPr>
+              <w:pStyle w:val="Normal"/>
+              <w:widowControl/>
+              <w:suppressAutoHyphens w:val="true"/>
+              <w:spacing w:lineRule="auto" w:line="240" w:before="0" w:after="0"/>
+              <w:jc w:val="left"/>
+              <w:rPr>
+                <w:rFonts w:eastAsia="Aptos"/>
+              </w:rPr>
+            </w:pPr>
+            <w:r>
+              <w:rPr>
+                <w:rFonts w:eastAsia="Aptos" w:cs=""/>
+                <w:kern w:val="2"/>
+                <w:sz w:val="24"/>
+                <w:szCs w:val="24"/>
+                <w:lang w:val="de-DE" w:eastAsia="en-US" w:bidi="ar-SA"/>
               </w:rPr>
               <w:t>Benedek Kovacs</w:t>
             </w:r>
@@ -1014,20 +1391,30 @@
         </w:tc>
       </w:tr>
       <w:tr>
+        <w:trPr/>
         <w:tc>
           <w:tcPr>
             <w:tcW w:w="1526" w:type="dxa"/>
-          </w:tcPr>
-          <w:p>
-            <w:pPr>
-              <w:spacing w:after="0" w:line="240" w:lineRule="auto"/>
-              <w:rPr>
-                <w:rFonts w:eastAsia="Aptos"/>
-              </w:rPr>
-            </w:pPr>
-            <w:r>
-              <w:rPr>
-                <w:rFonts w:eastAsia="Aptos"/>
+            <w:tcBorders/>
+          </w:tcPr>
+          <w:p>
+            <w:pPr>
+              <w:pStyle w:val="Normal"/>
+              <w:widowControl/>
+              <w:suppressAutoHyphens w:val="true"/>
+              <w:spacing w:lineRule="auto" w:line="240" w:before="0" w:after="0"/>
+              <w:jc w:val="left"/>
+              <w:rPr>
+                <w:rFonts w:eastAsia="Aptos"/>
+              </w:rPr>
+            </w:pPr>
+            <w:r>
+              <w:rPr>
+                <w:rFonts w:eastAsia="Aptos" w:cs=""/>
+                <w:kern w:val="2"/>
+                <w:sz w:val="24"/>
+                <w:szCs w:val="24"/>
+                <w:lang w:val="de-DE" w:eastAsia="en-US" w:bidi="ar-SA"/>
               </w:rPr>
               <w:t>09.05.2026</w:t>
             </w:r>
@@ -1035,18 +1422,27 @@
         </w:tc>
         <w:tc>
           <w:tcPr>
-            <w:tcW w:w="3006" w:type="dxa"/>
-          </w:tcPr>
-          <w:p>
-            <w:pPr>
-              <w:spacing w:after="0" w:line="240" w:lineRule="auto"/>
-              <w:rPr>
-                <w:rFonts w:eastAsia="Aptos"/>
-              </w:rPr>
-            </w:pPr>
-            <w:r>
-              <w:rPr>
-                <w:rFonts w:eastAsia="Aptos"/>
+            <w:tcW w:w="3005" w:type="dxa"/>
+            <w:tcBorders/>
+          </w:tcPr>
+          <w:p>
+            <w:pPr>
+              <w:pStyle w:val="Normal"/>
+              <w:widowControl/>
+              <w:suppressAutoHyphens w:val="true"/>
+              <w:spacing w:lineRule="auto" w:line="240" w:before="0" w:after="0"/>
+              <w:jc w:val="left"/>
+              <w:rPr>
+                <w:rFonts w:eastAsia="Aptos"/>
+              </w:rPr>
+            </w:pPr>
+            <w:r>
+              <w:rPr>
+                <w:rFonts w:eastAsia="Aptos" w:cs=""/>
+                <w:kern w:val="2"/>
+                <w:sz w:val="24"/>
+                <w:szCs w:val="24"/>
+                <w:lang w:val="de-DE" w:eastAsia="en-US" w:bidi="ar-SA"/>
               </w:rPr>
               <w:t>Chilli hinzugefügt</w:t>
             </w:r>
@@ -1055,17 +1451,26 @@
         <w:tc>
           <w:tcPr>
             <w:tcW w:w="2551" w:type="dxa"/>
-          </w:tcPr>
-          <w:p>
-            <w:pPr>
-              <w:spacing w:after="0" w:line="240" w:lineRule="auto"/>
-              <w:rPr>
-                <w:rFonts w:eastAsia="Aptos"/>
-              </w:rPr>
-            </w:pPr>
-            <w:r>
-              <w:rPr>
-                <w:rFonts w:eastAsia="Aptos"/>
+            <w:tcBorders/>
+          </w:tcPr>
+          <w:p>
+            <w:pPr>
+              <w:pStyle w:val="Normal"/>
+              <w:widowControl/>
+              <w:suppressAutoHyphens w:val="true"/>
+              <w:spacing w:lineRule="auto" w:line="240" w:before="0" w:after="0"/>
+              <w:jc w:val="left"/>
+              <w:rPr>
+                <w:rFonts w:eastAsia="Aptos"/>
+              </w:rPr>
+            </w:pPr>
+            <w:r>
+              <w:rPr>
+                <w:rFonts w:eastAsia="Aptos" w:cs=""/>
+                <w:kern w:val="2"/>
+                <w:sz w:val="24"/>
+                <w:szCs w:val="24"/>
+                <w:lang w:val="de-DE" w:eastAsia="en-US" w:bidi="ar-SA"/>
               </w:rPr>
               <w:t>Erhöht abwechslung im gameplay loop</w:t>
             </w:r>
@@ -1074,17 +1479,26 @@
         <w:tc>
           <w:tcPr>
             <w:tcW w:w="1979" w:type="dxa"/>
-          </w:tcPr>
-          <w:p>
-            <w:pPr>
-              <w:spacing w:after="0" w:line="240" w:lineRule="auto"/>
-              <w:rPr>
-                <w:rFonts w:eastAsia="Aptos"/>
-              </w:rPr>
-            </w:pPr>
-            <w:r>
-              <w:rPr>
-                <w:rFonts w:eastAsia="Aptos"/>
+            <w:tcBorders/>
+          </w:tcPr>
+          <w:p>
+            <w:pPr>
+              <w:pStyle w:val="Normal"/>
+              <w:widowControl/>
+              <w:suppressAutoHyphens w:val="true"/>
+              <w:spacing w:lineRule="auto" w:line="240" w:before="0" w:after="0"/>
+              <w:jc w:val="left"/>
+              <w:rPr>
+                <w:rFonts w:eastAsia="Aptos"/>
+              </w:rPr>
+            </w:pPr>
+            <w:r>
+              <w:rPr>
+                <w:rFonts w:eastAsia="Aptos" w:cs=""/>
+                <w:kern w:val="2"/>
+                <w:sz w:val="24"/>
+                <w:szCs w:val="24"/>
+                <w:lang w:val="de-DE" w:eastAsia="en-US" w:bidi="ar-SA"/>
               </w:rPr>
               <w:t>Benedek Kovacs</w:t>
             </w:r>
@@ -1092,20 +1506,30 @@
         </w:tc>
       </w:tr>
       <w:tr>
+        <w:trPr/>
         <w:tc>
           <w:tcPr>
             <w:tcW w:w="1526" w:type="dxa"/>
-          </w:tcPr>
-          <w:p>
-            <w:pPr>
-              <w:spacing w:after="0" w:line="240" w:lineRule="auto"/>
-              <w:rPr>
-                <w:rFonts w:eastAsia="Aptos"/>
-              </w:rPr>
-            </w:pPr>
-            <w:r>
-              <w:rPr>
-                <w:rFonts w:eastAsia="Aptos"/>
+            <w:tcBorders/>
+          </w:tcPr>
+          <w:p>
+            <w:pPr>
+              <w:pStyle w:val="Normal"/>
+              <w:widowControl/>
+              <w:suppressAutoHyphens w:val="true"/>
+              <w:spacing w:lineRule="auto" w:line="240" w:before="0" w:after="0"/>
+              <w:jc w:val="left"/>
+              <w:rPr>
+                <w:rFonts w:eastAsia="Aptos"/>
+              </w:rPr>
+            </w:pPr>
+            <w:r>
+              <w:rPr>
+                <w:rFonts w:eastAsia="Aptos" w:cs=""/>
+                <w:kern w:val="2"/>
+                <w:sz w:val="24"/>
+                <w:szCs w:val="24"/>
+                <w:lang w:val="de-DE" w:eastAsia="en-US" w:bidi="ar-SA"/>
               </w:rPr>
               <w:t>09.05.2026</w:t>
             </w:r>
@@ -1113,18 +1537,27 @@
         </w:tc>
         <w:tc>
           <w:tcPr>
-            <w:tcW w:w="3006" w:type="dxa"/>
-          </w:tcPr>
-          <w:p>
-            <w:pPr>
-              <w:spacing w:after="0" w:line="240" w:lineRule="auto"/>
-              <w:rPr>
-                <w:rFonts w:eastAsia="Aptos"/>
-              </w:rPr>
-            </w:pPr>
-            <w:r>
-              <w:rPr>
-                <w:rFonts w:eastAsia="Aptos"/>
+            <w:tcW w:w="3005" w:type="dxa"/>
+            <w:tcBorders/>
+          </w:tcPr>
+          <w:p>
+            <w:pPr>
+              <w:pStyle w:val="Normal"/>
+              <w:widowControl/>
+              <w:suppressAutoHyphens w:val="true"/>
+              <w:spacing w:lineRule="auto" w:line="240" w:before="0" w:after="0"/>
+              <w:jc w:val="left"/>
+              <w:rPr>
+                <w:rFonts w:eastAsia="Aptos"/>
+              </w:rPr>
+            </w:pPr>
+            <w:r>
+              <w:rPr>
+                <w:rFonts w:eastAsia="Aptos" w:cs=""/>
+                <w:kern w:val="2"/>
+                <w:sz w:val="24"/>
+                <w:szCs w:val="24"/>
+                <w:lang w:val="de-DE" w:eastAsia="en-US" w:bidi="ar-SA"/>
               </w:rPr>
               <w:t>Audio FX für Geräte hinzugefügt</w:t>
             </w:r>
@@ -1133,17 +1566,26 @@
         <w:tc>
           <w:tcPr>
             <w:tcW w:w="2551" w:type="dxa"/>
-          </w:tcPr>
-          <w:p>
-            <w:pPr>
-              <w:spacing w:after="0" w:line="240" w:lineRule="auto"/>
-              <w:rPr>
-                <w:rFonts w:eastAsia="Aptos"/>
-              </w:rPr>
-            </w:pPr>
-            <w:r>
-              <w:rPr>
-                <w:rFonts w:eastAsia="Aptos"/>
+            <w:tcBorders/>
+          </w:tcPr>
+          <w:p>
+            <w:pPr>
+              <w:pStyle w:val="Normal"/>
+              <w:widowControl/>
+              <w:suppressAutoHyphens w:val="true"/>
+              <w:spacing w:lineRule="auto" w:line="240" w:before="0" w:after="0"/>
+              <w:jc w:val="left"/>
+              <w:rPr>
+                <w:rFonts w:eastAsia="Aptos"/>
+              </w:rPr>
+            </w:pPr>
+            <w:r>
+              <w:rPr>
+                <w:rFonts w:eastAsia="Aptos" w:cs=""/>
+                <w:kern w:val="2"/>
+                <w:sz w:val="24"/>
+                <w:szCs w:val="24"/>
+                <w:lang w:val="de-DE" w:eastAsia="en-US" w:bidi="ar-SA"/>
               </w:rPr>
               <w:t>Mehr Nähe für den Spieler</w:t>
             </w:r>
@@ -1152,17 +1594,26 @@
         <w:tc>
           <w:tcPr>
             <w:tcW w:w="1979" w:type="dxa"/>
-          </w:tcPr>
-          <w:p>
-            <w:pPr>
-              <w:spacing w:after="0" w:line="240" w:lineRule="auto"/>
-              <w:rPr>
-                <w:rFonts w:eastAsia="Aptos"/>
-              </w:rPr>
-            </w:pPr>
-            <w:r>
-              <w:rPr>
-                <w:rFonts w:eastAsia="Aptos"/>
+            <w:tcBorders/>
+          </w:tcPr>
+          <w:p>
+            <w:pPr>
+              <w:pStyle w:val="Normal"/>
+              <w:widowControl/>
+              <w:suppressAutoHyphens w:val="true"/>
+              <w:spacing w:lineRule="auto" w:line="240" w:before="0" w:after="0"/>
+              <w:jc w:val="left"/>
+              <w:rPr>
+                <w:rFonts w:eastAsia="Aptos"/>
+              </w:rPr>
+            </w:pPr>
+            <w:r>
+              <w:rPr>
+                <w:rFonts w:eastAsia="Aptos" w:cs=""/>
+                <w:kern w:val="2"/>
+                <w:sz w:val="24"/>
+                <w:szCs w:val="24"/>
+                <w:lang w:val="de-DE" w:eastAsia="en-US" w:bidi="ar-SA"/>
               </w:rPr>
               <w:t>Vincent Knapp</w:t>
             </w:r>
@@ -1170,6 +1621,7 @@
         </w:tc>
       </w:tr>
       <w:tr>
+        <w:trPr/>
         <w:tc>
           <w:tcPr>
             <w:tcW w:w="1526" w:type="dxa"/>
@@ -1179,14 +1631,22 @@
           </w:tcPr>
           <w:p>
             <w:pPr>
-              <w:spacing w:after="0" w:line="240" w:lineRule="auto"/>
-              <w:rPr>
-                <w:rFonts w:eastAsia="Aptos"/>
-              </w:rPr>
-            </w:pPr>
-            <w:r>
-              <w:rPr>
-                <w:rFonts w:eastAsia="Aptos"/>
+              <w:pStyle w:val="Normal"/>
+              <w:widowControl/>
+              <w:suppressAutoHyphens w:val="true"/>
+              <w:spacing w:lineRule="auto" w:line="240" w:before="0" w:after="0"/>
+              <w:jc w:val="left"/>
+              <w:rPr>
+                <w:rFonts w:eastAsia="Aptos"/>
+              </w:rPr>
+            </w:pPr>
+            <w:r>
+              <w:rPr>
+                <w:rFonts w:eastAsia="Aptos" w:cs=""/>
+                <w:kern w:val="2"/>
+                <w:sz w:val="24"/>
+                <w:szCs w:val="24"/>
+                <w:lang w:val="de-DE" w:eastAsia="en-US" w:bidi="ar-SA"/>
               </w:rPr>
               <w:t>09.05.2026</w:t>
             </w:r>
@@ -1194,21 +1654,29 @@
         </w:tc>
         <w:tc>
           <w:tcPr>
-            <w:tcW w:w="3006" w:type="dxa"/>
+            <w:tcW w:w="3005" w:type="dxa"/>
             <w:tcBorders>
               <w:top w:val="nil"/>
             </w:tcBorders>
           </w:tcPr>
           <w:p>
             <w:pPr>
-              <w:spacing w:after="0" w:line="240" w:lineRule="auto"/>
-              <w:rPr>
-                <w:rFonts w:eastAsia="Aptos"/>
-              </w:rPr>
-            </w:pPr>
-            <w:r>
-              <w:rPr>
-                <w:rFonts w:eastAsia="Aptos"/>
+              <w:pStyle w:val="Normal"/>
+              <w:widowControl/>
+              <w:suppressAutoHyphens w:val="true"/>
+              <w:spacing w:lineRule="auto" w:line="240" w:before="0" w:after="0"/>
+              <w:jc w:val="left"/>
+              <w:rPr>
+                <w:rFonts w:eastAsia="Aptos"/>
+              </w:rPr>
+            </w:pPr>
+            <w:r>
+              <w:rPr>
+                <w:rFonts w:eastAsia="Aptos" w:cs=""/>
+                <w:kern w:val="2"/>
+                <w:sz w:val="24"/>
+                <w:szCs w:val="24"/>
+                <w:lang w:val="de-DE" w:eastAsia="en-US" w:bidi="ar-SA"/>
               </w:rPr>
               <w:t>Audio FX für laufen, einsammeln, ablegen, task passed</w:t>
             </w:r>
@@ -1223,7 +1691,11 @@
           </w:tcPr>
           <w:p>
             <w:pPr>
-              <w:spacing w:after="0" w:line="240" w:lineRule="auto"/>
+              <w:pStyle w:val="Normal"/>
+              <w:widowControl/>
+              <w:suppressAutoHyphens w:val="true"/>
+              <w:spacing w:lineRule="auto" w:line="240" w:before="0" w:after="0"/>
+              <w:jc w:val="left"/>
               <w:rPr>
                 <w:rFonts w:eastAsia="Aptos"/>
                 <w:lang w:val="en-US"/>
@@ -1231,7 +1703,11 @@
             </w:pPr>
             <w:r>
               <w:rPr>
-                <w:rFonts w:eastAsia="Aptos"/>
+                <w:rFonts w:eastAsia="Aptos" w:cs=""/>
+                <w:kern w:val="2"/>
+                <w:sz w:val="24"/>
+                <w:szCs w:val="24"/>
+                <w:lang w:val="de-DE" w:eastAsia="en-US" w:bidi="ar-SA"/>
               </w:rPr>
               <w:t>Besseres Interaction Feedback</w:t>
             </w:r>
@@ -1246,14 +1722,22 @@
           </w:tcPr>
           <w:p>
             <w:pPr>
-              <w:spacing w:after="0" w:line="240" w:lineRule="auto"/>
-              <w:rPr>
-                <w:rFonts w:eastAsia="Aptos"/>
-              </w:rPr>
-            </w:pPr>
-            <w:r>
-              <w:rPr>
-                <w:rFonts w:eastAsia="Aptos"/>
+              <w:pStyle w:val="Normal"/>
+              <w:widowControl/>
+              <w:suppressAutoHyphens w:val="true"/>
+              <w:spacing w:lineRule="auto" w:line="240" w:before="0" w:after="0"/>
+              <w:jc w:val="left"/>
+              <w:rPr>
+                <w:rFonts w:eastAsia="Aptos"/>
+              </w:rPr>
+            </w:pPr>
+            <w:r>
+              <w:rPr>
+                <w:rFonts w:eastAsia="Aptos" w:cs=""/>
+                <w:kern w:val="2"/>
+                <w:sz w:val="24"/>
+                <w:szCs w:val="24"/>
+                <w:lang w:val="de-DE" w:eastAsia="en-US" w:bidi="ar-SA"/>
               </w:rPr>
               <w:t>Luise Münchgesang</w:t>
             </w:r>
@@ -1261,6 +1745,7 @@
         </w:tc>
       </w:tr>
       <w:tr>
+        <w:trPr/>
         <w:tc>
           <w:tcPr>
             <w:tcW w:w="1526" w:type="dxa"/>
@@ -1270,14 +1755,22 @@
           </w:tcPr>
           <w:p>
             <w:pPr>
-              <w:spacing w:after="0" w:line="240" w:lineRule="auto"/>
-              <w:rPr>
-                <w:rFonts w:eastAsia="Aptos"/>
-              </w:rPr>
-            </w:pPr>
-            <w:r>
-              <w:rPr>
-                <w:rFonts w:eastAsia="Aptos"/>
+              <w:pStyle w:val="Normal"/>
+              <w:widowControl/>
+              <w:suppressAutoHyphens w:val="true"/>
+              <w:spacing w:lineRule="auto" w:line="240" w:before="0" w:after="0"/>
+              <w:jc w:val="left"/>
+              <w:rPr>
+                <w:rFonts w:eastAsia="Aptos"/>
+              </w:rPr>
+            </w:pPr>
+            <w:r>
+              <w:rPr>
+                <w:rFonts w:eastAsia="Aptos" w:cs=""/>
+                <w:kern w:val="2"/>
+                <w:sz w:val="24"/>
+                <w:szCs w:val="24"/>
+                <w:lang w:val="de-DE" w:eastAsia="en-US" w:bidi="ar-SA"/>
               </w:rPr>
               <w:t>10.05.2026</w:t>
             </w:r>
@@ -1285,21 +1778,29 @@
         </w:tc>
         <w:tc>
           <w:tcPr>
-            <w:tcW w:w="3006" w:type="dxa"/>
+            <w:tcW w:w="3005" w:type="dxa"/>
             <w:tcBorders>
               <w:top w:val="nil"/>
             </w:tcBorders>
           </w:tcPr>
           <w:p>
             <w:pPr>
-              <w:spacing w:after="0" w:line="240" w:lineRule="auto"/>
-              <w:rPr>
-                <w:rFonts w:eastAsia="Aptos"/>
-              </w:rPr>
-            </w:pPr>
-            <w:r>
-              <w:rPr>
-                <w:rFonts w:eastAsia="Aptos"/>
+              <w:pStyle w:val="Normal"/>
+              <w:widowControl/>
+              <w:suppressAutoHyphens w:val="true"/>
+              <w:spacing w:lineRule="auto" w:line="240" w:before="0" w:after="0"/>
+              <w:jc w:val="left"/>
+              <w:rPr>
+                <w:rFonts w:eastAsia="Aptos"/>
+              </w:rPr>
+            </w:pPr>
+            <w:r>
+              <w:rPr>
+                <w:rFonts w:eastAsia="Aptos" w:cs=""/>
+                <w:kern w:val="2"/>
+                <w:sz w:val="24"/>
+                <w:szCs w:val="24"/>
+                <w:lang w:val="de-DE" w:eastAsia="en-US" w:bidi="ar-SA"/>
               </w:rPr>
               <w:t>Bug fix: Früchte wieder sichtbar</w:t>
             </w:r>
@@ -1314,28 +1815,24 @@
           </w:tcPr>
           <w:p>
             <w:pPr>
-              <w:spacing w:after="0" w:line="240" w:lineRule="auto"/>
-              <w:rPr>
-                <w:rFonts w:eastAsia="Aptos"/>
-              </w:rPr>
-            </w:pPr>
-            <w:r>
-              <w:rPr>
-                <w:rFonts w:eastAsia="Aptos"/>
-              </w:rPr>
-              <w:t>Bug</w:t>
-            </w:r>
-            <w:r>
-              <w:rPr>
-                <w:rFonts w:eastAsia="Aptos"/>
-              </w:rPr>
-              <w:t xml:space="preserve"> </w:t>
-            </w:r>
-            <w:r>
-              <w:rPr>
-                <w:rFonts w:eastAsia="Aptos"/>
-              </w:rPr>
-              <w:t>fix</w:t>
+              <w:pStyle w:val="Normal"/>
+              <w:widowControl/>
+              <w:suppressAutoHyphens w:val="true"/>
+              <w:spacing w:lineRule="auto" w:line="240" w:before="0" w:after="0"/>
+              <w:jc w:val="left"/>
+              <w:rPr>
+                <w:rFonts w:eastAsia="Aptos"/>
+              </w:rPr>
+            </w:pPr>
+            <w:r>
+              <w:rPr>
+                <w:rFonts w:eastAsia="Aptos" w:cs=""/>
+                <w:kern w:val="2"/>
+                <w:sz w:val="24"/>
+                <w:szCs w:val="24"/>
+                <w:lang w:val="de-DE" w:eastAsia="en-US" w:bidi="ar-SA"/>
+              </w:rPr>
+              <w:t>Bug fix</w:t>
             </w:r>
           </w:p>
         </w:tc>
@@ -1348,14 +1845,22 @@
           </w:tcPr>
           <w:p>
             <w:pPr>
-              <w:spacing w:after="0" w:line="240" w:lineRule="auto"/>
-              <w:rPr>
-                <w:rFonts w:eastAsia="Aptos"/>
-              </w:rPr>
-            </w:pPr>
-            <w:r>
-              <w:rPr>
-                <w:rFonts w:eastAsia="Aptos"/>
+              <w:pStyle w:val="Normal"/>
+              <w:widowControl/>
+              <w:suppressAutoHyphens w:val="true"/>
+              <w:spacing w:lineRule="auto" w:line="240" w:before="0" w:after="0"/>
+              <w:jc w:val="left"/>
+              <w:rPr>
+                <w:rFonts w:eastAsia="Aptos"/>
+              </w:rPr>
+            </w:pPr>
+            <w:r>
+              <w:rPr>
+                <w:rFonts w:eastAsia="Aptos" w:cs=""/>
+                <w:kern w:val="2"/>
+                <w:sz w:val="24"/>
+                <w:szCs w:val="24"/>
+                <w:lang w:val="de-DE" w:eastAsia="en-US" w:bidi="ar-SA"/>
               </w:rPr>
               <w:t>Luise Münchgesang</w:t>
             </w:r>
@@ -1363,6 +1868,7 @@
         </w:tc>
       </w:tr>
       <w:tr>
+        <w:trPr/>
         <w:tc>
           <w:tcPr>
             <w:tcW w:w="1526" w:type="dxa"/>
@@ -1372,37 +1878,52 @@
           </w:tcPr>
           <w:p>
             <w:pPr>
-              <w:spacing w:after="0" w:line="240" w:lineRule="auto"/>
-              <w:rPr>
-                <w:rFonts w:eastAsia="Aptos"/>
-              </w:rPr>
-            </w:pPr>
-            <w:r>
-              <w:rPr>
-                <w:rFonts w:eastAsia="Aptos"/>
-              </w:rPr>
-              <w:lastRenderedPageBreak/>
+              <w:pStyle w:val="Normal"/>
+              <w:widowControl/>
+              <w:suppressAutoHyphens w:val="true"/>
+              <w:spacing w:lineRule="auto" w:line="240" w:before="0" w:after="0"/>
+              <w:jc w:val="left"/>
+              <w:rPr>
+                <w:rFonts w:eastAsia="Aptos"/>
+              </w:rPr>
+            </w:pPr>
+            <w:r>
+              <w:rPr>
+                <w:rFonts w:eastAsia="Aptos" w:cs=""/>
+                <w:kern w:val="2"/>
+                <w:sz w:val="24"/>
+                <w:szCs w:val="24"/>
+                <w:lang w:val="de-DE" w:eastAsia="en-US" w:bidi="ar-SA"/>
+              </w:rPr>
               <w:t>10.05.2026</w:t>
             </w:r>
           </w:p>
         </w:tc>
         <w:tc>
           <w:tcPr>
-            <w:tcW w:w="3006" w:type="dxa"/>
+            <w:tcW w:w="3005" w:type="dxa"/>
             <w:tcBorders>
               <w:top w:val="nil"/>
             </w:tcBorders>
           </w:tcPr>
           <w:p>
             <w:pPr>
-              <w:spacing w:after="0" w:line="240" w:lineRule="auto"/>
-              <w:rPr>
-                <w:rFonts w:eastAsia="Aptos"/>
-              </w:rPr>
-            </w:pPr>
-            <w:r>
-              <w:rPr>
-                <w:rFonts w:eastAsia="Aptos"/>
+              <w:pStyle w:val="Normal"/>
+              <w:widowControl/>
+              <w:suppressAutoHyphens w:val="true"/>
+              <w:spacing w:lineRule="auto" w:line="240" w:before="0" w:after="0"/>
+              <w:jc w:val="left"/>
+              <w:rPr>
+                <w:rFonts w:eastAsia="Aptos"/>
+              </w:rPr>
+            </w:pPr>
+            <w:r>
+              <w:rPr>
+                <w:rFonts w:eastAsia="Aptos" w:cs=""/>
+                <w:kern w:val="2"/>
+                <w:sz w:val="24"/>
+                <w:szCs w:val="24"/>
+                <w:lang w:val="de-DE" w:eastAsia="en-US" w:bidi="ar-SA"/>
               </w:rPr>
               <w:t>Spielbeschreibung im Hauptmenü ergänzt</w:t>
             </w:r>
@@ -1417,14 +1938,22 @@
           </w:tcPr>
           <w:p>
             <w:pPr>
-              <w:spacing w:after="0" w:line="240" w:lineRule="auto"/>
-              <w:rPr>
-                <w:rFonts w:eastAsia="Aptos"/>
-              </w:rPr>
-            </w:pPr>
-            <w:r>
-              <w:rPr>
-                <w:rFonts w:eastAsia="Aptos"/>
+              <w:pStyle w:val="Normal"/>
+              <w:widowControl/>
+              <w:suppressAutoHyphens w:val="true"/>
+              <w:spacing w:lineRule="auto" w:line="240" w:before="0" w:after="0"/>
+              <w:jc w:val="left"/>
+              <w:rPr>
+                <w:rFonts w:eastAsia="Aptos"/>
+              </w:rPr>
+            </w:pPr>
+            <w:r>
+              <w:rPr>
+                <w:rFonts w:eastAsia="Aptos" w:cs=""/>
+                <w:kern w:val="2"/>
+                <w:sz w:val="24"/>
+                <w:szCs w:val="24"/>
+                <w:lang w:val="de-DE" w:eastAsia="en-US" w:bidi="ar-SA"/>
               </w:rPr>
               <w:t>Erleichtern des Starts in das Spiel</w:t>
             </w:r>
@@ -1439,14 +1968,22 @@
           </w:tcPr>
           <w:p>
             <w:pPr>
-              <w:spacing w:after="0" w:line="240" w:lineRule="auto"/>
-              <w:rPr>
-                <w:rFonts w:eastAsia="Aptos"/>
-              </w:rPr>
-            </w:pPr>
-            <w:r>
-              <w:rPr>
-                <w:rFonts w:eastAsia="Aptos"/>
+              <w:pStyle w:val="Normal"/>
+              <w:widowControl/>
+              <w:suppressAutoHyphens w:val="true"/>
+              <w:spacing w:lineRule="auto" w:line="240" w:before="0" w:after="0"/>
+              <w:jc w:val="left"/>
+              <w:rPr>
+                <w:rFonts w:eastAsia="Aptos"/>
+              </w:rPr>
+            </w:pPr>
+            <w:r>
+              <w:rPr>
+                <w:rFonts w:eastAsia="Aptos" w:cs=""/>
+                <w:kern w:val="2"/>
+                <w:sz w:val="24"/>
+                <w:szCs w:val="24"/>
+                <w:lang w:val="de-DE" w:eastAsia="en-US" w:bidi="ar-SA"/>
               </w:rPr>
               <w:t>Luise Münchgesang</w:t>
             </w:r>
@@ -1454,6 +1991,7 @@
         </w:tc>
       </w:tr>
       <w:tr>
+        <w:trPr/>
         <w:tc>
           <w:tcPr>
             <w:tcW w:w="1526" w:type="dxa"/>
@@ -1463,14 +2001,22 @@
           </w:tcPr>
           <w:p>
             <w:pPr>
-              <w:spacing w:after="0" w:line="240" w:lineRule="auto"/>
-              <w:rPr>
-                <w:rFonts w:eastAsia="Aptos"/>
-              </w:rPr>
-            </w:pPr>
-            <w:r>
-              <w:rPr>
-                <w:rFonts w:eastAsia="Aptos"/>
+              <w:pStyle w:val="Normal"/>
+              <w:widowControl/>
+              <w:suppressAutoHyphens w:val="true"/>
+              <w:spacing w:lineRule="auto" w:line="240" w:before="0" w:after="0"/>
+              <w:jc w:val="left"/>
+              <w:rPr>
+                <w:rFonts w:eastAsia="Aptos"/>
+              </w:rPr>
+            </w:pPr>
+            <w:r>
+              <w:rPr>
+                <w:rFonts w:eastAsia="Aptos" w:cs=""/>
+                <w:kern w:val="2"/>
+                <w:sz w:val="24"/>
+                <w:szCs w:val="24"/>
+                <w:lang w:val="de-DE" w:eastAsia="en-US" w:bidi="ar-SA"/>
               </w:rPr>
               <w:t>10.05.2026</w:t>
             </w:r>
@@ -1478,23 +2024,31 @@
         </w:tc>
         <w:tc>
           <w:tcPr>
-            <w:tcW w:w="3006" w:type="dxa"/>
+            <w:tcW w:w="3005" w:type="dxa"/>
             <w:tcBorders>
               <w:top w:val="nil"/>
             </w:tcBorders>
           </w:tcPr>
           <w:p>
             <w:pPr>
-              <w:spacing w:after="0" w:line="240" w:lineRule="auto"/>
-              <w:rPr>
-                <w:rFonts w:eastAsia="Aptos"/>
-              </w:rPr>
-            </w:pPr>
-            <w:r>
-              <w:rPr>
-                <w:rFonts w:eastAsia="Aptos"/>
-              </w:rPr>
-              <w:t xml:space="preserve">Hilfe Button im spiel ergänzt + Erk,lärungen </w:t>
+              <w:pStyle w:val="Normal"/>
+              <w:widowControl/>
+              <w:suppressAutoHyphens w:val="true"/>
+              <w:spacing w:lineRule="auto" w:line="240" w:before="0" w:after="0"/>
+              <w:jc w:val="left"/>
+              <w:rPr>
+                <w:rFonts w:eastAsia="Aptos"/>
+              </w:rPr>
+            </w:pPr>
+            <w:r>
+              <w:rPr>
+                <w:rFonts w:eastAsia="Aptos" w:cs=""/>
+                <w:kern w:val="2"/>
+                <w:sz w:val="24"/>
+                <w:szCs w:val="24"/>
+                <w:lang w:val="de-DE" w:eastAsia="en-US" w:bidi="ar-SA"/>
+              </w:rPr>
+              <w:t>Hilfe Button im spiel ergänzt + Erk,lärungen</w:t>
             </w:r>
           </w:p>
         </w:tc>
@@ -1507,14 +2061,22 @@
           </w:tcPr>
           <w:p>
             <w:pPr>
-              <w:spacing w:after="0" w:line="240" w:lineRule="auto"/>
-              <w:rPr>
-                <w:rFonts w:eastAsia="Aptos"/>
-              </w:rPr>
-            </w:pPr>
-            <w:r>
-              <w:rPr>
-                <w:rFonts w:eastAsia="Aptos"/>
+              <w:pStyle w:val="Normal"/>
+              <w:widowControl/>
+              <w:suppressAutoHyphens w:val="true"/>
+              <w:spacing w:lineRule="auto" w:line="240" w:before="0" w:after="0"/>
+              <w:jc w:val="left"/>
+              <w:rPr>
+                <w:rFonts w:eastAsia="Aptos"/>
+              </w:rPr>
+            </w:pPr>
+            <w:r>
+              <w:rPr>
+                <w:rFonts w:eastAsia="Aptos" w:cs=""/>
+                <w:kern w:val="2"/>
+                <w:sz w:val="24"/>
+                <w:szCs w:val="24"/>
+                <w:lang w:val="de-DE" w:eastAsia="en-US" w:bidi="ar-SA"/>
               </w:rPr>
               <w:t>Besseres Spielverständniss</w:t>
             </w:r>
@@ -1529,14 +2091,22 @@
           </w:tcPr>
           <w:p>
             <w:pPr>
-              <w:spacing w:after="0" w:line="240" w:lineRule="auto"/>
-              <w:rPr>
-                <w:rFonts w:eastAsia="Aptos"/>
-              </w:rPr>
-            </w:pPr>
-            <w:r>
-              <w:rPr>
-                <w:rFonts w:eastAsia="Aptos"/>
+              <w:pStyle w:val="Normal"/>
+              <w:widowControl/>
+              <w:suppressAutoHyphens w:val="true"/>
+              <w:spacing w:lineRule="auto" w:line="240" w:before="0" w:after="0"/>
+              <w:jc w:val="left"/>
+              <w:rPr>
+                <w:rFonts w:eastAsia="Aptos"/>
+              </w:rPr>
+            </w:pPr>
+            <w:r>
+              <w:rPr>
+                <w:rFonts w:eastAsia="Aptos" w:cs=""/>
+                <w:kern w:val="2"/>
+                <w:sz w:val="24"/>
+                <w:szCs w:val="24"/>
+                <w:lang w:val="de-DE" w:eastAsia="en-US" w:bidi="ar-SA"/>
               </w:rPr>
               <w:t>Luise Münchgesang</w:t>
             </w:r>
@@ -1544,6 +2114,7 @@
         </w:tc>
       </w:tr>
       <w:tr>
+        <w:trPr/>
         <w:tc>
           <w:tcPr>
             <w:tcW w:w="1526" w:type="dxa"/>
@@ -1553,38 +2124,54 @@
           </w:tcPr>
           <w:p>
             <w:pPr>
-              <w:spacing w:after="0" w:line="240" w:lineRule="auto"/>
-              <w:rPr>
-                <w:rFonts w:eastAsia="Aptos"/>
-              </w:rPr>
-            </w:pPr>
-            <w:r>
-              <w:rPr>
-                <w:rFonts w:eastAsia="Aptos"/>
-              </w:rPr>
-              <w:t>11.05.2026</w:t>
-            </w:r>
-          </w:p>
-        </w:tc>
-        <w:tc>
-          <w:tcPr>
-            <w:tcW w:w="3006" w:type="dxa"/>
+              <w:pStyle w:val="Normal"/>
+              <w:widowControl/>
+              <w:suppressAutoHyphens w:val="true"/>
+              <w:spacing w:lineRule="auto" w:line="240" w:before="0" w:after="0"/>
+              <w:jc w:val="left"/>
+              <w:rPr>
+                <w:rFonts w:eastAsia="Aptos"/>
+              </w:rPr>
+            </w:pPr>
+            <w:r>
+              <w:rPr>
+                <w:rFonts w:eastAsia="Aptos" w:cs=""/>
+                <w:kern w:val="2"/>
+                <w:sz w:val="24"/>
+                <w:szCs w:val="24"/>
+                <w:lang w:val="de-DE" w:eastAsia="en-US" w:bidi="ar-SA"/>
+              </w:rPr>
+              <w:t>--</w:t>
+            </w:r>
+          </w:p>
+        </w:tc>
+        <w:tc>
+          <w:tcPr>
+            <w:tcW w:w="3005" w:type="dxa"/>
             <w:tcBorders>
               <w:top w:val="nil"/>
             </w:tcBorders>
           </w:tcPr>
           <w:p>
             <w:pPr>
-              <w:spacing w:after="0" w:line="240" w:lineRule="auto"/>
-              <w:rPr>
-                <w:rFonts w:eastAsia="Aptos"/>
-              </w:rPr>
-            </w:pPr>
-            <w:r>
-              <w:rPr>
-                <w:rFonts w:eastAsia="Aptos"/>
-              </w:rPr>
-              <w:t>Interaktion mit Küchengeräten umstrukturiert</w:t>
+              <w:pStyle w:val="Normal"/>
+              <w:widowControl/>
+              <w:suppressAutoHyphens w:val="true"/>
+              <w:spacing w:lineRule="auto" w:line="240" w:before="0" w:after="0"/>
+              <w:jc w:val="left"/>
+              <w:rPr>
+                <w:rFonts w:eastAsia="Aptos"/>
+              </w:rPr>
+            </w:pPr>
+            <w:r>
+              <w:rPr>
+                <w:rFonts w:eastAsia="Aptos" w:cs=""/>
+                <w:kern w:val="2"/>
+                <w:sz w:val="24"/>
+                <w:szCs w:val="24"/>
+                <w:lang w:val="de-DE" w:eastAsia="en-US" w:bidi="ar-SA"/>
+              </w:rPr>
+              <w:t>Bug Fix: Früchte in Spieler Hand wieder sichtbar</w:t>
             </w:r>
           </w:p>
         </w:tc>
@@ -1597,16 +2184,24 @@
           </w:tcPr>
           <w:p>
             <w:pPr>
-              <w:spacing w:after="0" w:line="240" w:lineRule="auto"/>
-              <w:rPr>
-                <w:rFonts w:eastAsia="Aptos"/>
-              </w:rPr>
-            </w:pPr>
-            <w:r>
-              <w:rPr>
-                <w:rFonts w:eastAsia="Aptos"/>
-              </w:rPr>
-              <w:t>Vereinfacht Erweiterbarkeit</w:t>
+              <w:pStyle w:val="Normal"/>
+              <w:widowControl/>
+              <w:suppressAutoHyphens w:val="true"/>
+              <w:spacing w:lineRule="auto" w:line="240" w:before="0" w:after="0"/>
+              <w:jc w:val="left"/>
+              <w:rPr>
+                <w:rFonts w:eastAsia="Aptos"/>
+              </w:rPr>
+            </w:pPr>
+            <w:r>
+              <w:rPr>
+                <w:rFonts w:eastAsia="Aptos" w:cs=""/>
+                <w:kern w:val="2"/>
+                <w:sz w:val="24"/>
+                <w:szCs w:val="24"/>
+                <w:lang w:val="de-DE" w:eastAsia="en-US" w:bidi="ar-SA"/>
+              </w:rPr>
+              <w:t>Bug Fix</w:t>
             </w:r>
           </w:p>
         </w:tc>
@@ -1619,21 +2214,30 @@
           </w:tcPr>
           <w:p>
             <w:pPr>
-              <w:spacing w:after="0" w:line="240" w:lineRule="auto"/>
-              <w:rPr>
-                <w:rFonts w:eastAsia="Aptos"/>
-              </w:rPr>
-            </w:pPr>
-            <w:r>
-              <w:rPr>
-                <w:rFonts w:eastAsia="Aptos"/>
-              </w:rPr>
-              <w:t>Benedek Kovacs</w:t>
+              <w:pStyle w:val="Normal"/>
+              <w:widowControl/>
+              <w:suppressAutoHyphens w:val="true"/>
+              <w:spacing w:lineRule="auto" w:line="240" w:before="0" w:after="0"/>
+              <w:jc w:val="left"/>
+              <w:rPr>
+                <w:rFonts w:eastAsia="Aptos"/>
+              </w:rPr>
+            </w:pPr>
+            <w:r>
+              <w:rPr>
+                <w:rFonts w:eastAsia="Aptos" w:cs=""/>
+                <w:kern w:val="2"/>
+                <w:sz w:val="24"/>
+                <w:szCs w:val="24"/>
+                <w:lang w:val="de-DE" w:eastAsia="en-US" w:bidi="ar-SA"/>
+              </w:rPr>
+              <w:t>Luise Münchgesang</w:t>
             </w:r>
           </w:p>
         </w:tc>
       </w:tr>
       <w:tr>
+        <w:trPr/>
         <w:tc>
           <w:tcPr>
             <w:tcW w:w="1526" w:type="dxa"/>
@@ -1643,14 +2247,22 @@
           </w:tcPr>
           <w:p>
             <w:pPr>
-              <w:spacing w:after="0" w:line="240" w:lineRule="auto"/>
-              <w:rPr>
-                <w:rFonts w:eastAsia="Aptos"/>
-              </w:rPr>
-            </w:pPr>
-            <w:r>
-              <w:rPr>
-                <w:rFonts w:eastAsia="Aptos"/>
+              <w:pStyle w:val="Normal"/>
+              <w:widowControl/>
+              <w:suppressAutoHyphens w:val="true"/>
+              <w:spacing w:lineRule="auto" w:line="240" w:before="0" w:after="0"/>
+              <w:jc w:val="left"/>
+              <w:rPr>
+                <w:rFonts w:eastAsia="Aptos"/>
+              </w:rPr>
+            </w:pPr>
+            <w:r>
+              <w:rPr>
+                <w:rFonts w:eastAsia="Aptos" w:cs=""/>
+                <w:kern w:val="2"/>
+                <w:sz w:val="24"/>
+                <w:szCs w:val="24"/>
+                <w:lang w:val="de-DE" w:eastAsia="en-US" w:bidi="ar-SA"/>
               </w:rPr>
               <w:t>11.05.2026</w:t>
             </w:r>
@@ -1658,21 +2270,29 @@
         </w:tc>
         <w:tc>
           <w:tcPr>
-            <w:tcW w:w="3006" w:type="dxa"/>
+            <w:tcW w:w="3005" w:type="dxa"/>
             <w:tcBorders>
               <w:top w:val="nil"/>
             </w:tcBorders>
           </w:tcPr>
           <w:p>
             <w:pPr>
-              <w:spacing w:after="0" w:line="240" w:lineRule="auto"/>
-              <w:rPr>
-                <w:rFonts w:eastAsia="Aptos"/>
-              </w:rPr>
-            </w:pPr>
-            <w:r>
-              <w:rPr>
-                <w:rFonts w:eastAsia="Aptos"/>
+              <w:pStyle w:val="Normal"/>
+              <w:widowControl/>
+              <w:suppressAutoHyphens w:val="true"/>
+              <w:spacing w:lineRule="auto" w:line="240" w:before="0" w:after="0"/>
+              <w:jc w:val="left"/>
+              <w:rPr>
+                <w:rFonts w:eastAsia="Aptos"/>
+              </w:rPr>
+            </w:pPr>
+            <w:r>
+              <w:rPr>
+                <w:rFonts w:eastAsia="Aptos" w:cs=""/>
+                <w:kern w:val="2"/>
+                <w:sz w:val="24"/>
+                <w:szCs w:val="24"/>
+                <w:lang w:val="de-DE" w:eastAsia="en-US" w:bidi="ar-SA"/>
               </w:rPr>
               <w:t>Fruit spawn randomisation fix</w:t>
             </w:r>
@@ -1687,14 +2307,22 @@
           </w:tcPr>
           <w:p>
             <w:pPr>
-              <w:spacing w:after="0" w:line="240" w:lineRule="auto"/>
-              <w:rPr>
-                <w:rFonts w:eastAsia="Aptos"/>
-              </w:rPr>
-            </w:pPr>
-            <w:r>
-              <w:rPr>
-                <w:rFonts w:eastAsia="Aptos"/>
+              <w:pStyle w:val="Normal"/>
+              <w:widowControl/>
+              <w:suppressAutoHyphens w:val="true"/>
+              <w:spacing w:lineRule="auto" w:line="240" w:before="0" w:after="0"/>
+              <w:jc w:val="left"/>
+              <w:rPr>
+                <w:rFonts w:eastAsia="Aptos"/>
+              </w:rPr>
+            </w:pPr>
+            <w:r>
+              <w:rPr>
+                <w:rFonts w:eastAsia="Aptos" w:cs=""/>
+                <w:kern w:val="2"/>
+                <w:sz w:val="24"/>
+                <w:szCs w:val="24"/>
+                <w:lang w:val="de-DE" w:eastAsia="en-US" w:bidi="ar-SA"/>
               </w:rPr>
               <w:t>Frucht und spawn-cooldown pro ast waren zwischen spawns konstant, nicht zufällig</w:t>
             </w:r>
@@ -1709,14 +2337,22 @@
           </w:tcPr>
           <w:p>
             <w:pPr>
-              <w:spacing w:after="0" w:line="240" w:lineRule="auto"/>
-              <w:rPr>
-                <w:rFonts w:eastAsia="Aptos"/>
-              </w:rPr>
-            </w:pPr>
-            <w:r>
-              <w:rPr>
-                <w:rFonts w:eastAsia="Aptos"/>
+              <w:pStyle w:val="Normal"/>
+              <w:widowControl/>
+              <w:suppressAutoHyphens w:val="true"/>
+              <w:spacing w:lineRule="auto" w:line="240" w:before="0" w:after="0"/>
+              <w:jc w:val="left"/>
+              <w:rPr>
+                <w:rFonts w:eastAsia="Aptos"/>
+              </w:rPr>
+            </w:pPr>
+            <w:r>
+              <w:rPr>
+                <w:rFonts w:eastAsia="Aptos" w:cs=""/>
+                <w:kern w:val="2"/>
+                <w:sz w:val="24"/>
+                <w:szCs w:val="24"/>
+                <w:lang w:val="de-DE" w:eastAsia="en-US" w:bidi="ar-SA"/>
               </w:rPr>
               <w:t>Benedek Kovacs</w:t>
             </w:r>
@@ -1724,6 +2360,7 @@
         </w:tc>
       </w:tr>
       <w:tr>
+        <w:trPr/>
         <w:tc>
           <w:tcPr>
             <w:tcW w:w="1526" w:type="dxa"/>
@@ -1733,38 +2370,54 @@
           </w:tcPr>
           <w:p>
             <w:pPr>
-              <w:spacing w:after="0" w:line="240" w:lineRule="auto"/>
-              <w:rPr>
-                <w:rFonts w:eastAsia="Aptos"/>
-              </w:rPr>
-            </w:pPr>
-            <w:r>
-              <w:rPr>
-                <w:rFonts w:eastAsia="Aptos"/>
-              </w:rPr>
-              <w:t>--</w:t>
-            </w:r>
-          </w:p>
-        </w:tc>
-        <w:tc>
-          <w:tcPr>
-            <w:tcW w:w="3006" w:type="dxa"/>
+              <w:pStyle w:val="Normal"/>
+              <w:widowControl/>
+              <w:suppressAutoHyphens w:val="true"/>
+              <w:spacing w:lineRule="auto" w:line="240" w:before="0" w:after="0"/>
+              <w:jc w:val="left"/>
+              <w:rPr>
+                <w:rFonts w:eastAsia="Aptos"/>
+              </w:rPr>
+            </w:pPr>
+            <w:r>
+              <w:rPr>
+                <w:rFonts w:eastAsia="Aptos" w:cs=""/>
+                <w:kern w:val="2"/>
+                <w:sz w:val="24"/>
+                <w:szCs w:val="24"/>
+                <w:lang w:val="de-DE" w:eastAsia="en-US" w:bidi="ar-SA"/>
+              </w:rPr>
+              <w:t>11.05.2026</w:t>
+            </w:r>
+          </w:p>
+        </w:tc>
+        <w:tc>
+          <w:tcPr>
+            <w:tcW w:w="3005" w:type="dxa"/>
             <w:tcBorders>
               <w:top w:val="nil"/>
             </w:tcBorders>
           </w:tcPr>
           <w:p>
             <w:pPr>
-              <w:spacing w:after="0" w:line="240" w:lineRule="auto"/>
-              <w:rPr>
-                <w:rFonts w:eastAsia="Aptos"/>
-              </w:rPr>
-            </w:pPr>
-            <w:r>
-              <w:rPr>
-                <w:rFonts w:eastAsia="Aptos"/>
-              </w:rPr>
-              <w:t>Bug Fix: Früchte in Spieler Hand wieder sichtbar</w:t>
+              <w:pStyle w:val="Normal"/>
+              <w:widowControl/>
+              <w:suppressAutoHyphens w:val="true"/>
+              <w:spacing w:lineRule="auto" w:line="240" w:before="0" w:after="0"/>
+              <w:jc w:val="left"/>
+              <w:rPr>
+                <w:rFonts w:eastAsia="Aptos"/>
+              </w:rPr>
+            </w:pPr>
+            <w:r>
+              <w:rPr>
+                <w:rFonts w:eastAsia="Aptos" w:cs=""/>
+                <w:kern w:val="2"/>
+                <w:sz w:val="24"/>
+                <w:szCs w:val="24"/>
+                <w:lang w:val="de-DE" w:eastAsia="en-US" w:bidi="ar-SA"/>
+              </w:rPr>
+              <w:t>Positionierung der Kanne nach maschineninterasktionen angepasst</w:t>
             </w:r>
           </w:p>
         </w:tc>
@@ -1777,16 +2430,24 @@
           </w:tcPr>
           <w:p>
             <w:pPr>
-              <w:spacing w:after="0" w:line="240" w:lineRule="auto"/>
-              <w:rPr>
-                <w:rFonts w:eastAsia="Aptos"/>
-              </w:rPr>
-            </w:pPr>
-            <w:r>
-              <w:rPr>
-                <w:rFonts w:eastAsia="Aptos"/>
-              </w:rPr>
-              <w:t>Bug Fix</w:t>
+              <w:pStyle w:val="Normal"/>
+              <w:widowControl/>
+              <w:suppressAutoHyphens w:val="true"/>
+              <w:spacing w:lineRule="auto" w:line="240" w:before="0" w:after="0"/>
+              <w:jc w:val="left"/>
+              <w:rPr>
+                <w:rFonts w:eastAsia="Aptos"/>
+              </w:rPr>
+            </w:pPr>
+            <w:r>
+              <w:rPr>
+                <w:rFonts w:eastAsia="Aptos" w:cs=""/>
+                <w:kern w:val="2"/>
+                <w:sz w:val="24"/>
+                <w:szCs w:val="24"/>
+                <w:lang w:val="de-DE" w:eastAsia="en-US" w:bidi="ar-SA"/>
+              </w:rPr>
+              <w:t>Besseres spielgefühl</w:t>
             </w:r>
           </w:p>
         </w:tc>
@@ -1799,14 +2460,22 @@
           </w:tcPr>
           <w:p>
             <w:pPr>
-              <w:spacing w:after="0" w:line="240" w:lineRule="auto"/>
-              <w:rPr>
-                <w:rFonts w:eastAsia="Aptos"/>
-              </w:rPr>
-            </w:pPr>
-            <w:r>
-              <w:rPr>
-                <w:rFonts w:eastAsia="Aptos"/>
+              <w:pStyle w:val="Normal"/>
+              <w:widowControl/>
+              <w:suppressAutoHyphens w:val="true"/>
+              <w:spacing w:lineRule="auto" w:line="240" w:before="0" w:after="0"/>
+              <w:jc w:val="left"/>
+              <w:rPr>
+                <w:rFonts w:eastAsia="Aptos"/>
+              </w:rPr>
+            </w:pPr>
+            <w:r>
+              <w:rPr>
+                <w:rFonts w:eastAsia="Aptos" w:cs=""/>
+                <w:kern w:val="2"/>
+                <w:sz w:val="24"/>
+                <w:szCs w:val="24"/>
+                <w:lang w:val="de-DE" w:eastAsia="en-US" w:bidi="ar-SA"/>
               </w:rPr>
               <w:t>Luise Münchgesang</w:t>
             </w:r>
@@ -1814,6 +2483,7 @@
         </w:tc>
       </w:tr>
       <w:tr>
+        <w:trPr/>
         <w:tc>
           <w:tcPr>
             <w:tcW w:w="1526" w:type="dxa"/>
@@ -1823,27 +2493,53 @@
           </w:tcPr>
           <w:p>
             <w:pPr>
-              <w:spacing w:after="0" w:line="240" w:lineRule="auto"/>
-              <w:rPr>
-                <w:rFonts w:eastAsia="Aptos"/>
-              </w:rPr>
-            </w:pPr>
-          </w:p>
-        </w:tc>
-        <w:tc>
-          <w:tcPr>
-            <w:tcW w:w="3006" w:type="dxa"/>
+              <w:pStyle w:val="Normal"/>
+              <w:widowControl/>
+              <w:suppressAutoHyphens w:val="true"/>
+              <w:spacing w:lineRule="auto" w:line="240" w:before="0" w:after="0"/>
+              <w:jc w:val="left"/>
+              <w:rPr>
+                <w:rFonts w:eastAsia="Aptos"/>
+              </w:rPr>
+            </w:pPr>
+            <w:r>
+              <w:rPr>
+                <w:rFonts w:eastAsia="Aptos" w:cs=""/>
+                <w:kern w:val="2"/>
+                <w:sz w:val="24"/>
+                <w:szCs w:val="24"/>
+                <w:lang w:val="de-DE" w:eastAsia="en-US" w:bidi="ar-SA"/>
+              </w:rPr>
+            </w:r>
+          </w:p>
+        </w:tc>
+        <w:tc>
+          <w:tcPr>
+            <w:tcW w:w="3005" w:type="dxa"/>
             <w:tcBorders>
               <w:top w:val="nil"/>
             </w:tcBorders>
           </w:tcPr>
           <w:p>
             <w:pPr>
-              <w:spacing w:after="0" w:line="240" w:lineRule="auto"/>
-              <w:rPr>
-                <w:rFonts w:eastAsia="Aptos"/>
-              </w:rPr>
-            </w:pPr>
+              <w:pStyle w:val="Normal"/>
+              <w:widowControl/>
+              <w:suppressAutoHyphens w:val="true"/>
+              <w:spacing w:lineRule="auto" w:line="240" w:before="0" w:after="0"/>
+              <w:jc w:val="left"/>
+              <w:rPr>
+                <w:rFonts w:eastAsia="Aptos"/>
+              </w:rPr>
+            </w:pPr>
+            <w:r>
+              <w:rPr>
+                <w:rFonts w:eastAsia="Aptos" w:cs=""/>
+                <w:kern w:val="2"/>
+                <w:sz w:val="24"/>
+                <w:szCs w:val="24"/>
+                <w:lang w:val="de-DE" w:eastAsia="en-US" w:bidi="ar-SA"/>
+              </w:rPr>
+            </w:r>
           </w:p>
         </w:tc>
         <w:tc>
@@ -1855,11 +2551,24 @@
           </w:tcPr>
           <w:p>
             <w:pPr>
-              <w:spacing w:after="0" w:line="240" w:lineRule="auto"/>
-              <w:rPr>
-                <w:rFonts w:eastAsia="Aptos"/>
-              </w:rPr>
-            </w:pPr>
+              <w:pStyle w:val="Normal"/>
+              <w:widowControl/>
+              <w:suppressAutoHyphens w:val="true"/>
+              <w:spacing w:lineRule="auto" w:line="240" w:before="0" w:after="0"/>
+              <w:jc w:val="left"/>
+              <w:rPr>
+                <w:rFonts w:eastAsia="Aptos"/>
+              </w:rPr>
+            </w:pPr>
+            <w:r>
+              <w:rPr>
+                <w:rFonts w:eastAsia="Aptos" w:cs=""/>
+                <w:kern w:val="2"/>
+                <w:sz w:val="24"/>
+                <w:szCs w:val="24"/>
+                <w:lang w:val="de-DE" w:eastAsia="en-US" w:bidi="ar-SA"/>
+              </w:rPr>
+            </w:r>
           </w:p>
         </w:tc>
         <w:tc>
@@ -1871,34 +2580,61 @@
           </w:tcPr>
           <w:p>
             <w:pPr>
-              <w:spacing w:after="0" w:line="240" w:lineRule="auto"/>
-              <w:rPr>
-                <w:rFonts w:eastAsia="Aptos"/>
-              </w:rPr>
-            </w:pPr>
+              <w:pStyle w:val="Normal"/>
+              <w:widowControl/>
+              <w:suppressAutoHyphens w:val="true"/>
+              <w:spacing w:lineRule="auto" w:line="240" w:before="0" w:after="0"/>
+              <w:jc w:val="left"/>
+              <w:rPr>
+                <w:rFonts w:eastAsia="Aptos"/>
+              </w:rPr>
+            </w:pPr>
+            <w:r>
+              <w:rPr>
+                <w:rFonts w:eastAsia="Aptos" w:cs=""/>
+                <w:kern w:val="2"/>
+                <w:sz w:val="24"/>
+                <w:szCs w:val="24"/>
+                <w:lang w:val="de-DE" w:eastAsia="en-US" w:bidi="ar-SA"/>
+              </w:rPr>
+            </w:r>
           </w:p>
         </w:tc>
       </w:tr>
     </w:tbl>
-    <w:p/>
+    <w:p>
+      <w:pPr>
+        <w:pStyle w:val="Normal"/>
+        <w:widowControl/>
+        <w:suppressAutoHyphens w:val="true"/>
+        <w:bidi w:val="0"/>
+        <w:spacing w:lineRule="auto" w:line="278" w:before="0" w:after="160"/>
+        <w:jc w:val="left"/>
+        <w:rPr/>
+      </w:pPr>
+      <w:r>
+        <w:rPr/>
+      </w:r>
+    </w:p>
     <w:sectPr>
+      <w:type w:val="nextPage"/>
       <w:pgSz w:w="11906" w:h="16838"/>
-      <w:pgMar w:top="1417" w:right="1417" w:bottom="1134" w:left="1417" w:header="0" w:footer="0" w:gutter="0"/>
-      <w:pgNumType w:start="0"/>
-      <w:cols w:space="720"/>
-      <w:formProt w:val="0"/>
-      <w:docGrid w:linePitch="360"/>
+      <w:pgMar w:left="1417" w:right="1417" w:gutter="0" w:header="0" w:top="1417" w:footer="0" w:bottom="1134"/>
+      <w:pgNumType w:start="0" w:fmt="decimal"/>
+      <w:formProt w:val="false"/>
+      <w:textDirection w:val="lrTb"/>
+      <w:docGrid w:type="default" w:linePitch="360" w:charSpace="0"/>
     </w:sectPr>
   </w:body>
 </w:document>
 </file>
 
 <file path=word/styles.xml><?xml version="1.0" encoding="utf-8"?>
-<w:styles xmlns:mc="http://schemas.openxmlformats.org/markup-compatibility/2006" xmlns:r="http://schemas.openxmlformats.org/officeDocument/2006/relationships" xmlns:w="http://schemas.openxmlformats.org/wordprocessingml/2006/main" xmlns:w14="http://schemas.microsoft.com/office/word/2010/wordml" xmlns:w15="http://schemas.microsoft.com/office/word/2012/wordml" xmlns:w16cex="http://schemas.microsoft.com/office/word/2018/wordml/cex" xmlns:w16cid="http://schemas.microsoft.com/office/word/2016/wordml/cid" xmlns:w16="http://schemas.microsoft.com/office/word/2018/wordml" xmlns:w16du="http://schemas.microsoft.com/office/word/2023/wordml/word16du" xmlns:w16sdtdh="http://schemas.microsoft.com/office/word/2020/wordml/sdtdatahash" xmlns:w16sdtfl="http://schemas.microsoft.com/office/word/2024/wordml/sdtformatlock" xmlns:w16se="http://schemas.microsoft.com/office/word/2015/wordml/symex" mc:Ignorable="w14 w15 w16se w16cid w16 w16cex w16sdtdh w16sdtfl w16du">
+<w:styles xmlns:w="http://schemas.openxmlformats.org/wordprocessingml/2006/main" xmlns:w14="http://schemas.microsoft.com/office/word/2010/wordml" xmlns:mc="http://schemas.openxmlformats.org/markup-compatibility/2006" mc:Ignorable="w14">
   <w:docDefaults>
     <w:rPrDefault>
       <w:rPr>
-        <w:rFonts w:asciiTheme="minorHAnsi" w:eastAsiaTheme="minorHAnsi" w:hAnsiTheme="minorHAnsi" w:cstheme="minorBidi"/>
+        <w:rFonts w:ascii="Aptos" w:hAnsi="Aptos" w:eastAsia="Aptos" w:cs="" w:asciiTheme="minorHAnsi" w:cstheme="minorBidi" w:eastAsiaTheme="minorHAnsi" w:hAnsiTheme="minorHAnsi"/>
         <w:kern w:val="2"/>
         <w:sz w:val="24"/>
         <w:szCs w:val="24"/>
@@ -1908,21 +2644,21 @@
     </w:rPrDefault>
     <w:pPrDefault>
       <w:pPr>
-        <w:suppressAutoHyphens/>
+        <w:suppressAutoHyphens w:val="true"/>
       </w:pPr>
     </w:pPrDefault>
   </w:docDefaults>
   <w:latentStyles w:defLockedState="0" w:defUIPriority="99" w:defSemiHidden="0" w:defUnhideWhenUsed="0" w:defQFormat="0" w:count="376">
     <w:lsdException w:name="Normal" w:uiPriority="0" w:qFormat="1"/>
     <w:lsdException w:name="heading 1" w:uiPriority="9" w:qFormat="1"/>
-    <w:lsdException w:name="heading 2" w:semiHidden="1" w:uiPriority="9" w:unhideWhenUsed="1" w:qFormat="1"/>
-    <w:lsdException w:name="heading 3" w:semiHidden="1" w:uiPriority="9" w:unhideWhenUsed="1" w:qFormat="1"/>
-    <w:lsdException w:name="heading 4" w:semiHidden="1" w:uiPriority="9" w:unhideWhenUsed="1" w:qFormat="1"/>
-    <w:lsdException w:name="heading 5" w:semiHidden="1" w:uiPriority="9" w:unhideWhenUsed="1" w:qFormat="1"/>
-    <w:lsdException w:name="heading 6" w:semiHidden="1" w:uiPriority="9" w:unhideWhenUsed="1" w:qFormat="1"/>
-    <w:lsdException w:name="heading 7" w:semiHidden="1" w:uiPriority="9" w:unhideWhenUsed="1" w:qFormat="1"/>
-    <w:lsdException w:name="heading 8" w:semiHidden="1" w:uiPriority="9" w:unhideWhenUsed="1" w:qFormat="1"/>
-    <w:lsdException w:name="heading 9" w:semiHidden="1" w:uiPriority="9" w:unhideWhenUsed="1" w:qFormat="1"/>
+    <w:lsdException w:name="heading 2" w:uiPriority="9" w:semiHidden="1" w:unhideWhenUsed="1" w:qFormat="1"/>
+    <w:lsdException w:name="heading 3" w:uiPriority="9" w:semiHidden="1" w:unhideWhenUsed="1" w:qFormat="1"/>
+    <w:lsdException w:name="heading 4" w:uiPriority="9" w:semiHidden="1" w:unhideWhenUsed="1" w:qFormat="1"/>
+    <w:lsdException w:name="heading 5" w:uiPriority="9" w:semiHidden="1" w:unhideWhenUsed="1" w:qFormat="1"/>
+    <w:lsdException w:name="heading 6" w:uiPriority="9" w:semiHidden="1" w:unhideWhenUsed="1" w:qFormat="1"/>
+    <w:lsdException w:name="heading 7" w:uiPriority="9" w:semiHidden="1" w:unhideWhenUsed="1" w:qFormat="1"/>
+    <w:lsdException w:name="heading 8" w:uiPriority="9" w:semiHidden="1" w:unhideWhenUsed="1" w:qFormat="1"/>
+    <w:lsdException w:name="heading 9" w:uiPriority="9" w:semiHidden="1" w:unhideWhenUsed="1" w:qFormat="1"/>
     <w:lsdException w:name="index 1" w:semiHidden="1" w:unhideWhenUsed="1"/>
     <w:lsdException w:name="index 2" w:semiHidden="1" w:unhideWhenUsed="1"/>
     <w:lsdException w:name="index 3" w:semiHidden="1" w:unhideWhenUsed="1"/>
@@ -1932,22 +2668,22 @@
     <w:lsdException w:name="index 7" w:semiHidden="1" w:unhideWhenUsed="1"/>
     <w:lsdException w:name="index 8" w:semiHidden="1" w:unhideWhenUsed="1"/>
     <w:lsdException w:name="index 9" w:semiHidden="1" w:unhideWhenUsed="1"/>
-    <w:lsdException w:name="toc 1" w:semiHidden="1" w:uiPriority="39" w:unhideWhenUsed="1"/>
-    <w:lsdException w:name="toc 2" w:semiHidden="1" w:uiPriority="39" w:unhideWhenUsed="1"/>
-    <w:lsdException w:name="toc 3" w:semiHidden="1" w:uiPriority="39" w:unhideWhenUsed="1"/>
-    <w:lsdException w:name="toc 4" w:semiHidden="1" w:uiPriority="39" w:unhideWhenUsed="1"/>
-    <w:lsdException w:name="toc 5" w:semiHidden="1" w:uiPriority="39" w:unhideWhenUsed="1"/>
-    <w:lsdException w:name="toc 6" w:semiHidden="1" w:uiPriority="39" w:unhideWhenUsed="1"/>
-    <w:lsdException w:name="toc 7" w:semiHidden="1" w:uiPriority="39" w:unhideWhenUsed="1"/>
-    <w:lsdException w:name="toc 8" w:semiHidden="1" w:uiPriority="39" w:unhideWhenUsed="1"/>
-    <w:lsdException w:name="toc 9" w:semiHidden="1" w:uiPriority="39" w:unhideWhenUsed="1"/>
+    <w:lsdException w:name="toc 1" w:uiPriority="39" w:semiHidden="1" w:unhideWhenUsed="1"/>
+    <w:lsdException w:name="toc 2" w:uiPriority="39" w:semiHidden="1" w:unhideWhenUsed="1"/>
+    <w:lsdException w:name="toc 3" w:uiPriority="39" w:semiHidden="1" w:unhideWhenUsed="1"/>
+    <w:lsdException w:name="toc 4" w:uiPriority="39" w:semiHidden="1" w:unhideWhenUsed="1"/>
+    <w:lsdException w:name="toc 5" w:uiPriority="39" w:semiHidden="1" w:unhideWhenUsed="1"/>
+    <w:lsdException w:name="toc 6" w:uiPriority="39" w:semiHidden="1" w:unhideWhenUsed="1"/>
+    <w:lsdException w:name="toc 7" w:uiPriority="39" w:semiHidden="1" w:unhideWhenUsed="1"/>
+    <w:lsdException w:name="toc 8" w:uiPriority="39" w:semiHidden="1" w:unhideWhenUsed="1"/>
+    <w:lsdException w:name="toc 9" w:uiPriority="39" w:semiHidden="1" w:unhideWhenUsed="1"/>
     <w:lsdException w:name="Normal Indent" w:semiHidden="1" w:unhideWhenUsed="1"/>
     <w:lsdException w:name="footnote text" w:semiHidden="1" w:unhideWhenUsed="1"/>
     <w:lsdException w:name="annotation text" w:semiHidden="1" w:unhideWhenUsed="1"/>
     <w:lsdException w:name="header" w:semiHidden="1" w:unhideWhenUsed="1"/>
     <w:lsdException w:name="footer" w:semiHidden="1" w:unhideWhenUsed="1"/>
     <w:lsdException w:name="index heading" w:semiHidden="1" w:unhideWhenUsed="1"/>
-    <w:lsdException w:name="caption" w:semiHidden="1" w:uiPriority="35" w:unhideWhenUsed="1" w:qFormat="1"/>
+    <w:lsdException w:name="caption" w:uiPriority="35" w:semiHidden="1" w:unhideWhenUsed="1" w:qFormat="1"/>
     <w:lsdException w:name="table of figures" w:semiHidden="1" w:unhideWhenUsed="1"/>
     <w:lsdException w:name="envelope address" w:semiHidden="1" w:unhideWhenUsed="1"/>
     <w:lsdException w:name="envelope return" w:semiHidden="1" w:unhideWhenUsed="1"/>
@@ -1978,7 +2714,7 @@
     <w:lsdException w:name="Title" w:uiPriority="10" w:qFormat="1"/>
     <w:lsdException w:name="Closing" w:semiHidden="1" w:unhideWhenUsed="1"/>
     <w:lsdException w:name="Signature" w:semiHidden="1" w:unhideWhenUsed="1"/>
-    <w:lsdException w:name="Default Paragraph Font" w:semiHidden="1" w:uiPriority="1" w:unhideWhenUsed="1"/>
+    <w:lsdException w:name="Default Paragraph Font" w:uiPriority="1" w:semiHidden="1" w:unhideWhenUsed="1"/>
     <w:lsdException w:name="Body Text" w:semiHidden="1" w:unhideWhenUsed="1"/>
     <w:lsdException w:name="Body Text Indent" w:semiHidden="1" w:unhideWhenUsed="1"/>
     <w:lsdException w:name="List Continue" w:semiHidden="1" w:unhideWhenUsed="1"/>
@@ -2178,8 +2914,8 @@
     <w:lsdException w:name="Subtle Reference" w:uiPriority="31" w:qFormat="1"/>
     <w:lsdException w:name="Intense Reference" w:uiPriority="32" w:qFormat="1"/>
     <w:lsdException w:name="Book Title" w:uiPriority="33" w:qFormat="1"/>
-    <w:lsdException w:name="Bibliography" w:semiHidden="1" w:uiPriority="37" w:unhideWhenUsed="1"/>
-    <w:lsdException w:name="TOC Heading" w:semiHidden="1" w:uiPriority="39" w:unhideWhenUsed="1" w:qFormat="1"/>
+    <w:lsdException w:name="Bibliography" w:uiPriority="37" w:semiHidden="1" w:unhideWhenUsed="1"/>
+    <w:lsdException w:name="TOC Heading" w:uiPriority="39" w:semiHidden="1" w:unhideWhenUsed="1" w:qFormat="1"/>
     <w:lsdException w:name="Plain Table 1" w:uiPriority="41"/>
     <w:lsdException w:name="Plain Table 2" w:uiPriority="42"/>
     <w:lsdException w:name="Plain Table 3" w:uiPriority="43"/>
@@ -2290,12 +3026,25 @@
     <w:lsdException w:name="Unresolved Mention" w:semiHidden="1" w:unhideWhenUsed="1"/>
     <w:lsdException w:name="Smart Link" w:semiHidden="1" w:unhideWhenUsed="1"/>
   </w:latentStyles>
-  <w:style w:type="paragraph" w:default="1" w:styleId="Normal">
+  <w:style w:type="paragraph" w:styleId="Normal" w:default="1">
     <w:name w:val="Normal"/>
     <w:qFormat/>
     <w:pPr>
-      <w:spacing w:after="160" w:line="278" w:lineRule="auto"/>
+      <w:widowControl/>
+      <w:suppressAutoHyphens w:val="true"/>
+      <w:bidi w:val="0"/>
+      <w:spacing w:lineRule="auto" w:line="278" w:before="0" w:after="160"/>
+      <w:jc w:val="left"/>
     </w:pPr>
+    <w:rPr>
+      <w:rFonts w:ascii="Aptos" w:hAnsi="Aptos" w:eastAsia="Aptos" w:cs="" w:asciiTheme="minorHAnsi" w:cstheme="minorBidi" w:eastAsiaTheme="minorHAnsi" w:hAnsiTheme="minorHAnsi"/>
+      <w:color w:val="auto"/>
+      <w:kern w:val="2"/>
+      <w:sz w:val="24"/>
+      <w:szCs w:val="24"/>
+      <w:lang w:val="de-DE" w:eastAsia="en-US" w:bidi="ar-SA"/>
+      <w14:ligatures w14:val="standardContextual"/>
+    </w:rPr>
   </w:style>
   <w:style w:type="paragraph" w:styleId="Heading1">
     <w:name w:val="heading 1"/>
@@ -2304,16 +3053,16 @@
     <w:link w:val="Heading1Char"/>
     <w:uiPriority w:val="9"/>
     <w:qFormat/>
-    <w:rsid w:val="002026CA"/>
+    <w:rsid w:val="002026ca"/>
     <w:pPr>
-      <w:keepNext/>
+      <w:keepNext w:val="true"/>
       <w:keepLines/>
       <w:spacing w:before="360" w:after="80"/>
       <w:outlineLvl w:val="0"/>
     </w:pPr>
     <w:rPr>
-      <w:rFonts w:asciiTheme="majorHAnsi" w:eastAsiaTheme="majorEastAsia" w:hAnsiTheme="majorHAnsi" w:cstheme="majorBidi"/>
-      <w:color w:val="0F4761" w:themeColor="accent1" w:themeShade="BF"/>
+      <w:rFonts w:ascii="Aptos Display" w:hAnsi="Aptos Display" w:eastAsia="" w:cs="" w:asciiTheme="majorHAnsi" w:cstheme="majorBidi" w:eastAsiaTheme="majorEastAsia" w:hAnsiTheme="majorHAnsi"/>
+      <w:color w:themeColor="accent1" w:themeShade="bf" w:val="0F4761"/>
       <w:sz w:val="40"/>
       <w:szCs w:val="40"/>
     </w:rPr>
@@ -2327,16 +3076,16 @@
     <w:semiHidden/>
     <w:unhideWhenUsed/>
     <w:qFormat/>
-    <w:rsid w:val="002026CA"/>
+    <w:rsid w:val="002026ca"/>
     <w:pPr>
-      <w:keepNext/>
+      <w:keepNext w:val="true"/>
       <w:keepLines/>
       <w:spacing w:before="160" w:after="80"/>
       <w:outlineLvl w:val="1"/>
     </w:pPr>
     <w:rPr>
-      <w:rFonts w:asciiTheme="majorHAnsi" w:eastAsiaTheme="majorEastAsia" w:hAnsiTheme="majorHAnsi" w:cstheme="majorBidi"/>
-      <w:color w:val="0F4761" w:themeColor="accent1" w:themeShade="BF"/>
+      <w:rFonts w:ascii="Aptos Display" w:hAnsi="Aptos Display" w:eastAsia="" w:cs="" w:asciiTheme="majorHAnsi" w:cstheme="majorBidi" w:eastAsiaTheme="majorEastAsia" w:hAnsiTheme="majorHAnsi"/>
+      <w:color w:themeColor="accent1" w:themeShade="bf" w:val="0F4761"/>
       <w:sz w:val="32"/>
       <w:szCs w:val="32"/>
     </w:rPr>
@@ -2350,16 +3099,16 @@
     <w:semiHidden/>
     <w:unhideWhenUsed/>
     <w:qFormat/>
-    <w:rsid w:val="002026CA"/>
+    <w:rsid w:val="002026ca"/>
     <w:pPr>
-      <w:keepNext/>
+      <w:keepNext w:val="true"/>
       <w:keepLines/>
       <w:spacing w:before="160" w:after="80"/>
       <w:outlineLvl w:val="2"/>
     </w:pPr>
     <w:rPr>
-      <w:rFonts w:eastAsiaTheme="majorEastAsia" w:cstheme="majorBidi"/>
-      <w:color w:val="0F4761" w:themeColor="accent1" w:themeShade="BF"/>
+      <w:rFonts w:eastAsia="" w:cs="" w:cstheme="majorBidi" w:eastAsiaTheme="majorEastAsia"/>
+      <w:color w:themeColor="accent1" w:themeShade="bf" w:val="0F4761"/>
       <w:sz w:val="28"/>
       <w:szCs w:val="28"/>
     </w:rPr>
@@ -2373,18 +3122,18 @@
     <w:semiHidden/>
     <w:unhideWhenUsed/>
     <w:qFormat/>
-    <w:rsid w:val="002026CA"/>
+    <w:rsid w:val="002026ca"/>
     <w:pPr>
-      <w:keepNext/>
+      <w:keepNext w:val="true"/>
       <w:keepLines/>
       <w:spacing w:before="80" w:after="40"/>
       <w:outlineLvl w:val="3"/>
     </w:pPr>
     <w:rPr>
-      <w:rFonts w:eastAsiaTheme="majorEastAsia" w:cstheme="majorBidi"/>
+      <w:rFonts w:eastAsia="" w:cs="" w:cstheme="majorBidi" w:eastAsiaTheme="majorEastAsia"/>
       <w:i/>
       <w:iCs/>
-      <w:color w:val="0F4761" w:themeColor="accent1" w:themeShade="BF"/>
+      <w:color w:themeColor="accent1" w:themeShade="bf" w:val="0F4761"/>
     </w:rPr>
   </w:style>
   <w:style w:type="paragraph" w:styleId="Heading5">
@@ -2396,16 +3145,16 @@
     <w:semiHidden/>
     <w:unhideWhenUsed/>
     <w:qFormat/>
-    <w:rsid w:val="002026CA"/>
+    <w:rsid w:val="002026ca"/>
     <w:pPr>
-      <w:keepNext/>
+      <w:keepNext w:val="true"/>
       <w:keepLines/>
       <w:spacing w:before="80" w:after="40"/>
       <w:outlineLvl w:val="4"/>
     </w:pPr>
     <w:rPr>
-      <w:rFonts w:eastAsiaTheme="majorEastAsia" w:cstheme="majorBidi"/>
-      <w:color w:val="0F4761" w:themeColor="accent1" w:themeShade="BF"/>
+      <w:rFonts w:eastAsia="" w:cs="" w:cstheme="majorBidi" w:eastAsiaTheme="majorEastAsia"/>
+      <w:color w:themeColor="accent1" w:themeShade="bf" w:val="0F4761"/>
     </w:rPr>
   </w:style>
   <w:style w:type="paragraph" w:styleId="Heading6">
@@ -2417,18 +3166,18 @@
     <w:semiHidden/>
     <w:unhideWhenUsed/>
     <w:qFormat/>
-    <w:rsid w:val="002026CA"/>
+    <w:rsid w:val="002026ca"/>
     <w:pPr>
-      <w:keepNext/>
+      <w:keepNext w:val="true"/>
       <w:keepLines/>
       <w:spacing w:before="40" w:after="0"/>
       <w:outlineLvl w:val="5"/>
     </w:pPr>
     <w:rPr>
-      <w:rFonts w:eastAsiaTheme="majorEastAsia" w:cstheme="majorBidi"/>
+      <w:rFonts w:eastAsia="" w:cs="" w:cstheme="majorBidi" w:eastAsiaTheme="majorEastAsia"/>
       <w:i/>
       <w:iCs/>
-      <w:color w:val="595959" w:themeColor="text1" w:themeTint="A6"/>
+      <w:color w:themeColor="text1" w:themeTint="a6" w:val="595959"/>
     </w:rPr>
   </w:style>
   <w:style w:type="paragraph" w:styleId="Heading7">
@@ -2440,16 +3189,16 @@
     <w:semiHidden/>
     <w:unhideWhenUsed/>
     <w:qFormat/>
-    <w:rsid w:val="002026CA"/>
+    <w:rsid w:val="002026ca"/>
     <w:pPr>
-      <w:keepNext/>
+      <w:keepNext w:val="true"/>
       <w:keepLines/>
       <w:spacing w:before="40" w:after="0"/>
       <w:outlineLvl w:val="6"/>
     </w:pPr>
     <w:rPr>
-      <w:rFonts w:eastAsiaTheme="majorEastAsia" w:cstheme="majorBidi"/>
-      <w:color w:val="595959" w:themeColor="text1" w:themeTint="A6"/>
+      <w:rFonts w:eastAsia="" w:cs="" w:cstheme="majorBidi" w:eastAsiaTheme="majorEastAsia"/>
+      <w:color w:themeColor="text1" w:themeTint="a6" w:val="595959"/>
     </w:rPr>
   </w:style>
   <w:style w:type="paragraph" w:styleId="Heading8">
@@ -2461,18 +3210,18 @@
     <w:semiHidden/>
     <w:unhideWhenUsed/>
     <w:qFormat/>
-    <w:rsid w:val="002026CA"/>
+    <w:rsid w:val="002026ca"/>
     <w:pPr>
-      <w:keepNext/>
+      <w:keepNext w:val="true"/>
       <w:keepLines/>
-      <w:spacing w:after="0"/>
+      <w:spacing w:before="0" w:after="0"/>
       <w:outlineLvl w:val="7"/>
     </w:pPr>
     <w:rPr>
-      <w:rFonts w:eastAsiaTheme="majorEastAsia" w:cstheme="majorBidi"/>
+      <w:rFonts w:eastAsia="" w:cs="" w:cstheme="majorBidi" w:eastAsiaTheme="majorEastAsia"/>
       <w:i/>
       <w:iCs/>
-      <w:color w:val="272727" w:themeColor="text1" w:themeTint="D8"/>
+      <w:color w:themeColor="text1" w:themeTint="d8" w:val="272727"/>
     </w:rPr>
   </w:style>
   <w:style w:type="paragraph" w:styleId="Heading9">
@@ -2484,214 +3233,184 @@
     <w:semiHidden/>
     <w:unhideWhenUsed/>
     <w:qFormat/>
-    <w:rsid w:val="002026CA"/>
+    <w:rsid w:val="002026ca"/>
     <w:pPr>
-      <w:keepNext/>
+      <w:keepNext w:val="true"/>
       <w:keepLines/>
-      <w:spacing w:after="0"/>
+      <w:spacing w:before="0" w:after="0"/>
       <w:outlineLvl w:val="8"/>
     </w:pPr>
     <w:rPr>
-      <w:rFonts w:eastAsiaTheme="majorEastAsia" w:cstheme="majorBidi"/>
-      <w:color w:val="272727" w:themeColor="text1" w:themeTint="D8"/>
+      <w:rFonts w:eastAsia="" w:cs="" w:cstheme="majorBidi" w:eastAsiaTheme="majorEastAsia"/>
+      <w:color w:themeColor="text1" w:themeTint="d8" w:val="272727"/>
     </w:rPr>
   </w:style>
-  <w:style w:type="character" w:default="1" w:styleId="DefaultParagraphFont">
+  <w:style w:type="character" w:styleId="DefaultParagraphFont" w:default="1">
     <w:name w:val="Default Paragraph Font"/>
     <w:uiPriority w:val="1"/>
     <w:semiHidden/>
     <w:unhideWhenUsed/>
-  </w:style>
-  <w:style w:type="table" w:default="1" w:styleId="TableNormal">
-    <w:name w:val="Normal Table"/>
-    <w:uiPriority w:val="99"/>
-    <w:semiHidden/>
-    <w:unhideWhenUsed/>
-    <w:tblPr>
-      <w:tblInd w:w="0" w:type="dxa"/>
-      <w:tblCellMar>
-        <w:top w:w="0" w:type="dxa"/>
-        <w:left w:w="108" w:type="dxa"/>
-        <w:bottom w:w="0" w:type="dxa"/>
-        <w:right w:w="108" w:type="dxa"/>
-      </w:tblCellMar>
-    </w:tblPr>
-  </w:style>
-  <w:style w:type="numbering" w:default="1" w:styleId="NoList">
-    <w:name w:val="No List"/>
-    <w:uiPriority w:val="99"/>
-    <w:semiHidden/>
-    <w:unhideWhenUsed/>
-  </w:style>
-  <w:style w:type="character" w:customStyle="1" w:styleId="Heading1Char">
+    <w:qFormat/>
+    <w:rPr/>
+  </w:style>
+  <w:style w:type="character" w:styleId="Heading1Char" w:customStyle="1">
     <w:name w:val="Heading 1 Char"/>
     <w:basedOn w:val="DefaultParagraphFont"/>
-    <w:link w:val="Heading1"/>
     <w:uiPriority w:val="9"/>
     <w:qFormat/>
-    <w:rsid w:val="002026CA"/>
+    <w:rsid w:val="002026ca"/>
     <w:rPr>
-      <w:rFonts w:asciiTheme="majorHAnsi" w:eastAsiaTheme="majorEastAsia" w:hAnsiTheme="majorHAnsi" w:cstheme="majorBidi"/>
-      <w:color w:val="0F4761" w:themeColor="accent1" w:themeShade="BF"/>
+      <w:rFonts w:ascii="Aptos Display" w:hAnsi="Aptos Display" w:eastAsia="" w:cs="" w:asciiTheme="majorHAnsi" w:cstheme="majorBidi" w:eastAsiaTheme="majorEastAsia" w:hAnsiTheme="majorHAnsi"/>
+      <w:color w:themeColor="accent1" w:themeShade="bf" w:val="0F4761"/>
       <w:sz w:val="40"/>
       <w:szCs w:val="40"/>
     </w:rPr>
   </w:style>
-  <w:style w:type="character" w:customStyle="1" w:styleId="Heading2Char">
+  <w:style w:type="character" w:styleId="Heading2Char" w:customStyle="1">
     <w:name w:val="Heading 2 Char"/>
     <w:basedOn w:val="DefaultParagraphFont"/>
-    <w:link w:val="Heading2"/>
     <w:uiPriority w:val="9"/>
     <w:semiHidden/>
     <w:qFormat/>
-    <w:rsid w:val="002026CA"/>
+    <w:rsid w:val="002026ca"/>
     <w:rPr>
-      <w:rFonts w:asciiTheme="majorHAnsi" w:eastAsiaTheme="majorEastAsia" w:hAnsiTheme="majorHAnsi" w:cstheme="majorBidi"/>
-      <w:color w:val="0F4761" w:themeColor="accent1" w:themeShade="BF"/>
+      <w:rFonts w:ascii="Aptos Display" w:hAnsi="Aptos Display" w:eastAsia="" w:cs="" w:asciiTheme="majorHAnsi" w:cstheme="majorBidi" w:eastAsiaTheme="majorEastAsia" w:hAnsiTheme="majorHAnsi"/>
+      <w:color w:themeColor="accent1" w:themeShade="bf" w:val="0F4761"/>
       <w:sz w:val="32"/>
       <w:szCs w:val="32"/>
     </w:rPr>
   </w:style>
-  <w:style w:type="character" w:customStyle="1" w:styleId="Heading3Char">
+  <w:style w:type="character" w:styleId="Heading3Char" w:customStyle="1">
     <w:name w:val="Heading 3 Char"/>
     <w:basedOn w:val="DefaultParagraphFont"/>
-    <w:link w:val="Heading3"/>
     <w:uiPriority w:val="9"/>
     <w:semiHidden/>
     <w:qFormat/>
-    <w:rsid w:val="002026CA"/>
+    <w:rsid w:val="002026ca"/>
     <w:rPr>
-      <w:rFonts w:eastAsiaTheme="majorEastAsia" w:cstheme="majorBidi"/>
-      <w:color w:val="0F4761" w:themeColor="accent1" w:themeShade="BF"/>
+      <w:rFonts w:eastAsia="" w:cs="" w:cstheme="majorBidi" w:eastAsiaTheme="majorEastAsia"/>
+      <w:color w:themeColor="accent1" w:themeShade="bf" w:val="0F4761"/>
       <w:sz w:val="28"/>
       <w:szCs w:val="28"/>
     </w:rPr>
   </w:style>
-  <w:style w:type="character" w:customStyle="1" w:styleId="Heading4Char">
+  <w:style w:type="character" w:styleId="Heading4Char" w:customStyle="1">
     <w:name w:val="Heading 4 Char"/>
     <w:basedOn w:val="DefaultParagraphFont"/>
-    <w:link w:val="Heading4"/>
     <w:uiPriority w:val="9"/>
     <w:semiHidden/>
     <w:qFormat/>
-    <w:rsid w:val="002026CA"/>
+    <w:rsid w:val="002026ca"/>
     <w:rPr>
-      <w:rFonts w:eastAsiaTheme="majorEastAsia" w:cstheme="majorBidi"/>
+      <w:rFonts w:eastAsia="" w:cs="" w:cstheme="majorBidi" w:eastAsiaTheme="majorEastAsia"/>
       <w:i/>
       <w:iCs/>
-      <w:color w:val="0F4761" w:themeColor="accent1" w:themeShade="BF"/>
+      <w:color w:themeColor="accent1" w:themeShade="bf" w:val="0F4761"/>
     </w:rPr>
   </w:style>
-  <w:style w:type="character" w:customStyle="1" w:styleId="Heading5Char">
+  <w:style w:type="character" w:styleId="Heading5Char" w:customStyle="1">
     <w:name w:val="Heading 5 Char"/>
     <w:basedOn w:val="DefaultParagraphFont"/>
-    <w:link w:val="Heading5"/>
     <w:uiPriority w:val="9"/>
     <w:semiHidden/>
     <w:qFormat/>
-    <w:rsid w:val="002026CA"/>
+    <w:rsid w:val="002026ca"/>
     <w:rPr>
-      <w:rFonts w:eastAsiaTheme="majorEastAsia" w:cstheme="majorBidi"/>
-      <w:color w:val="0F4761" w:themeColor="accent1" w:themeShade="BF"/>
+      <w:rFonts w:eastAsia="" w:cs="" w:cstheme="majorBidi" w:eastAsiaTheme="majorEastAsia"/>
+      <w:color w:themeColor="accent1" w:themeShade="bf" w:val="0F4761"/>
     </w:rPr>
   </w:style>
-  <w:style w:type="character" w:customStyle="1" w:styleId="Heading6Char">
+  <w:style w:type="character" w:styleId="Heading6Char" w:customStyle="1">
     <w:name w:val="Heading 6 Char"/>
     <w:basedOn w:val="DefaultParagraphFont"/>
-    <w:link w:val="Heading6"/>
     <w:uiPriority w:val="9"/>
     <w:semiHidden/>
     <w:qFormat/>
-    <w:rsid w:val="002026CA"/>
+    <w:rsid w:val="002026ca"/>
     <w:rPr>
-      <w:rFonts w:eastAsiaTheme="majorEastAsia" w:cstheme="majorBidi"/>
+      <w:rFonts w:eastAsia="" w:cs="" w:cstheme="majorBidi" w:eastAsiaTheme="majorEastAsia"/>
       <w:i/>
       <w:iCs/>
-      <w:color w:val="595959" w:themeColor="text1" w:themeTint="A6"/>
+      <w:color w:themeColor="text1" w:themeTint="a6" w:val="595959"/>
     </w:rPr>
   </w:style>
-  <w:style w:type="character" w:customStyle="1" w:styleId="Heading7Char">
+  <w:style w:type="character" w:styleId="Heading7Char" w:customStyle="1">
     <w:name w:val="Heading 7 Char"/>
     <w:basedOn w:val="DefaultParagraphFont"/>
-    <w:link w:val="Heading7"/>
     <w:uiPriority w:val="9"/>
     <w:semiHidden/>
     <w:qFormat/>
-    <w:rsid w:val="002026CA"/>
+    <w:rsid w:val="002026ca"/>
     <w:rPr>
-      <w:rFonts w:eastAsiaTheme="majorEastAsia" w:cstheme="majorBidi"/>
-      <w:color w:val="595959" w:themeColor="text1" w:themeTint="A6"/>
+      <w:rFonts w:eastAsia="" w:cs="" w:cstheme="majorBidi" w:eastAsiaTheme="majorEastAsia"/>
+      <w:color w:themeColor="text1" w:themeTint="a6" w:val="595959"/>
     </w:rPr>
   </w:style>
-  <w:style w:type="character" w:customStyle="1" w:styleId="Heading8Char">
+  <w:style w:type="character" w:styleId="Heading8Char" w:customStyle="1">
     <w:name w:val="Heading 8 Char"/>
     <w:basedOn w:val="DefaultParagraphFont"/>
-    <w:link w:val="Heading8"/>
     <w:uiPriority w:val="9"/>
     <w:semiHidden/>
     <w:qFormat/>
-    <w:rsid w:val="002026CA"/>
+    <w:rsid w:val="002026ca"/>
     <w:rPr>
-      <w:rFonts w:eastAsiaTheme="majorEastAsia" w:cstheme="majorBidi"/>
+      <w:rFonts w:eastAsia="" w:cs="" w:cstheme="majorBidi" w:eastAsiaTheme="majorEastAsia"/>
       <w:i/>
       <w:iCs/>
-      <w:color w:val="272727" w:themeColor="text1" w:themeTint="D8"/>
+      <w:color w:themeColor="text1" w:themeTint="d8" w:val="272727"/>
     </w:rPr>
   </w:style>
-  <w:style w:type="character" w:customStyle="1" w:styleId="Heading9Char">
+  <w:style w:type="character" w:styleId="Heading9Char" w:customStyle="1">
     <w:name w:val="Heading 9 Char"/>
     <w:basedOn w:val="DefaultParagraphFont"/>
-    <w:link w:val="Heading9"/>
     <w:uiPriority w:val="9"/>
     <w:semiHidden/>
     <w:qFormat/>
-    <w:rsid w:val="002026CA"/>
+    <w:rsid w:val="002026ca"/>
     <w:rPr>
-      <w:rFonts w:eastAsiaTheme="majorEastAsia" w:cstheme="majorBidi"/>
-      <w:color w:val="272727" w:themeColor="text1" w:themeTint="D8"/>
+      <w:rFonts w:eastAsia="" w:cs="" w:cstheme="majorBidi" w:eastAsiaTheme="majorEastAsia"/>
+      <w:color w:themeColor="text1" w:themeTint="d8" w:val="272727"/>
     </w:rPr>
   </w:style>
-  <w:style w:type="character" w:customStyle="1" w:styleId="TitleChar">
+  <w:style w:type="character" w:styleId="TitleChar" w:customStyle="1">
     <w:name w:val="Title Char"/>
     <w:basedOn w:val="DefaultParagraphFont"/>
-    <w:link w:val="Title"/>
     <w:uiPriority w:val="10"/>
     <w:qFormat/>
-    <w:rsid w:val="002026CA"/>
+    <w:rsid w:val="002026ca"/>
     <w:rPr>
-      <w:rFonts w:asciiTheme="majorHAnsi" w:eastAsiaTheme="majorEastAsia" w:hAnsiTheme="majorHAnsi" w:cstheme="majorBidi"/>
+      <w:rFonts w:ascii="Aptos Display" w:hAnsi="Aptos Display" w:eastAsia="" w:cs="" w:asciiTheme="majorHAnsi" w:cstheme="majorBidi" w:eastAsiaTheme="majorEastAsia" w:hAnsiTheme="majorHAnsi"/>
       <w:spacing w:val="-10"/>
       <w:kern w:val="2"/>
       <w:sz w:val="56"/>
       <w:szCs w:val="56"/>
     </w:rPr>
   </w:style>
-  <w:style w:type="character" w:customStyle="1" w:styleId="SubtitleChar">
+  <w:style w:type="character" w:styleId="SubtitleChar" w:customStyle="1">
     <w:name w:val="Subtitle Char"/>
     <w:basedOn w:val="DefaultParagraphFont"/>
-    <w:link w:val="Subtitle"/>
     <w:uiPriority w:val="11"/>
     <w:qFormat/>
-    <w:rsid w:val="002026CA"/>
+    <w:rsid w:val="002026ca"/>
     <w:rPr>
-      <w:rFonts w:eastAsiaTheme="majorEastAsia" w:cstheme="majorBidi"/>
-      <w:color w:val="595959" w:themeColor="text1" w:themeTint="A6"/>
+      <w:rFonts w:eastAsia="" w:cs="" w:cstheme="majorBidi" w:eastAsiaTheme="majorEastAsia"/>
+      <w:color w:themeColor="text1" w:themeTint="a6" w:val="595959"/>
       <w:spacing w:val="15"/>
       <w:sz w:val="28"/>
       <w:szCs w:val="28"/>
     </w:rPr>
   </w:style>
-  <w:style w:type="character" w:customStyle="1" w:styleId="QuoteChar">
+  <w:style w:type="character" w:styleId="QuoteChar" w:customStyle="1">
     <w:name w:val="Quote Char"/>
     <w:basedOn w:val="DefaultParagraphFont"/>
     <w:link w:val="Quote"/>
     <w:uiPriority w:val="29"/>
     <w:qFormat/>
-    <w:rsid w:val="002026CA"/>
+    <w:rsid w:val="002026ca"/>
     <w:rPr>
       <w:i/>
       <w:iCs/>
-      <w:color w:val="404040" w:themeColor="text1" w:themeTint="BF"/>
+      <w:color w:themeColor="text1" w:themeTint="bf" w:val="404040"/>
     </w:rPr>
   </w:style>
   <w:style w:type="character" w:styleId="IntenseEmphasis">
@@ -2699,24 +3418,24 @@
     <w:basedOn w:val="DefaultParagraphFont"/>
     <w:uiPriority w:val="21"/>
     <w:qFormat/>
-    <w:rsid w:val="002026CA"/>
+    <w:rsid w:val="002026ca"/>
     <w:rPr>
       <w:i/>
       <w:iCs/>
-      <w:color w:val="0F4761" w:themeColor="accent1" w:themeShade="BF"/>
+      <w:color w:themeColor="accent1" w:themeShade="bf" w:val="0F4761"/>
     </w:rPr>
   </w:style>
-  <w:style w:type="character" w:customStyle="1" w:styleId="IntenseQuoteChar">
+  <w:style w:type="character" w:styleId="IntenseQuoteChar" w:customStyle="1">
     <w:name w:val="Intense Quote Char"/>
     <w:basedOn w:val="DefaultParagraphFont"/>
     <w:link w:val="IntenseQuote"/>
     <w:uiPriority w:val="30"/>
     <w:qFormat/>
-    <w:rsid w:val="002026CA"/>
+    <w:rsid w:val="002026ca"/>
     <w:rPr>
       <w:i/>
       <w:iCs/>
-      <w:color w:val="0F4761" w:themeColor="accent1" w:themeShade="BF"/>
+      <w:color w:themeColor="accent1" w:themeShade="bf" w:val="0F4761"/>
     </w:rPr>
   </w:style>
   <w:style w:type="character" w:styleId="IntenseReference">
@@ -2724,41 +3443,41 @@
     <w:basedOn w:val="DefaultParagraphFont"/>
     <w:uiPriority w:val="32"/>
     <w:qFormat/>
-    <w:rsid w:val="002026CA"/>
+    <w:rsid w:val="002026ca"/>
     <w:rPr>
       <w:b/>
       <w:bCs/>
       <w:smallCaps/>
-      <w:color w:val="0F4761" w:themeColor="accent1" w:themeShade="BF"/>
+      <w:color w:themeColor="accent1" w:themeShade="bf" w:val="0F4761"/>
       <w:spacing w:val="5"/>
     </w:rPr>
   </w:style>
-  <w:style w:type="character" w:customStyle="1" w:styleId="NoSpacingChar">
+  <w:style w:type="character" w:styleId="NoSpacingChar" w:customStyle="1">
     <w:name w:val="No Spacing Char"/>
     <w:basedOn w:val="DefaultParagraphFont"/>
     <w:link w:val="NoSpacing"/>
     <w:uiPriority w:val="1"/>
     <w:qFormat/>
-    <w:rsid w:val="00BB4392"/>
+    <w:rsid w:val="00bb4392"/>
     <w:rPr>
-      <w:rFonts w:eastAsiaTheme="minorEastAsia"/>
+      <w:rFonts w:eastAsia="" w:eastAsiaTheme="minorEastAsia"/>
       <w:kern w:val="0"/>
       <w:sz w:val="22"/>
       <w:szCs w:val="22"/>
       <w:lang w:eastAsia="de-DE"/>
     </w:rPr>
   </w:style>
-  <w:style w:type="paragraph" w:customStyle="1" w:styleId="berschrift">
+  <w:style w:type="paragraph" w:styleId="berschrift" w:customStyle="1">
     <w:name w:val="Überschrift"/>
     <w:basedOn w:val="Normal"/>
     <w:next w:val="BodyText"/>
     <w:qFormat/>
     <w:pPr>
-      <w:keepNext/>
+      <w:keepNext w:val="true"/>
       <w:spacing w:before="240" w:after="120"/>
     </w:pPr>
     <w:rPr>
-      <w:rFonts w:ascii="Liberation Sans" w:eastAsia="Microsoft YaHei" w:hAnsi="Liberation Sans" w:cs="Lucida Sans"/>
+      <w:rFonts w:ascii="Liberation Sans" w:hAnsi="Liberation Sans" w:eastAsia="Microsoft YaHei" w:cs="Lucida Sans"/>
       <w:sz w:val="28"/>
       <w:szCs w:val="28"/>
     </w:rPr>
@@ -2767,12 +3486,14 @@
     <w:name w:val="Body Text"/>
     <w:basedOn w:val="Normal"/>
     <w:pPr>
-      <w:spacing w:after="140" w:line="276" w:lineRule="auto"/>
+      <w:spacing w:lineRule="auto" w:line="276" w:before="0" w:after="140"/>
     </w:pPr>
+    <w:rPr/>
   </w:style>
   <w:style w:type="paragraph" w:styleId="List">
     <w:name w:val="List"/>
     <w:basedOn w:val="BodyText"/>
+    <w:pPr/>
     <w:rPr>
       <w:rFonts w:cs="Lucida Sans"/>
     </w:rPr>
@@ -2791,7 +3512,7 @@
       <w:iCs/>
     </w:rPr>
   </w:style>
-  <w:style w:type="paragraph" w:customStyle="1" w:styleId="Verzeichnis">
+  <w:style w:type="paragraph" w:styleId="Verzeichnis" w:customStyle="1">
     <w:name w:val="Verzeichnis"/>
     <w:basedOn w:val="Normal"/>
     <w:qFormat/>
@@ -2802,22 +3523,22 @@
       <w:rFonts w:cs="Lucida Sans"/>
     </w:rPr>
   </w:style>
-  <w:style w:type="paragraph" w:customStyle="1" w:styleId="berschriftuser">
+  <w:style w:type="paragraph" w:styleId="berschriftuser" w:customStyle="1">
     <w:name w:val="Überschrift (user)"/>
     <w:basedOn w:val="Normal"/>
     <w:next w:val="BodyText"/>
     <w:qFormat/>
     <w:pPr>
-      <w:keepNext/>
+      <w:keepNext w:val="true"/>
       <w:spacing w:before="240" w:after="120"/>
     </w:pPr>
     <w:rPr>
-      <w:rFonts w:ascii="Liberation Sans" w:eastAsia="Microsoft YaHei" w:hAnsi="Liberation Sans" w:cs="Lucida Sans"/>
+      <w:rFonts w:ascii="Liberation Sans" w:hAnsi="Liberation Sans" w:eastAsia="Microsoft YaHei" w:cs="Lucida Sans"/>
       <w:sz w:val="28"/>
       <w:szCs w:val="28"/>
     </w:rPr>
   </w:style>
-  <w:style w:type="paragraph" w:customStyle="1" w:styleId="Verzeichnisuser">
+  <w:style w:type="paragraph" w:styleId="Verzeichnisuser" w:customStyle="1">
     <w:name w:val="Verzeichnis (user)"/>
     <w:basedOn w:val="Normal"/>
     <w:qFormat/>
@@ -2835,13 +3556,13 @@
     <w:link w:val="TitleChar"/>
     <w:uiPriority w:val="10"/>
     <w:qFormat/>
-    <w:rsid w:val="002026CA"/>
+    <w:rsid w:val="002026ca"/>
     <w:pPr>
-      <w:spacing w:after="80" w:line="240" w:lineRule="auto"/>
+      <w:spacing w:lineRule="auto" w:line="240" w:before="0" w:after="80"/>
       <w:contextualSpacing/>
     </w:pPr>
     <w:rPr>
-      <w:rFonts w:asciiTheme="majorHAnsi" w:eastAsiaTheme="majorEastAsia" w:hAnsiTheme="majorHAnsi" w:cstheme="majorBidi"/>
+      <w:rFonts w:ascii="Aptos Display" w:hAnsi="Aptos Display" w:eastAsia="" w:cs="" w:asciiTheme="majorHAnsi" w:cstheme="majorBidi" w:eastAsiaTheme="majorEastAsia" w:hAnsiTheme="majorHAnsi"/>
       <w:spacing w:val="-10"/>
       <w:sz w:val="56"/>
       <w:szCs w:val="56"/>
@@ -2854,10 +3575,11 @@
     <w:link w:val="SubtitleChar"/>
     <w:uiPriority w:val="11"/>
     <w:qFormat/>
-    <w:rsid w:val="002026CA"/>
+    <w:rsid w:val="002026ca"/>
+    <w:pPr/>
     <w:rPr>
-      <w:rFonts w:eastAsiaTheme="majorEastAsia" w:cstheme="majorBidi"/>
-      <w:color w:val="595959" w:themeColor="text1" w:themeTint="A6"/>
+      <w:rFonts w:eastAsia="" w:cs="" w:cstheme="majorBidi" w:eastAsiaTheme="majorEastAsia"/>
+      <w:color w:themeColor="text1" w:themeTint="a6" w:val="595959"/>
       <w:spacing w:val="15"/>
       <w:sz w:val="28"/>
       <w:szCs w:val="28"/>
@@ -2870,15 +3592,15 @@
     <w:link w:val="QuoteChar"/>
     <w:uiPriority w:val="29"/>
     <w:qFormat/>
-    <w:rsid w:val="002026CA"/>
+    <w:rsid w:val="002026ca"/>
     <w:pPr>
-      <w:spacing w:before="160"/>
+      <w:spacing w:before="160" w:after="160"/>
       <w:jc w:val="center"/>
     </w:pPr>
     <w:rPr>
       <w:i/>
       <w:iCs/>
-      <w:color w:val="404040" w:themeColor="text1" w:themeTint="BF"/>
+      <w:color w:themeColor="text1" w:themeTint="bf" w:val="404040"/>
     </w:rPr>
   </w:style>
   <w:style w:type="paragraph" w:styleId="ListParagraph">
@@ -2886,11 +3608,13 @@
     <w:basedOn w:val="Normal"/>
     <w:uiPriority w:val="34"/>
     <w:qFormat/>
-    <w:rsid w:val="002026CA"/>
+    <w:rsid w:val="002026ca"/>
     <w:pPr>
+      <w:spacing w:before="0" w:after="160"/>
       <w:ind w:left="720"/>
       <w:contextualSpacing/>
     </w:pPr>
+    <w:rPr/>
   </w:style>
   <w:style w:type="paragraph" w:styleId="IntenseQuote">
     <w:name w:val="Intense Quote"/>
@@ -2899,11 +3623,11 @@
     <w:link w:val="IntenseQuoteChar"/>
     <w:uiPriority w:val="30"/>
     <w:qFormat/>
-    <w:rsid w:val="002026CA"/>
+    <w:rsid w:val="002026ca"/>
     <w:pPr>
       <w:pBdr>
-        <w:top w:val="single" w:sz="4" w:space="10" w:color="0F4761" w:themeColor="accent1" w:themeShade="BF"/>
-        <w:bottom w:val="single" w:sz="4" w:space="10" w:color="0F4761" w:themeColor="accent1" w:themeShade="BF"/>
+        <w:top w:val="single" w:sz="4" w:space="10" w:color="0F4761" w:themeColor="accent1" w:themeShade="bf"/>
+        <w:bottom w:val="single" w:sz="4" w:space="10" w:color="0F4761" w:themeColor="accent1" w:themeShade="bf"/>
       </w:pBdr>
       <w:spacing w:before="360" w:after="360"/>
       <w:ind w:left="864" w:right="864"/>
@@ -2912,7 +3636,7 @@
     <w:rPr>
       <w:i/>
       <w:iCs/>
-      <w:color w:val="0F4761" w:themeColor="accent1" w:themeShade="BF"/>
+      <w:color w:themeColor="accent1" w:themeShade="bf" w:val="0F4761"/>
     </w:rPr>
   </w:style>
   <w:style w:type="paragraph" w:styleId="NoSpacing">
@@ -2920,45 +3644,94 @@
     <w:link w:val="NoSpacingChar"/>
     <w:uiPriority w:val="1"/>
     <w:qFormat/>
-    <w:rsid w:val="00BB4392"/>
+    <w:rsid w:val="00bb4392"/>
+    <w:pPr>
+      <w:widowControl/>
+      <w:suppressAutoHyphens w:val="true"/>
+      <w:bidi w:val="0"/>
+      <w:spacing w:before="0" w:after="0"/>
+      <w:jc w:val="left"/>
+    </w:pPr>
     <w:rPr>
-      <w:rFonts w:ascii="Aptos" w:eastAsiaTheme="minorEastAsia" w:hAnsi="Aptos"/>
+      <w:rFonts w:ascii="Aptos" w:hAnsi="Aptos" w:eastAsia="" w:eastAsiaTheme="minorEastAsia" w:cs=""/>
+      <w:color w:val="auto"/>
       <w:kern w:val="0"/>
       <w:sz w:val="22"/>
       <w:szCs w:val="22"/>
-      <w:lang w:eastAsia="de-DE"/>
+      <w:lang w:eastAsia="de-DE" w:val="de-DE" w:bidi="ar-SA"/>
     </w:rPr>
   </w:style>
-  <w:style w:type="paragraph" w:customStyle="1" w:styleId="Rahmeninhalt">
+  <w:style w:type="paragraph" w:styleId="Rahmeninhaltuser" w:customStyle="1">
+    <w:name w:val="Rahmeninhalt (user)"/>
+    <w:basedOn w:val="Normal"/>
+    <w:qFormat/>
+    <w:pPr/>
+    <w:rPr/>
+  </w:style>
+  <w:style w:type="paragraph" w:styleId="Rahmeninhalt" w:customStyle="1">
     <w:name w:val="Rahmeninhalt"/>
     <w:basedOn w:val="Normal"/>
     <w:qFormat/>
-  </w:style>
-  <w:style w:type="paragraph" w:customStyle="1" w:styleId="Rahmeninhaltuser">
-    <w:name w:val="Rahmeninhalt (user)"/>
+    <w:pPr/>
+    <w:rPr/>
+  </w:style>
+  <w:style w:type="paragraph" w:styleId="Tabelleninhalt">
+    <w:name w:val="Tabelleninhalt"/>
     <w:basedOn w:val="Normal"/>
     <w:qFormat/>
-  </w:style>
-  <w:style w:type="numbering" w:customStyle="1" w:styleId="KeineListeuser">
-    <w:name w:val="Keine Liste (user)"/>
+    <w:pPr>
+      <w:widowControl w:val="false"/>
+      <w:suppressLineNumbers/>
+    </w:pPr>
+    <w:rPr/>
+  </w:style>
+  <w:style w:type="paragraph" w:styleId="Tabellenberschrift">
+    <w:name w:val="Tabellenüberschrift"/>
+    <w:basedOn w:val="Tabelleninhalt"/>
+    <w:qFormat/>
+    <w:pPr>
+      <w:suppressLineNumbers/>
+      <w:jc w:val="center"/>
+    </w:pPr>
+    <w:rPr>
+      <w:b/>
+      <w:bCs/>
+    </w:rPr>
+  </w:style>
+  <w:style w:type="numbering" w:styleId="KeineListe" w:customStyle="1">
+    <w:name w:val="Keine Liste"/>
     <w:uiPriority w:val="99"/>
     <w:semiHidden/>
     <w:unhideWhenUsed/>
     <w:qFormat/>
   </w:style>
+  <w:style w:type="table" w:default="1" w:styleId="TableNormal">
+    <w:name w:val="Normal Table"/>
+    <w:uiPriority w:val="99"/>
+    <w:semiHidden/>
+    <w:unhideWhenUsed/>
+    <w:tblPr>
+      <w:tblCellMar>
+        <w:top w:w="0" w:type="dxa"/>
+        <w:left w:w="108" w:type="dxa"/>
+        <w:bottom w:w="0" w:type="dxa"/>
+        <w:right w:w="108" w:type="dxa"/>
+      </w:tblCellMar>
+    </w:tblPr>
+  </w:style>
   <w:style w:type="table" w:styleId="TableGrid">
     <w:name w:val="Table Grid"/>
     <w:basedOn w:val="TableNormal"/>
     <w:uiPriority w:val="39"/>
-    <w:rsid w:val="001410C4"/>
+    <w:rsid w:val="001410c4"/>
     <w:tblPr>
       <w:tblBorders>
-        <w:top w:val="single" w:sz="4" w:space="0" w:color="auto"/>
-        <w:left w:val="single" w:sz="4" w:space="0" w:color="auto"/>
-        <w:bottom w:val="single" w:sz="4" w:space="0" w:color="auto"/>
-        <w:right w:val="single" w:sz="4" w:space="0" w:color="auto"/>
-        <w:insideH w:val="single" w:sz="4" w:space="0" w:color="auto"/>
-        <w:insideV w:val="single" w:sz="4" w:space="0" w:color="auto"/>
+        <w:top w:val="single" w:color="auto" w:sz="4" w:space="0"/>
+        <w:left w:val="single" w:color="auto" w:sz="4" w:space="0"/>
+        <w:bottom w:val="single" w:color="auto" w:sz="4" w:space="0"/>
+        <w:right w:val="single" w:color="auto" w:sz="4" w:space="0"/>
+        <w:insideH w:val="single" w:color="auto" w:sz="4" w:space="0"/>
+        <w:insideV w:val="single" w:color="auto" w:sz="4" w:space="0"/>
       </w:tblBorders>
     </w:tblPr>
   </w:style>
@@ -3588,54 +4361,54 @@
 </file>
 
 <file path=word/theme/theme1.xml><?xml version="1.0" encoding="utf-8"?>
-<a:theme xmlns:a="http://schemas.openxmlformats.org/drawingml/2006/main" name="Office">
+<a:theme xmlns:a="http://schemas.openxmlformats.org/drawingml/2006/main" xmlns:r="http://schemas.openxmlformats.org/officeDocument/2006/relationships" name="Office">
   <a:themeElements>
     <a:clrScheme name="Office">
       <a:dk1>
         <a:srgbClr val="000000"/>
       </a:dk1>
       <a:lt1>
-        <a:srgbClr val="FFFFFF"/>
+        <a:srgbClr val="ffffff"/>
       </a:lt1>
       <a:dk2>
-        <a:srgbClr val="0E2841"/>
+        <a:srgbClr val="0e2841"/>
       </a:dk2>
       <a:lt2>
-        <a:srgbClr val="E8E8E8"/>
+        <a:srgbClr val="e8e8e8"/>
       </a:lt2>
       <a:accent1>
         <a:srgbClr val="156082"/>
       </a:accent1>
       <a:accent2>
-        <a:srgbClr val="E97132"/>
+        <a:srgbClr val="e97132"/>
       </a:accent2>
       <a:accent3>
-        <a:srgbClr val="196B24"/>
+        <a:srgbClr val="196b24"/>
       </a:accent3>
       <a:accent4>
-        <a:srgbClr val="0F9ED5"/>
+        <a:srgbClr val="0f9ed5"/>
       </a:accent4>
       <a:accent5>
-        <a:srgbClr val="A02B93"/>
+        <a:srgbClr val="a02b93"/>
       </a:accent5>
       <a:accent6>
-        <a:srgbClr val="4EA72E"/>
+        <a:srgbClr val="4ea72e"/>
       </a:accent6>
       <a:hlink>
         <a:srgbClr val="467886"/>
       </a:hlink>
       <a:folHlink>
-        <a:srgbClr val="96607D"/>
+        <a:srgbClr val="96607d"/>
       </a:folHlink>
     </a:clrScheme>
     <a:fontScheme name="Office">
       <a:majorFont>
-        <a:latin typeface="Aptos Display" panose="02110004020202020204"/>
+        <a:latin typeface="Aptos Display" panose="02110004020202020204" pitchFamily="0" charset="1"/>
         <a:ea typeface=""/>
         <a:cs typeface=""/>
       </a:majorFont>
       <a:minorFont>
-        <a:latin typeface="Aptos" panose="02110004020202020204"/>
+        <a:latin typeface="Aptos" panose="02110004020202020204" pitchFamily="0" charset="1"/>
         <a:ea typeface=""/>
         <a:cs typeface=""/>
       </a:minorFont>
@@ -3667,7 +4440,7 @@
             </a:gs>
           </a:gsLst>
           <a:lin ang="5400000" scaled="0"/>
-          <a:tileRect/>
+          <a:tileRect l="0" t="0" r="0" b="0"/>
         </a:gradFill>
         <a:gradFill>
           <a:gsLst>
@@ -3691,7 +4464,7 @@
             </a:gs>
           </a:gsLst>
           <a:lin ang="5400000" scaled="0"/>
-          <a:tileRect/>
+          <a:tileRect l="0" t="0" r="0" b="0"/>
         </a:gradFill>
       </a:fillStyleLst>
       <a:lnStyleLst>
@@ -3751,12 +4524,10 @@
             </a:gs>
           </a:gsLst>
           <a:lin ang="5400000" scaled="0"/>
-          <a:tileRect/>
+          <a:tileRect l="0" t="0" r="0" b="0"/>
         </a:gradFill>
       </a:bgFillStyleLst>
     </a:fmtScheme>
   </a:themeElements>
-  <a:objectDefaults/>
-  <a:extraClrSchemeLst/>
 </a:theme>
 </file>
</xml_diff>

<commit_message>
johnny explodiert wenn der spieler verliert
</commit_message>
<xml_diff>
--- a/wild-jam-april-2026/__ORGA/Changelog.docx
+++ b/wild-jam-april-2026/__ORGA/Changelog.docx
@@ -375,7 +375,7 @@
             </w:pPr>
             <w:r>
               <w:rPr>
-                <w:rFonts w:eastAsia="Aptos" w:cs="" w:ascii="Aptos" w:hAnsi="Aptos"/>
+                <w:rFonts w:eastAsia="Aptos" w:cs=""/>
                 <w:kern w:val="2"/>
                 <w:sz w:val="24"/>
                 <w:szCs w:val="24"/>
@@ -403,7 +403,7 @@
             </w:pPr>
             <w:r>
               <w:rPr>
-                <w:rFonts w:eastAsia="Aptos" w:cs="" w:ascii="Aptos" w:hAnsi="Aptos"/>
+                <w:rFonts w:eastAsia="Aptos" w:cs=""/>
                 <w:kern w:val="2"/>
                 <w:sz w:val="24"/>
                 <w:szCs w:val="24"/>
@@ -431,7 +431,7 @@
             </w:pPr>
             <w:r>
               <w:rPr>
-                <w:rFonts w:eastAsia="Aptos" w:cs="" w:ascii="Aptos" w:hAnsi="Aptos"/>
+                <w:rFonts w:eastAsia="Aptos" w:cs=""/>
                 <w:kern w:val="2"/>
                 <w:sz w:val="24"/>
                 <w:szCs w:val="24"/>
@@ -459,7 +459,7 @@
             </w:pPr>
             <w:r>
               <w:rPr>
-                <w:rFonts w:eastAsia="Aptos" w:cs="" w:ascii="Aptos" w:hAnsi="Aptos"/>
+                <w:rFonts w:eastAsia="Aptos" w:cs=""/>
                 <w:kern w:val="2"/>
                 <w:sz w:val="24"/>
                 <w:szCs w:val="24"/>
@@ -490,7 +490,7 @@
             </w:pPr>
             <w:r>
               <w:rPr>
-                <w:rFonts w:eastAsia="Aptos" w:cs="" w:ascii="Aptos" w:hAnsi="Aptos"/>
+                <w:rFonts w:eastAsia="Aptos" w:cs=""/>
                 <w:kern w:val="2"/>
                 <w:sz w:val="24"/>
                 <w:szCs w:val="24"/>
@@ -518,7 +518,7 @@
             </w:pPr>
             <w:r>
               <w:rPr>
-                <w:rFonts w:eastAsia="Aptos" w:cs="" w:ascii="Aptos" w:hAnsi="Aptos"/>
+                <w:rFonts w:eastAsia="Aptos" w:cs=""/>
                 <w:kern w:val="2"/>
                 <w:sz w:val="24"/>
                 <w:szCs w:val="24"/>
@@ -546,7 +546,7 @@
             </w:pPr>
             <w:r>
               <w:rPr>
-                <w:rFonts w:eastAsia="Aptos" w:cs="" w:ascii="Aptos" w:hAnsi="Aptos"/>
+                <w:rFonts w:eastAsia="Aptos" w:cs=""/>
                 <w:kern w:val="2"/>
                 <w:sz w:val="24"/>
                 <w:szCs w:val="24"/>
@@ -574,7 +574,7 @@
             </w:pPr>
             <w:r>
               <w:rPr>
-                <w:rFonts w:eastAsia="Aptos" w:cs="" w:ascii="Aptos" w:hAnsi="Aptos"/>
+                <w:rFonts w:eastAsia="Aptos" w:cs=""/>
                 <w:kern w:val="2"/>
                 <w:sz w:val="24"/>
                 <w:szCs w:val="24"/>
@@ -605,7 +605,7 @@
             </w:pPr>
             <w:r>
               <w:rPr>
-                <w:rFonts w:eastAsia="Aptos" w:cs="" w:ascii="Aptos" w:hAnsi="Aptos"/>
+                <w:rFonts w:eastAsia="Aptos" w:cs=""/>
                 <w:kern w:val="2"/>
                 <w:sz w:val="24"/>
                 <w:szCs w:val="24"/>
@@ -633,7 +633,7 @@
             </w:pPr>
             <w:r>
               <w:rPr>
-                <w:rFonts w:eastAsia="Aptos" w:cs="" w:ascii="Aptos" w:hAnsi="Aptos"/>
+                <w:rFonts w:eastAsia="Aptos" w:cs=""/>
                 <w:kern w:val="2"/>
                 <w:sz w:val="24"/>
                 <w:szCs w:val="24"/>
@@ -661,7 +661,7 @@
             </w:pPr>
             <w:r>
               <w:rPr>
-                <w:rFonts w:eastAsia="Aptos" w:cs="" w:ascii="Aptos" w:hAnsi="Aptos"/>
+                <w:rFonts w:eastAsia="Aptos" w:cs=""/>
                 <w:kern w:val="2"/>
                 <w:sz w:val="24"/>
                 <w:szCs w:val="24"/>
@@ -689,7 +689,7 @@
             </w:pPr>
             <w:r>
               <w:rPr>
-                <w:rFonts w:eastAsia="Aptos" w:cs="" w:ascii="Aptos" w:hAnsi="Aptos"/>
+                <w:rFonts w:eastAsia="Aptos" w:cs=""/>
                 <w:kern w:val="2"/>
                 <w:sz w:val="24"/>
                 <w:szCs w:val="24"/>
@@ -720,7 +720,7 @@
             </w:pPr>
             <w:r>
               <w:rPr>
-                <w:rFonts w:eastAsia="Aptos" w:cs="" w:ascii="Aptos" w:hAnsi="Aptos"/>
+                <w:rFonts w:eastAsia="Aptos" w:cs=""/>
                 <w:kern w:val="2"/>
                 <w:sz w:val="24"/>
                 <w:szCs w:val="24"/>
@@ -748,7 +748,7 @@
             </w:pPr>
             <w:r>
               <w:rPr>
-                <w:rFonts w:eastAsia="Aptos" w:cs="" w:ascii="Aptos" w:hAnsi="Aptos"/>
+                <w:rFonts w:eastAsia="Aptos" w:cs=""/>
                 <w:kern w:val="2"/>
                 <w:sz w:val="24"/>
                 <w:szCs w:val="24"/>
@@ -776,7 +776,7 @@
             </w:pPr>
             <w:r>
               <w:rPr>
-                <w:rFonts w:eastAsia="Aptos" w:cs="" w:ascii="Aptos" w:hAnsi="Aptos"/>
+                <w:rFonts w:eastAsia="Aptos" w:cs=""/>
                 <w:kern w:val="2"/>
                 <w:sz w:val="24"/>
                 <w:szCs w:val="24"/>
@@ -804,7 +804,7 @@
             </w:pPr>
             <w:r>
               <w:rPr>
-                <w:rFonts w:eastAsia="Aptos" w:cs="" w:ascii="Aptos" w:hAnsi="Aptos"/>
+                <w:rFonts w:eastAsia="Aptos" w:cs=""/>
                 <w:kern w:val="2"/>
                 <w:sz w:val="24"/>
                 <w:szCs w:val="24"/>
@@ -2922,11 +2922,8 @@
             </w:pPr>
             <w:r>
               <w:rPr>
-                <w:rFonts w:eastAsia="Aptos" w:cs=""/>
-                <w:kern w:val="2"/>
-                <w:sz w:val="24"/>
-                <w:szCs w:val="24"/>
-                <w:lang w:val="de-DE" w:eastAsia="en-US" w:bidi="ar-SA"/>
+                <w:rFonts w:eastAsia="Aptos"/>
+                <w:sz w:val="24"/>
               </w:rPr>
             </w:r>
           </w:p>
@@ -3095,12 +3092,10 @@
             </w:pPr>
             <w:r>
               <w:rPr>
-                <w:rFonts w:eastAsia="Aptos" w:cs=""/>
-                <w:kern w:val="2"/>
-                <w:sz w:val="24"/>
-                <w:szCs w:val="24"/>
-                <w:lang w:val="de-DE" w:eastAsia="en-US" w:bidi="ar-SA"/>
-              </w:rPr>
+                <w:rFonts w:eastAsia="Aptos"/>
+                <w:sz w:val="24"/>
+              </w:rPr>
+              <w:t>11.05.2026</w:t>
             </w:r>
           </w:p>
         </w:tc>
@@ -3122,12 +3117,10 @@
             </w:pPr>
             <w:r>
               <w:rPr>
-                <w:rFonts w:eastAsia="Aptos" w:cs=""/>
-                <w:kern w:val="2"/>
-                <w:sz w:val="24"/>
-                <w:szCs w:val="24"/>
-                <w:lang w:val="de-DE" w:eastAsia="en-US" w:bidi="ar-SA"/>
-              </w:rPr>
+                <w:rFonts w:eastAsia="Aptos"/>
+                <w:sz w:val="24"/>
+              </w:rPr>
+              <w:t>Johnny explodiert wenn der spieler verliert</w:t>
             </w:r>
           </w:p>
         </w:tc>
@@ -3149,12 +3142,10 @@
             </w:pPr>
             <w:r>
               <w:rPr>
-                <w:rFonts w:eastAsia="Aptos" w:cs=""/>
-                <w:kern w:val="2"/>
-                <w:sz w:val="24"/>
-                <w:szCs w:val="24"/>
-                <w:lang w:val="de-DE" w:eastAsia="en-US" w:bidi="ar-SA"/>
-              </w:rPr>
+                <w:rFonts w:eastAsia="Aptos"/>
+                <w:sz w:val="24"/>
+              </w:rPr>
+              <w:t>Das Verlieren wirkte zu effektlos</w:t>
             </w:r>
           </w:p>
         </w:tc>
@@ -3176,11 +3167,8 @@
             </w:pPr>
             <w:r>
               <w:rPr>
-                <w:rFonts w:eastAsia="Aptos" w:cs=""/>
-                <w:kern w:val="2"/>
-                <w:sz w:val="24"/>
-                <w:szCs w:val="24"/>
-                <w:lang w:val="de-DE" w:eastAsia="en-US" w:bidi="ar-SA"/>
+                <w:rFonts w:eastAsia="Aptos"/>
+                <w:sz w:val="24"/>
               </w:rPr>
             </w:r>
           </w:p>
@@ -3206,11 +3194,8 @@
             </w:pPr>
             <w:r>
               <w:rPr>
-                <w:rFonts w:eastAsia="Aptos" w:cs=""/>
-                <w:kern w:val="2"/>
-                <w:sz w:val="24"/>
-                <w:szCs w:val="24"/>
-                <w:lang w:val="de-DE" w:eastAsia="en-US" w:bidi="ar-SA"/>
+                <w:rFonts w:eastAsia="Aptos"/>
+                <w:sz w:val="24"/>
               </w:rPr>
             </w:r>
           </w:p>
@@ -3233,11 +3218,8 @@
             </w:pPr>
             <w:r>
               <w:rPr>
-                <w:rFonts w:eastAsia="Aptos" w:cs=""/>
-                <w:kern w:val="2"/>
-                <w:sz w:val="24"/>
-                <w:szCs w:val="24"/>
-                <w:lang w:val="de-DE" w:eastAsia="en-US" w:bidi="ar-SA"/>
+                <w:rFonts w:eastAsia="Aptos"/>
+                <w:sz w:val="24"/>
               </w:rPr>
             </w:r>
           </w:p>
@@ -3260,11 +3242,8 @@
             </w:pPr>
             <w:r>
               <w:rPr>
-                <w:rFonts w:eastAsia="Aptos" w:cs=""/>
-                <w:kern w:val="2"/>
-                <w:sz w:val="24"/>
-                <w:szCs w:val="24"/>
-                <w:lang w:val="de-DE" w:eastAsia="en-US" w:bidi="ar-SA"/>
+                <w:rFonts w:eastAsia="Aptos"/>
+                <w:sz w:val="24"/>
               </w:rPr>
             </w:r>
           </w:p>
@@ -3287,11 +3266,8 @@
             </w:pPr>
             <w:r>
               <w:rPr>
-                <w:rFonts w:eastAsia="Aptos" w:cs=""/>
-                <w:kern w:val="2"/>
-                <w:sz w:val="24"/>
-                <w:szCs w:val="24"/>
-                <w:lang w:val="de-DE" w:eastAsia="en-US" w:bidi="ar-SA"/>
+                <w:rFonts w:eastAsia="Aptos"/>
+                <w:sz w:val="24"/>
               </w:rPr>
             </w:r>
           </w:p>
@@ -3317,11 +3293,8 @@
             </w:pPr>
             <w:r>
               <w:rPr>
-                <w:rFonts w:eastAsia="Aptos" w:cs=""/>
-                <w:kern w:val="2"/>
-                <w:sz w:val="24"/>
-                <w:szCs w:val="24"/>
-                <w:lang w:val="de-DE" w:eastAsia="en-US" w:bidi="ar-SA"/>
+                <w:rFonts w:eastAsia="Aptos"/>
+                <w:sz w:val="24"/>
               </w:rPr>
             </w:r>
           </w:p>
@@ -3344,11 +3317,8 @@
             </w:pPr>
             <w:r>
               <w:rPr>
-                <w:rFonts w:eastAsia="Aptos" w:cs=""/>
-                <w:kern w:val="2"/>
-                <w:sz w:val="24"/>
-                <w:szCs w:val="24"/>
-                <w:lang w:val="de-DE" w:eastAsia="en-US" w:bidi="ar-SA"/>
+                <w:rFonts w:eastAsia="Aptos"/>
+                <w:sz w:val="24"/>
               </w:rPr>
             </w:r>
           </w:p>
@@ -3371,11 +3341,8 @@
             </w:pPr>
             <w:r>
               <w:rPr>
-                <w:rFonts w:eastAsia="Aptos" w:cs=""/>
-                <w:kern w:val="2"/>
-                <w:sz w:val="24"/>
-                <w:szCs w:val="24"/>
-                <w:lang w:val="de-DE" w:eastAsia="en-US" w:bidi="ar-SA"/>
+                <w:rFonts w:eastAsia="Aptos"/>
+                <w:sz w:val="24"/>
               </w:rPr>
             </w:r>
           </w:p>
@@ -3398,11 +3365,8 @@
             </w:pPr>
             <w:r>
               <w:rPr>
-                <w:rFonts w:eastAsia="Aptos" w:cs=""/>
-                <w:kern w:val="2"/>
-                <w:sz w:val="24"/>
-                <w:szCs w:val="24"/>
-                <w:lang w:val="de-DE" w:eastAsia="en-US" w:bidi="ar-SA"/>
+                <w:rFonts w:eastAsia="Aptos"/>
+                <w:sz w:val="24"/>
               </w:rPr>
             </w:r>
           </w:p>
@@ -3428,11 +3392,8 @@
             </w:pPr>
             <w:r>
               <w:rPr>
-                <w:rFonts w:eastAsia="Aptos" w:cs=""/>
-                <w:kern w:val="2"/>
-                <w:sz w:val="24"/>
-                <w:szCs w:val="24"/>
-                <w:lang w:val="de-DE" w:eastAsia="en-US" w:bidi="ar-SA"/>
+                <w:rFonts w:eastAsia="Aptos"/>
+                <w:sz w:val="24"/>
               </w:rPr>
             </w:r>
           </w:p>
@@ -3455,11 +3416,8 @@
             </w:pPr>
             <w:r>
               <w:rPr>
-                <w:rFonts w:eastAsia="Aptos" w:cs=""/>
-                <w:kern w:val="2"/>
-                <w:sz w:val="24"/>
-                <w:szCs w:val="24"/>
-                <w:lang w:val="de-DE" w:eastAsia="en-US" w:bidi="ar-SA"/>
+                <w:rFonts w:eastAsia="Aptos"/>
+                <w:sz w:val="24"/>
               </w:rPr>
             </w:r>
           </w:p>
@@ -3482,11 +3440,8 @@
             </w:pPr>
             <w:r>
               <w:rPr>
-                <w:rFonts w:eastAsia="Aptos" w:cs=""/>
-                <w:kern w:val="2"/>
-                <w:sz w:val="24"/>
-                <w:szCs w:val="24"/>
-                <w:lang w:val="de-DE" w:eastAsia="en-US" w:bidi="ar-SA"/>
+                <w:rFonts w:eastAsia="Aptos"/>
+                <w:sz w:val="24"/>
               </w:rPr>
             </w:r>
           </w:p>
@@ -3509,11 +3464,8 @@
             </w:pPr>
             <w:r>
               <w:rPr>
-                <w:rFonts w:eastAsia="Aptos" w:cs=""/>
-                <w:kern w:val="2"/>
-                <w:sz w:val="24"/>
-                <w:szCs w:val="24"/>
-                <w:lang w:val="de-DE" w:eastAsia="en-US" w:bidi="ar-SA"/>
+                <w:rFonts w:eastAsia="Aptos"/>
+                <w:sz w:val="24"/>
               </w:rPr>
             </w:r>
           </w:p>
@@ -3539,11 +3491,8 @@
             </w:pPr>
             <w:r>
               <w:rPr>
-                <w:rFonts w:eastAsia="Aptos" w:cs=""/>
-                <w:kern w:val="2"/>
-                <w:sz w:val="24"/>
-                <w:szCs w:val="24"/>
-                <w:lang w:val="de-DE" w:eastAsia="en-US" w:bidi="ar-SA"/>
+                <w:rFonts w:eastAsia="Aptos"/>
+                <w:sz w:val="24"/>
               </w:rPr>
             </w:r>
           </w:p>
@@ -3566,11 +3515,8 @@
             </w:pPr>
             <w:r>
               <w:rPr>
-                <w:rFonts w:eastAsia="Aptos" w:cs=""/>
-                <w:kern w:val="2"/>
-                <w:sz w:val="24"/>
-                <w:szCs w:val="24"/>
-                <w:lang w:val="de-DE" w:eastAsia="en-US" w:bidi="ar-SA"/>
+                <w:rFonts w:eastAsia="Aptos"/>
+                <w:sz w:val="24"/>
               </w:rPr>
             </w:r>
           </w:p>
@@ -3593,11 +3539,8 @@
             </w:pPr>
             <w:r>
               <w:rPr>
-                <w:rFonts w:eastAsia="Aptos" w:cs=""/>
-                <w:kern w:val="2"/>
-                <w:sz w:val="24"/>
-                <w:szCs w:val="24"/>
-                <w:lang w:val="de-DE" w:eastAsia="en-US" w:bidi="ar-SA"/>
+                <w:rFonts w:eastAsia="Aptos"/>
+                <w:sz w:val="24"/>
               </w:rPr>
             </w:r>
           </w:p>
@@ -3620,11 +3563,8 @@
             </w:pPr>
             <w:r>
               <w:rPr>
-                <w:rFonts w:eastAsia="Aptos" w:cs=""/>
-                <w:kern w:val="2"/>
-                <w:sz w:val="24"/>
-                <w:szCs w:val="24"/>
-                <w:lang w:val="de-DE" w:eastAsia="en-US" w:bidi="ar-SA"/>
+                <w:rFonts w:eastAsia="Aptos"/>
+                <w:sz w:val="24"/>
               </w:rPr>
             </w:r>
           </w:p>
@@ -4682,13 +4622,20 @@
       <w:jc w:val="left"/>
     </w:pPr>
     <w:rPr>
-      <w:rFonts w:ascii="Aptos" w:hAnsi="Aptos" w:eastAsia="" w:eastAsiaTheme="minorEastAsia" w:cs=""/>
+      <w:rFonts w:ascii="Aptos" w:hAnsi="Aptos" w:eastAsia="" w:cs="" w:eastAsiaTheme="minorEastAsia"/>
       <w:color w:val="auto"/>
       <w:kern w:val="0"/>
       <w:sz w:val="22"/>
       <w:szCs w:val="22"/>
-      <w:lang w:eastAsia="de-DE" w:val="de-DE" w:bidi="ar-SA"/>
+      <w:lang w:val="de-DE" w:eastAsia="de-DE" w:bidi="ar-SA"/>
     </w:rPr>
+  </w:style>
+  <w:style w:type="paragraph" w:styleId="Rahmeninhalt" w:customStyle="1">
+    <w:name w:val="Rahmeninhalt"/>
+    <w:basedOn w:val="Normal"/>
+    <w:qFormat/>
+    <w:pPr/>
+    <w:rPr/>
   </w:style>
   <w:style w:type="paragraph" w:styleId="Rahmeninhaltuser" w:customStyle="1">
     <w:name w:val="Rahmeninhalt (user)"/>
@@ -4697,15 +4644,8 @@
     <w:pPr/>
     <w:rPr/>
   </w:style>
-  <w:style w:type="paragraph" w:styleId="Rahmeninhalt" w:customStyle="1">
-    <w:name w:val="Rahmeninhalt"/>
-    <w:basedOn w:val="Normal"/>
-    <w:qFormat/>
-    <w:pPr/>
-    <w:rPr/>
-  </w:style>
-  <w:style w:type="numbering" w:styleId="KeineListe" w:customStyle="1">
-    <w:name w:val="Keine Liste"/>
+  <w:style w:type="numbering" w:styleId="KeineListeuser" w:customStyle="1">
+    <w:name w:val="Keine Liste (user)"/>
     <w:uiPriority w:val="99"/>
     <w:semiHidden/>
     <w:unhideWhenUsed/>

</xml_diff>